<commit_message>
Edits to subcategories json, to Indicazioni alimentari (prodotti origine vegetale), some corrections on gene naming on AI report for cardiovascular diseases.
</commit_message>
<xml_diff>
--- a/static/Indicazioni_alimentari.docx
+++ b/static/Indicazioni_alimentari.docx
@@ -2070,7 +2070,7 @@
                 <w:sz w:val="16"/>
                 <w:szCs w:val="16"/>
               </w:rPr>
-              <w:t xml:space="preserve">settimana </w:t>
+              <w:t>settimana</w:t>
             </w:r>
           </w:p>
           <w:p>
@@ -2091,7 +2091,7 @@
                 <w:sz w:val="16"/>
                 <w:szCs w:val="16"/>
               </w:rPr>
-              <w:t xml:space="preserve">T: max 2 volte a settimana </w:t>
+              <w:t>T: max 2 volte a settimana</w:t>
             </w:r>
           </w:p>
           <w:p>
@@ -2386,16 +2386,6 @@
               </w:rPr>
               <w:t>C: max 3 volte a settimana</w:t>
             </w:r>
-            <w:r>
-              <w:rPr>
-                <w:rFonts w:ascii="Cambria" w:hAnsi="Cambria"/>
-                <w:i/>
-                <w:spacing w:val="40"/>
-                <w:sz w:val="16"/>
-                <w:szCs w:val="16"/>
-              </w:rPr>
-              <w:t xml:space="preserve"> </w:t>
-            </w:r>
           </w:p>
           <w:p>
             <w:pPr>
@@ -2416,16 +2406,6 @@
                 <w:szCs w:val="16"/>
               </w:rPr>
               <w:t>T: max 2 volte a settimana</w:t>
-            </w:r>
-            <w:r>
-              <w:rPr>
-                <w:rFonts w:ascii="Cambria" w:hAnsi="Cambria"/>
-                <w:i/>
-                <w:spacing w:val="40"/>
-                <w:sz w:val="16"/>
-                <w:szCs w:val="16"/>
-              </w:rPr>
-              <w:t xml:space="preserve"> </w:t>
             </w:r>
           </w:p>
           <w:p>
@@ -2803,9 +2783,10 @@
             <w:pPr>
               <w:pStyle w:val="TableParagraph"/>
               <w:widowControl w:val="false"/>
-              <w:spacing w:before="1" w:after="0"/>
-              <w:ind w:hanging="0" w:left="136" w:right="533"/>
-              <w:rPr>
+              <w:ind w:hanging="0" w:left="136" w:right="0"/>
+              <w:rPr>
+                <w:b w:val="false"/>
+                <w:bCs w:val="false"/>
                 <w:sz w:val="16"/>
                 <w:szCs w:val="16"/>
               </w:rPr>
@@ -2813,21 +2794,65 @@
             <w:r>
               <w:rPr>
                 <w:rFonts w:ascii="Cambria" w:hAnsi="Cambria"/>
-                <w:i/>
-                <w:sz w:val="16"/>
-                <w:szCs w:val="16"/>
-              </w:rPr>
-              <w:t>C: max 3 volte a settimana</w:t>
-            </w:r>
-            <w:r>
-              <w:rPr>
-                <w:rFonts w:ascii="Cambria" w:hAnsi="Cambria"/>
-                <w:i/>
-                <w:spacing w:val="40"/>
-                <w:sz w:val="16"/>
-                <w:szCs w:val="16"/>
-              </w:rPr>
-              <w:t xml:space="preserve"> </w:t>
+                <w:b w:val="false"/>
+                <w:bCs w:val="false"/>
+                <w:i/>
+                <w:spacing w:val="-2"/>
+                <w:sz w:val="16"/>
+                <w:szCs w:val="16"/>
+              </w:rPr>
+              <w:t>Bevande vegetali e yogurt:</w:t>
+            </w:r>
+          </w:p>
+          <w:p>
+            <w:pPr>
+              <w:pStyle w:val="TableParagraph"/>
+              <w:widowControl w:val="false"/>
+              <w:ind w:hanging="0" w:left="136" w:right="0"/>
+              <w:rPr>
+                <w:b w:val="false"/>
+                <w:bCs w:val="false"/>
+                <w:sz w:val="16"/>
+                <w:szCs w:val="16"/>
+              </w:rPr>
+            </w:pPr>
+            <w:r>
+              <w:rPr>
+                <w:rFonts w:ascii="Cambria" w:hAnsi="Cambria"/>
+                <w:b w:val="false"/>
+                <w:bCs w:val="false"/>
+                <w:i/>
+                <w:spacing w:val="-2"/>
+                <w:sz w:val="16"/>
+                <w:szCs w:val="16"/>
+              </w:rPr>
+              <w:t>possibile consumarli anche tutti i</w:t>
+            </w:r>
+          </w:p>
+          <w:p>
+            <w:pPr>
+              <w:pStyle w:val="TableParagraph"/>
+              <w:widowControl w:val="false"/>
+              <w:ind w:hanging="0" w:left="136" w:right="0"/>
+              <w:rPr>
+                <w:b w:val="false"/>
+                <w:bCs w:val="false"/>
+                <w:sz w:val="16"/>
+                <w:szCs w:val="16"/>
+              </w:rPr>
+            </w:pPr>
+            <w:r>
+              <w:rPr>
+                <w:rFonts w:ascii="Cambria" w:hAnsi="Cambria"/>
+                <w:b w:val="false"/>
+                <w:bCs w:val="false"/>
+                <w:i/>
+                <w:spacing w:val="-2"/>
+                <w:sz w:val="16"/>
+                <w:szCs w:val="16"/>
+              </w:rPr>
+              <w:t>giorni, 1 volta al giorno</w:t>
+              <w:br/>
             </w:r>
           </w:p>
           <w:p>
@@ -2848,17 +2873,28 @@
                 <w:sz w:val="16"/>
                 <w:szCs w:val="16"/>
               </w:rPr>
+              <w:t>C: max 3 volte a settimana</w:t>
+            </w:r>
+          </w:p>
+          <w:p>
+            <w:pPr>
+              <w:pStyle w:val="TableParagraph"/>
+              <w:widowControl w:val="false"/>
+              <w:spacing w:before="1" w:after="0"/>
+              <w:ind w:hanging="0" w:left="136" w:right="533"/>
+              <w:rPr>
+                <w:sz w:val="16"/>
+                <w:szCs w:val="16"/>
+              </w:rPr>
+            </w:pPr>
+            <w:r>
+              <w:rPr>
+                <w:rFonts w:ascii="Cambria" w:hAnsi="Cambria"/>
+                <w:i/>
+                <w:sz w:val="16"/>
+                <w:szCs w:val="16"/>
+              </w:rPr>
               <w:t>T: max 2 volte a settimana</w:t>
-            </w:r>
-            <w:r>
-              <w:rPr>
-                <w:rFonts w:ascii="Cambria" w:hAnsi="Cambria"/>
-                <w:i/>
-                <w:spacing w:val="40"/>
-                <w:sz w:val="16"/>
-                <w:szCs w:val="16"/>
-              </w:rPr>
-              <w:t xml:space="preserve"> </w:t>
             </w:r>
           </w:p>
           <w:p>
@@ -4911,7 +4947,7 @@
                 <w:sz w:val="16"/>
                 <w:szCs w:val="16"/>
               </w:rPr>
-              <w:t xml:space="preserve">settimana </w:t>
+              <w:t>settimana</w:t>
             </w:r>
           </w:p>
           <w:p>
@@ -5068,8 +5104,9 @@
             </w:pPr>
             <w:r>
               <w:rPr>
-                <w:sz w:val="16"/>
-                <w:szCs w:val="16"/>
+                <w:rFonts w:ascii="Cambria" w:hAnsi="Cambria"/>
+                <w:i/>
+                <w:spacing w:val="-2"/>
               </w:rPr>
             </w:r>
           </w:p>
@@ -5644,7 +5681,7 @@
                 <w:sz w:val="16"/>
                 <w:szCs w:val="16"/>
               </w:rPr>
-              <w:t xml:space="preserve">settimana </w:t>
+              <w:t>settimana</w:t>
             </w:r>
           </w:p>
           <w:p>
@@ -5760,7 +5797,7 @@
                 <w:sz w:val="16"/>
                 <w:szCs w:val="16"/>
               </w:rPr>
-              <w:t xml:space="preserve">settimana </w:t>
+              <w:t>settimana</w:t>
             </w:r>
           </w:p>
           <w:p>
@@ -6219,7 +6256,7 @@
                 <w:sz w:val="16"/>
                 <w:szCs w:val="16"/>
               </w:rPr>
-              <w:t xml:space="preserve">settimana </w:t>
+              <w:t>settimana</w:t>
             </w:r>
           </w:p>
           <w:p>
@@ -6376,8 +6413,9 @@
             </w:pPr>
             <w:r>
               <w:rPr>
-                <w:sz w:val="16"/>
-                <w:szCs w:val="16"/>
+                <w:rFonts w:ascii="Cambria" w:hAnsi="Cambria"/>
+                <w:i/>
+                <w:spacing w:val="-2"/>
               </w:rPr>
             </w:r>
           </w:p>
@@ -6802,7 +6840,7 @@
                 <w:sz w:val="16"/>
                 <w:szCs w:val="16"/>
               </w:rPr>
-              <w:t xml:space="preserve">settimana </w:t>
+              <w:t>settimana</w:t>
             </w:r>
           </w:p>
           <w:p>
@@ -7545,7 +7583,11 @@
               </w:rPr>
             </w:pPr>
             <w:r>
-              <w:rPr/>
+              <w:rPr>
+                <w:rFonts w:ascii="Cambria" w:hAnsi="Cambria"/>
+                <w:i/>
+                <w:sz w:val="20"/>
+              </w:rPr>
             </w:r>
           </w:p>
         </w:tc>
@@ -8735,16 +8777,16 @@
                       <wps:cNvSpPr/>
                       <wps:spPr>
                         <a:xfrm>
-                          <a:off x="6089760" y="5760"/>
-                          <a:ext cx="669240" cy="262080"/>
+                          <a:off x="6090120" y="5760"/>
+                          <a:ext cx="668520" cy="262080"/>
                         </a:xfrm>
                         <a:custGeom>
                           <a:avLst/>
                           <a:gdLst>
-                            <a:gd name="textAreaLeft" fmla="*/ 0 w 379440"/>
-                            <a:gd name="textAreaRight" fmla="*/ 380160 w 379440"/>
+                            <a:gd name="textAreaLeft" fmla="*/ 0 w 379080"/>
+                            <a:gd name="textAreaRight" fmla="*/ 380160 w 379080"/>
                             <a:gd name="textAreaTop" fmla="*/ 0 h 148680"/>
-                            <a:gd name="textAreaBottom" fmla="*/ 149400 h 148680"/>
+                            <a:gd name="textAreaBottom" fmla="*/ 149760 h 148680"/>
                           </a:gdLst>
                           <a:ahLst/>
                           <a:rect l="textAreaLeft" t="textAreaTop" r="textAreaRight" b="textAreaBottom"/>
@@ -8796,9 +8838,9 @@
                           <a:avLst/>
                           <a:gdLst>
                             <a:gd name="textAreaLeft" fmla="*/ 0 w 3448080"/>
-                            <a:gd name="textAreaRight" fmla="*/ 3448800 w 3448080"/>
+                            <a:gd name="textAreaRight" fmla="*/ 3449160 w 3448080"/>
                             <a:gd name="textAreaTop" fmla="*/ 0 h 360"/>
-                            <a:gd name="textAreaBottom" fmla="*/ 1440 h 360"/>
+                            <a:gd name="textAreaBottom" fmla="*/ 2880 h 360"/>
                           </a:gdLst>
                           <a:ahLst/>
                           <a:rect l="textAreaLeft" t="textAreaTop" r="textAreaRight" b="textAreaBottom"/>
@@ -8843,16 +8885,16 @@
                       <wps:cNvSpPr/>
                       <wps:spPr>
                         <a:xfrm>
-                          <a:off x="6089760" y="5760"/>
-                          <a:ext cx="720" cy="38160"/>
+                          <a:off x="6090120" y="5760"/>
+                          <a:ext cx="720" cy="37440"/>
                         </a:xfrm>
                         <a:custGeom>
                           <a:avLst/>
                           <a:gdLst>
                             <a:gd name="textAreaLeft" fmla="*/ 0 w 360"/>
-                            <a:gd name="textAreaRight" fmla="*/ 1440 w 360"/>
-                            <a:gd name="textAreaTop" fmla="*/ 0 h 21600"/>
-                            <a:gd name="textAreaBottom" fmla="*/ 22320 h 21600"/>
+                            <a:gd name="textAreaRight" fmla="*/ 2880 w 360"/>
+                            <a:gd name="textAreaTop" fmla="*/ 0 h 21240"/>
+                            <a:gd name="textAreaBottom" fmla="*/ 22320 h 21240"/>
                           </a:gdLst>
                           <a:ahLst/>
                           <a:rect l="textAreaLeft" t="textAreaTop" r="textAreaRight" b="textAreaBottom"/>
@@ -8897,16 +8939,16 @@
                       <wps:cNvSpPr/>
                       <wps:spPr>
                         <a:xfrm>
-                          <a:off x="6089760" y="0"/>
-                          <a:ext cx="668160" cy="720"/>
+                          <a:off x="6090120" y="0"/>
+                          <a:ext cx="667440" cy="720"/>
                         </a:xfrm>
                         <a:custGeom>
                           <a:avLst/>
                           <a:gdLst>
-                            <a:gd name="textAreaLeft" fmla="*/ 0 w 378720"/>
-                            <a:gd name="textAreaRight" fmla="*/ 379440 w 378720"/>
+                            <a:gd name="textAreaLeft" fmla="*/ 0 w 378360"/>
+                            <a:gd name="textAreaRight" fmla="*/ 379440 w 378360"/>
                             <a:gd name="textAreaTop" fmla="*/ 0 h 360"/>
-                            <a:gd name="textAreaBottom" fmla="*/ 1440 h 360"/>
+                            <a:gd name="textAreaBottom" fmla="*/ 2880 h 360"/>
                           </a:gdLst>
                           <a:ahLst/>
                           <a:rect l="textAreaLeft" t="textAreaTop" r="textAreaRight" b="textAreaBottom"/>
@@ -8951,16 +8993,16 @@
                       <wps:cNvSpPr/>
                       <wps:spPr>
                         <a:xfrm>
-                          <a:off x="6089760" y="230040"/>
-                          <a:ext cx="668160" cy="38160"/>
+                          <a:off x="6090120" y="230400"/>
+                          <a:ext cx="667440" cy="37440"/>
                         </a:xfrm>
                         <a:custGeom>
                           <a:avLst/>
                           <a:gdLst>
-                            <a:gd name="textAreaLeft" fmla="*/ 0 w 378720"/>
-                            <a:gd name="textAreaRight" fmla="*/ 379440 w 378720"/>
-                            <a:gd name="textAreaTop" fmla="*/ 0 h 21600"/>
-                            <a:gd name="textAreaBottom" fmla="*/ 22320 h 21600"/>
+                            <a:gd name="textAreaLeft" fmla="*/ 0 w 378360"/>
+                            <a:gd name="textAreaRight" fmla="*/ 379440 w 378360"/>
+                            <a:gd name="textAreaTop" fmla="*/ 0 h 21240"/>
+                            <a:gd name="textAreaBottom" fmla="*/ 22320 h 21240"/>
                           </a:gdLst>
                           <a:ahLst/>
                           <a:rect l="textAreaLeft" t="textAreaTop" r="textAreaRight" b="textAreaBottom"/>
@@ -9008,7 +9050,7 @@
         </mc:Choice>
         <mc:Fallback>
           <w:pict>
-            <v:group id="shape_0" alt="Group 1" style="position:absolute;margin-left:31.2pt;margin-top:800.75pt;width:532.25pt;height:21.1pt" coordorigin="624,16015" coordsize="10645,422"/>
+            <v:group id="shape_0" alt="Group 1" style="position:absolute;margin-left:31.2pt;margin-top:800.75pt;width:532.2pt;height:21.1pt" coordorigin="624,16015" coordsize="10644,422"/>
           </w:pict>
         </mc:Fallback>
       </mc:AlternateContent>
@@ -9452,7 +9494,7 @@
       <mc:AlternateContent>
         <mc:Choice Requires="wps">
           <w:drawing>
-            <wp:anchor behindDoc="1" distT="0" distB="0" distL="0" distR="0" simplePos="0" locked="0" layoutInCell="0" allowOverlap="1" relativeHeight="48">
+            <wp:anchor behindDoc="1" distT="0" distB="0" distL="0" distR="0" simplePos="0" locked="0" layoutInCell="0" allowOverlap="1" relativeHeight="49">
               <wp:simplePos x="0" y="0"/>
               <wp:positionH relativeFrom="page">
                 <wp:posOffset>6515100</wp:posOffset>
@@ -9663,16 +9705,16 @@
                       <wps:cNvSpPr/>
                       <wps:spPr>
                         <a:xfrm>
-                          <a:off x="6089760" y="5760"/>
-                          <a:ext cx="669240" cy="262080"/>
+                          <a:off x="6090120" y="5760"/>
+                          <a:ext cx="668520" cy="262080"/>
                         </a:xfrm>
                         <a:custGeom>
                           <a:avLst/>
                           <a:gdLst>
-                            <a:gd name="textAreaLeft" fmla="*/ 0 w 379440"/>
-                            <a:gd name="textAreaRight" fmla="*/ 380160 w 379440"/>
+                            <a:gd name="textAreaLeft" fmla="*/ 0 w 379080"/>
+                            <a:gd name="textAreaRight" fmla="*/ 380160 w 379080"/>
                             <a:gd name="textAreaTop" fmla="*/ 0 h 148680"/>
-                            <a:gd name="textAreaBottom" fmla="*/ 149400 h 148680"/>
+                            <a:gd name="textAreaBottom" fmla="*/ 149760 h 148680"/>
                           </a:gdLst>
                           <a:ahLst/>
                           <a:rect l="textAreaLeft" t="textAreaTop" r="textAreaRight" b="textAreaBottom"/>
@@ -9724,9 +9766,9 @@
                           <a:avLst/>
                           <a:gdLst>
                             <a:gd name="textAreaLeft" fmla="*/ 0 w 3448080"/>
-                            <a:gd name="textAreaRight" fmla="*/ 3448800 w 3448080"/>
+                            <a:gd name="textAreaRight" fmla="*/ 3449160 w 3448080"/>
                             <a:gd name="textAreaTop" fmla="*/ 0 h 360"/>
-                            <a:gd name="textAreaBottom" fmla="*/ 1440 h 360"/>
+                            <a:gd name="textAreaBottom" fmla="*/ 2880 h 360"/>
                           </a:gdLst>
                           <a:ahLst/>
                           <a:rect l="textAreaLeft" t="textAreaTop" r="textAreaRight" b="textAreaBottom"/>
@@ -9771,16 +9813,16 @@
                       <wps:cNvSpPr/>
                       <wps:spPr>
                         <a:xfrm>
-                          <a:off x="6089760" y="5760"/>
-                          <a:ext cx="720" cy="38160"/>
+                          <a:off x="6090120" y="5760"/>
+                          <a:ext cx="720" cy="37440"/>
                         </a:xfrm>
                         <a:custGeom>
                           <a:avLst/>
                           <a:gdLst>
                             <a:gd name="textAreaLeft" fmla="*/ 0 w 360"/>
-                            <a:gd name="textAreaRight" fmla="*/ 1440 w 360"/>
-                            <a:gd name="textAreaTop" fmla="*/ 0 h 21600"/>
-                            <a:gd name="textAreaBottom" fmla="*/ 22320 h 21600"/>
+                            <a:gd name="textAreaRight" fmla="*/ 2880 w 360"/>
+                            <a:gd name="textAreaTop" fmla="*/ 0 h 21240"/>
+                            <a:gd name="textAreaBottom" fmla="*/ 22320 h 21240"/>
                           </a:gdLst>
                           <a:ahLst/>
                           <a:rect l="textAreaLeft" t="textAreaTop" r="textAreaRight" b="textAreaBottom"/>
@@ -9825,16 +9867,16 @@
                       <wps:cNvSpPr/>
                       <wps:spPr>
                         <a:xfrm>
-                          <a:off x="6089760" y="0"/>
-                          <a:ext cx="668160" cy="720"/>
+                          <a:off x="6090120" y="0"/>
+                          <a:ext cx="667440" cy="720"/>
                         </a:xfrm>
                         <a:custGeom>
                           <a:avLst/>
                           <a:gdLst>
-                            <a:gd name="textAreaLeft" fmla="*/ 0 w 378720"/>
-                            <a:gd name="textAreaRight" fmla="*/ 379440 w 378720"/>
+                            <a:gd name="textAreaLeft" fmla="*/ 0 w 378360"/>
+                            <a:gd name="textAreaRight" fmla="*/ 379440 w 378360"/>
                             <a:gd name="textAreaTop" fmla="*/ 0 h 360"/>
-                            <a:gd name="textAreaBottom" fmla="*/ 1440 h 360"/>
+                            <a:gd name="textAreaBottom" fmla="*/ 2880 h 360"/>
                           </a:gdLst>
                           <a:ahLst/>
                           <a:rect l="textAreaLeft" t="textAreaTop" r="textAreaRight" b="textAreaBottom"/>
@@ -9879,16 +9921,16 @@
                       <wps:cNvSpPr/>
                       <wps:spPr>
                         <a:xfrm>
-                          <a:off x="6089760" y="230040"/>
-                          <a:ext cx="668160" cy="38160"/>
+                          <a:off x="6090120" y="230400"/>
+                          <a:ext cx="667440" cy="37440"/>
                         </a:xfrm>
                         <a:custGeom>
                           <a:avLst/>
                           <a:gdLst>
-                            <a:gd name="textAreaLeft" fmla="*/ 0 w 378720"/>
-                            <a:gd name="textAreaRight" fmla="*/ 379440 w 378720"/>
-                            <a:gd name="textAreaTop" fmla="*/ 0 h 21600"/>
-                            <a:gd name="textAreaBottom" fmla="*/ 22320 h 21600"/>
+                            <a:gd name="textAreaLeft" fmla="*/ 0 w 378360"/>
+                            <a:gd name="textAreaRight" fmla="*/ 379440 w 378360"/>
+                            <a:gd name="textAreaTop" fmla="*/ 0 h 21240"/>
+                            <a:gd name="textAreaBottom" fmla="*/ 22320 h 21240"/>
                           </a:gdLst>
                           <a:ahLst/>
                           <a:rect l="textAreaLeft" t="textAreaTop" r="textAreaRight" b="textAreaBottom"/>
@@ -9936,7 +9978,7 @@
         </mc:Choice>
         <mc:Fallback>
           <w:pict>
-            <v:group id="shape_0" alt="Group 1" style="position:absolute;margin-left:31.2pt;margin-top:800.75pt;width:532.25pt;height:21.1pt" coordorigin="624,16015" coordsize="10645,422"/>
+            <v:group id="shape_0" alt="Group 1" style="position:absolute;margin-left:31.2pt;margin-top:800.75pt;width:532.2pt;height:21.1pt" coordorigin="624,16015" coordsize="10644,422"/>
           </w:pict>
         </mc:Fallback>
       </mc:AlternateContent>
@@ -10380,7 +10422,7 @@
       <mc:AlternateContent>
         <mc:Choice Requires="wps">
           <w:drawing>
-            <wp:anchor behindDoc="1" distT="0" distB="0" distL="0" distR="0" simplePos="0" locked="0" layoutInCell="0" allowOverlap="1" relativeHeight="48">
+            <wp:anchor behindDoc="1" distT="0" distB="0" distL="0" distR="0" simplePos="0" locked="0" layoutInCell="0" allowOverlap="1" relativeHeight="49">
               <wp:simplePos x="0" y="0"/>
               <wp:positionH relativeFrom="page">
                 <wp:posOffset>6515100</wp:posOffset>
@@ -10562,7 +10604,7 @@
       <mc:AlternateContent>
         <mc:Choice Requires="wpg">
           <w:drawing>
-            <wp:anchor behindDoc="1" distT="1270" distB="0" distL="0" distR="635" simplePos="0" locked="0" layoutInCell="0" allowOverlap="1" relativeHeight="40">
+            <wp:anchor behindDoc="1" distT="1270" distB="0" distL="0" distR="635" simplePos="0" locked="0" layoutInCell="0" allowOverlap="1" relativeHeight="39">
               <wp:simplePos x="0" y="0"/>
               <wp:positionH relativeFrom="page">
                 <wp:posOffset>0</wp:posOffset>
@@ -10591,16 +10633,16 @@
                       <wps:cNvSpPr/>
                       <wps:spPr>
                         <a:xfrm>
-                          <a:off x="6089760" y="5760"/>
-                          <a:ext cx="669240" cy="262080"/>
+                          <a:off x="6090120" y="5760"/>
+                          <a:ext cx="668520" cy="262080"/>
                         </a:xfrm>
                         <a:custGeom>
                           <a:avLst/>
                           <a:gdLst>
-                            <a:gd name="textAreaLeft" fmla="*/ 0 w 379440"/>
-                            <a:gd name="textAreaRight" fmla="*/ 380160 w 379440"/>
+                            <a:gd name="textAreaLeft" fmla="*/ 0 w 379080"/>
+                            <a:gd name="textAreaRight" fmla="*/ 380160 w 379080"/>
                             <a:gd name="textAreaTop" fmla="*/ 0 h 148680"/>
-                            <a:gd name="textAreaBottom" fmla="*/ 149400 h 148680"/>
+                            <a:gd name="textAreaBottom" fmla="*/ 149760 h 148680"/>
                           </a:gdLst>
                           <a:ahLst/>
                           <a:rect l="textAreaLeft" t="textAreaTop" r="textAreaRight" b="textAreaBottom"/>
@@ -10652,9 +10694,9 @@
                           <a:avLst/>
                           <a:gdLst>
                             <a:gd name="textAreaLeft" fmla="*/ 0 w 3448080"/>
-                            <a:gd name="textAreaRight" fmla="*/ 3448800 w 3448080"/>
+                            <a:gd name="textAreaRight" fmla="*/ 3449160 w 3448080"/>
                             <a:gd name="textAreaTop" fmla="*/ 0 h 360"/>
-                            <a:gd name="textAreaBottom" fmla="*/ 1440 h 360"/>
+                            <a:gd name="textAreaBottom" fmla="*/ 2880 h 360"/>
                           </a:gdLst>
                           <a:ahLst/>
                           <a:rect l="textAreaLeft" t="textAreaTop" r="textAreaRight" b="textAreaBottom"/>
@@ -10699,16 +10741,16 @@
                       <wps:cNvSpPr/>
                       <wps:spPr>
                         <a:xfrm>
-                          <a:off x="6089760" y="5760"/>
-                          <a:ext cx="720" cy="38160"/>
+                          <a:off x="6090120" y="5760"/>
+                          <a:ext cx="720" cy="37440"/>
                         </a:xfrm>
                         <a:custGeom>
                           <a:avLst/>
                           <a:gdLst>
                             <a:gd name="textAreaLeft" fmla="*/ 0 w 360"/>
-                            <a:gd name="textAreaRight" fmla="*/ 1440 w 360"/>
-                            <a:gd name="textAreaTop" fmla="*/ 0 h 21600"/>
-                            <a:gd name="textAreaBottom" fmla="*/ 22320 h 21600"/>
+                            <a:gd name="textAreaRight" fmla="*/ 2880 w 360"/>
+                            <a:gd name="textAreaTop" fmla="*/ 0 h 21240"/>
+                            <a:gd name="textAreaBottom" fmla="*/ 22320 h 21240"/>
                           </a:gdLst>
                           <a:ahLst/>
                           <a:rect l="textAreaLeft" t="textAreaTop" r="textAreaRight" b="textAreaBottom"/>
@@ -10753,16 +10795,16 @@
                       <wps:cNvSpPr/>
                       <wps:spPr>
                         <a:xfrm>
-                          <a:off x="6089760" y="0"/>
-                          <a:ext cx="668160" cy="720"/>
+                          <a:off x="6090120" y="0"/>
+                          <a:ext cx="667440" cy="720"/>
                         </a:xfrm>
                         <a:custGeom>
                           <a:avLst/>
                           <a:gdLst>
-                            <a:gd name="textAreaLeft" fmla="*/ 0 w 378720"/>
-                            <a:gd name="textAreaRight" fmla="*/ 379440 w 378720"/>
+                            <a:gd name="textAreaLeft" fmla="*/ 0 w 378360"/>
+                            <a:gd name="textAreaRight" fmla="*/ 379440 w 378360"/>
                             <a:gd name="textAreaTop" fmla="*/ 0 h 360"/>
-                            <a:gd name="textAreaBottom" fmla="*/ 1440 h 360"/>
+                            <a:gd name="textAreaBottom" fmla="*/ 2880 h 360"/>
                           </a:gdLst>
                           <a:ahLst/>
                           <a:rect l="textAreaLeft" t="textAreaTop" r="textAreaRight" b="textAreaBottom"/>
@@ -10807,16 +10849,16 @@
                       <wps:cNvSpPr/>
                       <wps:spPr>
                         <a:xfrm>
-                          <a:off x="6089760" y="230040"/>
-                          <a:ext cx="668160" cy="38160"/>
+                          <a:off x="6090120" y="230400"/>
+                          <a:ext cx="667440" cy="37440"/>
                         </a:xfrm>
                         <a:custGeom>
                           <a:avLst/>
                           <a:gdLst>
-                            <a:gd name="textAreaLeft" fmla="*/ 0 w 378720"/>
-                            <a:gd name="textAreaRight" fmla="*/ 379440 w 378720"/>
-                            <a:gd name="textAreaTop" fmla="*/ 0 h 21600"/>
-                            <a:gd name="textAreaBottom" fmla="*/ 22320 h 21600"/>
+                            <a:gd name="textAreaLeft" fmla="*/ 0 w 378360"/>
+                            <a:gd name="textAreaRight" fmla="*/ 379440 w 378360"/>
+                            <a:gd name="textAreaTop" fmla="*/ 0 h 21240"/>
+                            <a:gd name="textAreaBottom" fmla="*/ 22320 h 21240"/>
                           </a:gdLst>
                           <a:ahLst/>
                           <a:rect l="textAreaLeft" t="textAreaTop" r="textAreaRight" b="textAreaBottom"/>
@@ -10871,7 +10913,7 @@
       <mc:AlternateContent>
         <mc:Choice Requires="wps">
           <w:drawing>
-            <wp:anchor behindDoc="1" distT="0" distB="0" distL="0" distR="0" simplePos="0" locked="0" layoutInCell="0" allowOverlap="1" relativeHeight="41">
+            <wp:anchor behindDoc="1" distT="0" distB="0" distL="0" distR="0" simplePos="0" locked="0" layoutInCell="0" allowOverlap="1" relativeHeight="40">
               <wp:simplePos x="0" y="0"/>
               <wp:positionH relativeFrom="page">
                 <wp:posOffset>0</wp:posOffset>
@@ -11352,16 +11394,16 @@
                       <wps:cNvSpPr/>
                       <wps:spPr>
                         <a:xfrm>
-                          <a:off x="6089760" y="5760"/>
-                          <a:ext cx="669240" cy="262080"/>
+                          <a:off x="6090120" y="5760"/>
+                          <a:ext cx="668520" cy="262080"/>
                         </a:xfrm>
                         <a:custGeom>
                           <a:avLst/>
                           <a:gdLst>
-                            <a:gd name="textAreaLeft" fmla="*/ 0 w 379440"/>
-                            <a:gd name="textAreaRight" fmla="*/ 380160 w 379440"/>
+                            <a:gd name="textAreaLeft" fmla="*/ 0 w 379080"/>
+                            <a:gd name="textAreaRight" fmla="*/ 380160 w 379080"/>
                             <a:gd name="textAreaTop" fmla="*/ 0 h 148680"/>
-                            <a:gd name="textAreaBottom" fmla="*/ 149400 h 148680"/>
+                            <a:gd name="textAreaBottom" fmla="*/ 149760 h 148680"/>
                           </a:gdLst>
                           <a:ahLst/>
                           <a:rect l="textAreaLeft" t="textAreaTop" r="textAreaRight" b="textAreaBottom"/>
@@ -11413,9 +11455,9 @@
                           <a:avLst/>
                           <a:gdLst>
                             <a:gd name="textAreaLeft" fmla="*/ 0 w 3448080"/>
-                            <a:gd name="textAreaRight" fmla="*/ 3448800 w 3448080"/>
+                            <a:gd name="textAreaRight" fmla="*/ 3449160 w 3448080"/>
                             <a:gd name="textAreaTop" fmla="*/ 0 h 360"/>
-                            <a:gd name="textAreaBottom" fmla="*/ 1440 h 360"/>
+                            <a:gd name="textAreaBottom" fmla="*/ 2880 h 360"/>
                           </a:gdLst>
                           <a:ahLst/>
                           <a:rect l="textAreaLeft" t="textAreaTop" r="textAreaRight" b="textAreaBottom"/>
@@ -11460,16 +11502,16 @@
                       <wps:cNvSpPr/>
                       <wps:spPr>
                         <a:xfrm>
-                          <a:off x="6089760" y="5760"/>
-                          <a:ext cx="720" cy="38160"/>
+                          <a:off x="6090120" y="5760"/>
+                          <a:ext cx="720" cy="37440"/>
                         </a:xfrm>
                         <a:custGeom>
                           <a:avLst/>
                           <a:gdLst>
                             <a:gd name="textAreaLeft" fmla="*/ 0 w 360"/>
-                            <a:gd name="textAreaRight" fmla="*/ 1440 w 360"/>
-                            <a:gd name="textAreaTop" fmla="*/ 0 h 21600"/>
-                            <a:gd name="textAreaBottom" fmla="*/ 22320 h 21600"/>
+                            <a:gd name="textAreaRight" fmla="*/ 2880 w 360"/>
+                            <a:gd name="textAreaTop" fmla="*/ 0 h 21240"/>
+                            <a:gd name="textAreaBottom" fmla="*/ 22320 h 21240"/>
                           </a:gdLst>
                           <a:ahLst/>
                           <a:rect l="textAreaLeft" t="textAreaTop" r="textAreaRight" b="textAreaBottom"/>
@@ -11514,16 +11556,16 @@
                       <wps:cNvSpPr/>
                       <wps:spPr>
                         <a:xfrm>
-                          <a:off x="6089760" y="0"/>
-                          <a:ext cx="668160" cy="720"/>
+                          <a:off x="6090120" y="0"/>
+                          <a:ext cx="667440" cy="720"/>
                         </a:xfrm>
                         <a:custGeom>
                           <a:avLst/>
                           <a:gdLst>
-                            <a:gd name="textAreaLeft" fmla="*/ 0 w 378720"/>
-                            <a:gd name="textAreaRight" fmla="*/ 379440 w 378720"/>
+                            <a:gd name="textAreaLeft" fmla="*/ 0 w 378360"/>
+                            <a:gd name="textAreaRight" fmla="*/ 379440 w 378360"/>
                             <a:gd name="textAreaTop" fmla="*/ 0 h 360"/>
-                            <a:gd name="textAreaBottom" fmla="*/ 1440 h 360"/>
+                            <a:gd name="textAreaBottom" fmla="*/ 2880 h 360"/>
                           </a:gdLst>
                           <a:ahLst/>
                           <a:rect l="textAreaLeft" t="textAreaTop" r="textAreaRight" b="textAreaBottom"/>
@@ -11568,16 +11610,16 @@
                       <wps:cNvSpPr/>
                       <wps:spPr>
                         <a:xfrm>
-                          <a:off x="6089760" y="230040"/>
-                          <a:ext cx="668160" cy="38160"/>
+                          <a:off x="6090120" y="230400"/>
+                          <a:ext cx="667440" cy="37440"/>
                         </a:xfrm>
                         <a:custGeom>
                           <a:avLst/>
                           <a:gdLst>
-                            <a:gd name="textAreaLeft" fmla="*/ 0 w 378720"/>
-                            <a:gd name="textAreaRight" fmla="*/ 379440 w 378720"/>
-                            <a:gd name="textAreaTop" fmla="*/ 0 h 21600"/>
-                            <a:gd name="textAreaBottom" fmla="*/ 22320 h 21600"/>
+                            <a:gd name="textAreaLeft" fmla="*/ 0 w 378360"/>
+                            <a:gd name="textAreaRight" fmla="*/ 379440 w 378360"/>
+                            <a:gd name="textAreaTop" fmla="*/ 0 h 21240"/>
+                            <a:gd name="textAreaBottom" fmla="*/ 22320 h 21240"/>
                           </a:gdLst>
                           <a:ahLst/>
                           <a:rect l="textAreaLeft" t="textAreaTop" r="textAreaRight" b="textAreaBottom"/>
@@ -11625,7 +11667,7 @@
         </mc:Choice>
         <mc:Fallback>
           <w:pict>
-            <v:group id="shape_0" alt="Group 1" style="position:absolute;margin-left:31.2pt;margin-top:800.75pt;width:532.25pt;height:21.1pt" coordorigin="624,16015" coordsize="10645,422"/>
+            <v:group id="shape_0" alt="Group 1" style="position:absolute;margin-left:31.2pt;margin-top:800.75pt;width:532.2pt;height:21.1pt" coordorigin="624,16015" coordsize="10644,422"/>
           </w:pict>
         </mc:Fallback>
       </mc:AlternateContent>
@@ -12280,16 +12322,16 @@
                       <wps:cNvSpPr/>
                       <wps:spPr>
                         <a:xfrm>
-                          <a:off x="6089760" y="5760"/>
-                          <a:ext cx="669240" cy="262080"/>
+                          <a:off x="6090120" y="5760"/>
+                          <a:ext cx="668520" cy="262080"/>
                         </a:xfrm>
                         <a:custGeom>
                           <a:avLst/>
                           <a:gdLst>
-                            <a:gd name="textAreaLeft" fmla="*/ 0 w 379440"/>
-                            <a:gd name="textAreaRight" fmla="*/ 380160 w 379440"/>
+                            <a:gd name="textAreaLeft" fmla="*/ 0 w 379080"/>
+                            <a:gd name="textAreaRight" fmla="*/ 380160 w 379080"/>
                             <a:gd name="textAreaTop" fmla="*/ 0 h 148680"/>
-                            <a:gd name="textAreaBottom" fmla="*/ 149400 h 148680"/>
+                            <a:gd name="textAreaBottom" fmla="*/ 149760 h 148680"/>
                           </a:gdLst>
                           <a:ahLst/>
                           <a:rect l="textAreaLeft" t="textAreaTop" r="textAreaRight" b="textAreaBottom"/>
@@ -12341,9 +12383,9 @@
                           <a:avLst/>
                           <a:gdLst>
                             <a:gd name="textAreaLeft" fmla="*/ 0 w 3448080"/>
-                            <a:gd name="textAreaRight" fmla="*/ 3448800 w 3448080"/>
+                            <a:gd name="textAreaRight" fmla="*/ 3449160 w 3448080"/>
                             <a:gd name="textAreaTop" fmla="*/ 0 h 360"/>
-                            <a:gd name="textAreaBottom" fmla="*/ 1440 h 360"/>
+                            <a:gd name="textAreaBottom" fmla="*/ 2880 h 360"/>
                           </a:gdLst>
                           <a:ahLst/>
                           <a:rect l="textAreaLeft" t="textAreaTop" r="textAreaRight" b="textAreaBottom"/>
@@ -12388,16 +12430,16 @@
                       <wps:cNvSpPr/>
                       <wps:spPr>
                         <a:xfrm>
-                          <a:off x="6089760" y="5760"/>
-                          <a:ext cx="720" cy="38160"/>
+                          <a:off x="6090120" y="5760"/>
+                          <a:ext cx="720" cy="37440"/>
                         </a:xfrm>
                         <a:custGeom>
                           <a:avLst/>
                           <a:gdLst>
                             <a:gd name="textAreaLeft" fmla="*/ 0 w 360"/>
-                            <a:gd name="textAreaRight" fmla="*/ 1440 w 360"/>
-                            <a:gd name="textAreaTop" fmla="*/ 0 h 21600"/>
-                            <a:gd name="textAreaBottom" fmla="*/ 22320 h 21600"/>
+                            <a:gd name="textAreaRight" fmla="*/ 2880 w 360"/>
+                            <a:gd name="textAreaTop" fmla="*/ 0 h 21240"/>
+                            <a:gd name="textAreaBottom" fmla="*/ 22320 h 21240"/>
                           </a:gdLst>
                           <a:ahLst/>
                           <a:rect l="textAreaLeft" t="textAreaTop" r="textAreaRight" b="textAreaBottom"/>
@@ -12442,16 +12484,16 @@
                       <wps:cNvSpPr/>
                       <wps:spPr>
                         <a:xfrm>
-                          <a:off x="6089760" y="0"/>
-                          <a:ext cx="668160" cy="720"/>
+                          <a:off x="6090120" y="0"/>
+                          <a:ext cx="667440" cy="720"/>
                         </a:xfrm>
                         <a:custGeom>
                           <a:avLst/>
                           <a:gdLst>
-                            <a:gd name="textAreaLeft" fmla="*/ 0 w 378720"/>
-                            <a:gd name="textAreaRight" fmla="*/ 379440 w 378720"/>
+                            <a:gd name="textAreaLeft" fmla="*/ 0 w 378360"/>
+                            <a:gd name="textAreaRight" fmla="*/ 379440 w 378360"/>
                             <a:gd name="textAreaTop" fmla="*/ 0 h 360"/>
-                            <a:gd name="textAreaBottom" fmla="*/ 1440 h 360"/>
+                            <a:gd name="textAreaBottom" fmla="*/ 2880 h 360"/>
                           </a:gdLst>
                           <a:ahLst/>
                           <a:rect l="textAreaLeft" t="textAreaTop" r="textAreaRight" b="textAreaBottom"/>
@@ -12496,16 +12538,16 @@
                       <wps:cNvSpPr/>
                       <wps:spPr>
                         <a:xfrm>
-                          <a:off x="6089760" y="230040"/>
-                          <a:ext cx="668160" cy="38160"/>
+                          <a:off x="6090120" y="230400"/>
+                          <a:ext cx="667440" cy="37440"/>
                         </a:xfrm>
                         <a:custGeom>
                           <a:avLst/>
                           <a:gdLst>
-                            <a:gd name="textAreaLeft" fmla="*/ 0 w 378720"/>
-                            <a:gd name="textAreaRight" fmla="*/ 379440 w 378720"/>
-                            <a:gd name="textAreaTop" fmla="*/ 0 h 21600"/>
-                            <a:gd name="textAreaBottom" fmla="*/ 22320 h 21600"/>
+                            <a:gd name="textAreaLeft" fmla="*/ 0 w 378360"/>
+                            <a:gd name="textAreaRight" fmla="*/ 379440 w 378360"/>
+                            <a:gd name="textAreaTop" fmla="*/ 0 h 21240"/>
+                            <a:gd name="textAreaBottom" fmla="*/ 22320 h 21240"/>
                           </a:gdLst>
                           <a:ahLst/>
                           <a:rect l="textAreaLeft" t="textAreaTop" r="textAreaRight" b="textAreaBottom"/>
@@ -12553,7 +12595,7 @@
         </mc:Choice>
         <mc:Fallback>
           <w:pict>
-            <v:group id="shape_0" alt="Group 1" style="position:absolute;margin-left:31.2pt;margin-top:800.75pt;width:532.25pt;height:21.1pt" coordorigin="624,16015" coordsize="10645,422"/>
+            <v:group id="shape_0" alt="Group 1" style="position:absolute;margin-left:31.2pt;margin-top:800.75pt;width:532.2pt;height:21.1pt" coordorigin="624,16015" coordsize="10644,422"/>
           </w:pict>
         </mc:Fallback>
       </mc:AlternateContent>
@@ -13179,7 +13221,7 @@
       <mc:AlternateContent>
         <mc:Choice Requires="wpg">
           <w:drawing>
-            <wp:anchor behindDoc="1" distT="1270" distB="0" distL="0" distR="635" simplePos="0" locked="0" layoutInCell="0" allowOverlap="1" relativeHeight="42">
+            <wp:anchor behindDoc="1" distT="1270" distB="0" distL="0" distR="635" simplePos="0" locked="0" layoutInCell="0" allowOverlap="1" relativeHeight="41">
               <wp:simplePos x="0" y="0"/>
               <wp:positionH relativeFrom="page">
                 <wp:posOffset>0</wp:posOffset>
@@ -13208,16 +13250,16 @@
                       <wps:cNvSpPr/>
                       <wps:spPr>
                         <a:xfrm>
-                          <a:off x="6089760" y="5760"/>
-                          <a:ext cx="669240" cy="262080"/>
+                          <a:off x="6090120" y="5760"/>
+                          <a:ext cx="668520" cy="262080"/>
                         </a:xfrm>
                         <a:custGeom>
                           <a:avLst/>
                           <a:gdLst>
-                            <a:gd name="textAreaLeft" fmla="*/ 0 w 379440"/>
-                            <a:gd name="textAreaRight" fmla="*/ 380160 w 379440"/>
+                            <a:gd name="textAreaLeft" fmla="*/ 0 w 379080"/>
+                            <a:gd name="textAreaRight" fmla="*/ 380160 w 379080"/>
                             <a:gd name="textAreaTop" fmla="*/ 0 h 148680"/>
-                            <a:gd name="textAreaBottom" fmla="*/ 149400 h 148680"/>
+                            <a:gd name="textAreaBottom" fmla="*/ 149760 h 148680"/>
                           </a:gdLst>
                           <a:ahLst/>
                           <a:rect l="textAreaLeft" t="textAreaTop" r="textAreaRight" b="textAreaBottom"/>
@@ -13269,9 +13311,9 @@
                           <a:avLst/>
                           <a:gdLst>
                             <a:gd name="textAreaLeft" fmla="*/ 0 w 3448080"/>
-                            <a:gd name="textAreaRight" fmla="*/ 3448800 w 3448080"/>
+                            <a:gd name="textAreaRight" fmla="*/ 3449160 w 3448080"/>
                             <a:gd name="textAreaTop" fmla="*/ 0 h 360"/>
-                            <a:gd name="textAreaBottom" fmla="*/ 1440 h 360"/>
+                            <a:gd name="textAreaBottom" fmla="*/ 2880 h 360"/>
                           </a:gdLst>
                           <a:ahLst/>
                           <a:rect l="textAreaLeft" t="textAreaTop" r="textAreaRight" b="textAreaBottom"/>
@@ -13316,16 +13358,16 @@
                       <wps:cNvSpPr/>
                       <wps:spPr>
                         <a:xfrm>
-                          <a:off x="6089760" y="5760"/>
-                          <a:ext cx="720" cy="38160"/>
+                          <a:off x="6090120" y="5760"/>
+                          <a:ext cx="720" cy="37440"/>
                         </a:xfrm>
                         <a:custGeom>
                           <a:avLst/>
                           <a:gdLst>
                             <a:gd name="textAreaLeft" fmla="*/ 0 w 360"/>
-                            <a:gd name="textAreaRight" fmla="*/ 1440 w 360"/>
-                            <a:gd name="textAreaTop" fmla="*/ 0 h 21600"/>
-                            <a:gd name="textAreaBottom" fmla="*/ 22320 h 21600"/>
+                            <a:gd name="textAreaRight" fmla="*/ 2880 w 360"/>
+                            <a:gd name="textAreaTop" fmla="*/ 0 h 21240"/>
+                            <a:gd name="textAreaBottom" fmla="*/ 22320 h 21240"/>
                           </a:gdLst>
                           <a:ahLst/>
                           <a:rect l="textAreaLeft" t="textAreaTop" r="textAreaRight" b="textAreaBottom"/>
@@ -13370,16 +13412,16 @@
                       <wps:cNvSpPr/>
                       <wps:spPr>
                         <a:xfrm>
-                          <a:off x="6089760" y="0"/>
-                          <a:ext cx="668160" cy="720"/>
+                          <a:off x="6090120" y="0"/>
+                          <a:ext cx="667440" cy="720"/>
                         </a:xfrm>
                         <a:custGeom>
                           <a:avLst/>
                           <a:gdLst>
-                            <a:gd name="textAreaLeft" fmla="*/ 0 w 378720"/>
-                            <a:gd name="textAreaRight" fmla="*/ 379440 w 378720"/>
+                            <a:gd name="textAreaLeft" fmla="*/ 0 w 378360"/>
+                            <a:gd name="textAreaRight" fmla="*/ 379440 w 378360"/>
                             <a:gd name="textAreaTop" fmla="*/ 0 h 360"/>
-                            <a:gd name="textAreaBottom" fmla="*/ 1440 h 360"/>
+                            <a:gd name="textAreaBottom" fmla="*/ 2880 h 360"/>
                           </a:gdLst>
                           <a:ahLst/>
                           <a:rect l="textAreaLeft" t="textAreaTop" r="textAreaRight" b="textAreaBottom"/>
@@ -13424,16 +13466,16 @@
                       <wps:cNvSpPr/>
                       <wps:spPr>
                         <a:xfrm>
-                          <a:off x="6089760" y="230040"/>
-                          <a:ext cx="668160" cy="38160"/>
+                          <a:off x="6090120" y="230400"/>
+                          <a:ext cx="667440" cy="37440"/>
                         </a:xfrm>
                         <a:custGeom>
                           <a:avLst/>
                           <a:gdLst>
-                            <a:gd name="textAreaLeft" fmla="*/ 0 w 378720"/>
-                            <a:gd name="textAreaRight" fmla="*/ 379440 w 378720"/>
-                            <a:gd name="textAreaTop" fmla="*/ 0 h 21600"/>
-                            <a:gd name="textAreaBottom" fmla="*/ 22320 h 21600"/>
+                            <a:gd name="textAreaLeft" fmla="*/ 0 w 378360"/>
+                            <a:gd name="textAreaRight" fmla="*/ 379440 w 378360"/>
+                            <a:gd name="textAreaTop" fmla="*/ 0 h 21240"/>
+                            <a:gd name="textAreaBottom" fmla="*/ 22320 h 21240"/>
                           </a:gdLst>
                           <a:ahLst/>
                           <a:rect l="textAreaLeft" t="textAreaTop" r="textAreaRight" b="textAreaBottom"/>
@@ -13488,7 +13530,7 @@
       <mc:AlternateContent>
         <mc:Choice Requires="wps">
           <w:drawing>
-            <wp:anchor behindDoc="1" distT="0" distB="0" distL="0" distR="0" simplePos="0" locked="0" layoutInCell="0" allowOverlap="1" relativeHeight="43">
+            <wp:anchor behindDoc="1" distT="0" distB="0" distL="0" distR="0" simplePos="0" locked="0" layoutInCell="0" allowOverlap="1" relativeHeight="42">
               <wp:simplePos x="0" y="0"/>
               <wp:positionH relativeFrom="page">
                 <wp:posOffset>0</wp:posOffset>
@@ -13925,7 +13967,7 @@
       <mc:AlternateContent>
         <mc:Choice Requires="wps">
           <w:drawing>
-            <wp:anchor behindDoc="1" distT="0" distB="0" distL="0" distR="0" simplePos="0" locked="0" layoutInCell="0" allowOverlap="1" relativeHeight="50">
+            <wp:anchor behindDoc="1" distT="0" distB="0" distL="0" distR="0" simplePos="0" locked="0" layoutInCell="0" allowOverlap="1" relativeHeight="44">
               <wp:simplePos x="0" y="0"/>
               <wp:positionH relativeFrom="page">
                 <wp:posOffset>0</wp:posOffset>
@@ -14136,16 +14178,16 @@
                       <wps:cNvSpPr/>
                       <wps:spPr>
                         <a:xfrm>
-                          <a:off x="6089760" y="5760"/>
-                          <a:ext cx="669240" cy="262080"/>
+                          <a:off x="6090120" y="5760"/>
+                          <a:ext cx="668520" cy="262080"/>
                         </a:xfrm>
                         <a:custGeom>
                           <a:avLst/>
                           <a:gdLst>
-                            <a:gd name="textAreaLeft" fmla="*/ 0 w 379440"/>
-                            <a:gd name="textAreaRight" fmla="*/ 380160 w 379440"/>
+                            <a:gd name="textAreaLeft" fmla="*/ 0 w 379080"/>
+                            <a:gd name="textAreaRight" fmla="*/ 380160 w 379080"/>
                             <a:gd name="textAreaTop" fmla="*/ 0 h 148680"/>
-                            <a:gd name="textAreaBottom" fmla="*/ 149400 h 148680"/>
+                            <a:gd name="textAreaBottom" fmla="*/ 149760 h 148680"/>
                           </a:gdLst>
                           <a:ahLst/>
                           <a:rect l="textAreaLeft" t="textAreaTop" r="textAreaRight" b="textAreaBottom"/>
@@ -14197,9 +14239,9 @@
                           <a:avLst/>
                           <a:gdLst>
                             <a:gd name="textAreaLeft" fmla="*/ 0 w 3448080"/>
-                            <a:gd name="textAreaRight" fmla="*/ 3448800 w 3448080"/>
+                            <a:gd name="textAreaRight" fmla="*/ 3449160 w 3448080"/>
                             <a:gd name="textAreaTop" fmla="*/ 0 h 360"/>
-                            <a:gd name="textAreaBottom" fmla="*/ 1440 h 360"/>
+                            <a:gd name="textAreaBottom" fmla="*/ 2880 h 360"/>
                           </a:gdLst>
                           <a:ahLst/>
                           <a:rect l="textAreaLeft" t="textAreaTop" r="textAreaRight" b="textAreaBottom"/>
@@ -14244,16 +14286,16 @@
                       <wps:cNvSpPr/>
                       <wps:spPr>
                         <a:xfrm>
-                          <a:off x="6089760" y="5760"/>
-                          <a:ext cx="720" cy="38160"/>
+                          <a:off x="6090120" y="5760"/>
+                          <a:ext cx="720" cy="37440"/>
                         </a:xfrm>
                         <a:custGeom>
                           <a:avLst/>
                           <a:gdLst>
                             <a:gd name="textAreaLeft" fmla="*/ 0 w 360"/>
-                            <a:gd name="textAreaRight" fmla="*/ 1440 w 360"/>
-                            <a:gd name="textAreaTop" fmla="*/ 0 h 21600"/>
-                            <a:gd name="textAreaBottom" fmla="*/ 22320 h 21600"/>
+                            <a:gd name="textAreaRight" fmla="*/ 2880 w 360"/>
+                            <a:gd name="textAreaTop" fmla="*/ 0 h 21240"/>
+                            <a:gd name="textAreaBottom" fmla="*/ 22320 h 21240"/>
                           </a:gdLst>
                           <a:ahLst/>
                           <a:rect l="textAreaLeft" t="textAreaTop" r="textAreaRight" b="textAreaBottom"/>
@@ -14298,16 +14340,16 @@
                       <wps:cNvSpPr/>
                       <wps:spPr>
                         <a:xfrm>
-                          <a:off x="6089760" y="0"/>
-                          <a:ext cx="668160" cy="720"/>
+                          <a:off x="6090120" y="0"/>
+                          <a:ext cx="667440" cy="720"/>
                         </a:xfrm>
                         <a:custGeom>
                           <a:avLst/>
                           <a:gdLst>
-                            <a:gd name="textAreaLeft" fmla="*/ 0 w 378720"/>
-                            <a:gd name="textAreaRight" fmla="*/ 379440 w 378720"/>
+                            <a:gd name="textAreaLeft" fmla="*/ 0 w 378360"/>
+                            <a:gd name="textAreaRight" fmla="*/ 379440 w 378360"/>
                             <a:gd name="textAreaTop" fmla="*/ 0 h 360"/>
-                            <a:gd name="textAreaBottom" fmla="*/ 1440 h 360"/>
+                            <a:gd name="textAreaBottom" fmla="*/ 2880 h 360"/>
                           </a:gdLst>
                           <a:ahLst/>
                           <a:rect l="textAreaLeft" t="textAreaTop" r="textAreaRight" b="textAreaBottom"/>
@@ -14352,16 +14394,16 @@
                       <wps:cNvSpPr/>
                       <wps:spPr>
                         <a:xfrm>
-                          <a:off x="6089760" y="230040"/>
-                          <a:ext cx="668160" cy="38160"/>
+                          <a:off x="6090120" y="230400"/>
+                          <a:ext cx="667440" cy="37440"/>
                         </a:xfrm>
                         <a:custGeom>
                           <a:avLst/>
                           <a:gdLst>
-                            <a:gd name="textAreaLeft" fmla="*/ 0 w 378720"/>
-                            <a:gd name="textAreaRight" fmla="*/ 379440 w 378720"/>
-                            <a:gd name="textAreaTop" fmla="*/ 0 h 21600"/>
-                            <a:gd name="textAreaBottom" fmla="*/ 22320 h 21600"/>
+                            <a:gd name="textAreaLeft" fmla="*/ 0 w 378360"/>
+                            <a:gd name="textAreaRight" fmla="*/ 379440 w 378360"/>
+                            <a:gd name="textAreaTop" fmla="*/ 0 h 21240"/>
+                            <a:gd name="textAreaBottom" fmla="*/ 22320 h 21240"/>
                           </a:gdLst>
                           <a:ahLst/>
                           <a:rect l="textAreaLeft" t="textAreaTop" r="textAreaRight" b="textAreaBottom"/>
@@ -14409,7 +14451,7 @@
         </mc:Choice>
         <mc:Fallback>
           <w:pict>
-            <v:group id="shape_0" alt="Group 1" style="position:absolute;margin-left:31.2pt;margin-top:800.75pt;width:532.25pt;height:21.1pt" coordorigin="624,16015" coordsize="10645,422"/>
+            <v:group id="shape_0" alt="Group 1" style="position:absolute;margin-left:31.2pt;margin-top:800.75pt;width:532.2pt;height:21.1pt" coordorigin="624,16015" coordsize="10644,422"/>
           </w:pict>
         </mc:Fallback>
       </mc:AlternateContent>
@@ -15064,16 +15106,16 @@
                       <wps:cNvSpPr/>
                       <wps:spPr>
                         <a:xfrm>
-                          <a:off x="6089760" y="5760"/>
-                          <a:ext cx="669240" cy="262080"/>
+                          <a:off x="6090120" y="5760"/>
+                          <a:ext cx="668520" cy="262080"/>
                         </a:xfrm>
                         <a:custGeom>
                           <a:avLst/>
                           <a:gdLst>
-                            <a:gd name="textAreaLeft" fmla="*/ 0 w 379440"/>
-                            <a:gd name="textAreaRight" fmla="*/ 380160 w 379440"/>
+                            <a:gd name="textAreaLeft" fmla="*/ 0 w 379080"/>
+                            <a:gd name="textAreaRight" fmla="*/ 380160 w 379080"/>
                             <a:gd name="textAreaTop" fmla="*/ 0 h 148680"/>
-                            <a:gd name="textAreaBottom" fmla="*/ 149400 h 148680"/>
+                            <a:gd name="textAreaBottom" fmla="*/ 149760 h 148680"/>
                           </a:gdLst>
                           <a:ahLst/>
                           <a:rect l="textAreaLeft" t="textAreaTop" r="textAreaRight" b="textAreaBottom"/>
@@ -15125,9 +15167,9 @@
                           <a:avLst/>
                           <a:gdLst>
                             <a:gd name="textAreaLeft" fmla="*/ 0 w 3448080"/>
-                            <a:gd name="textAreaRight" fmla="*/ 3448800 w 3448080"/>
+                            <a:gd name="textAreaRight" fmla="*/ 3449160 w 3448080"/>
                             <a:gd name="textAreaTop" fmla="*/ 0 h 360"/>
-                            <a:gd name="textAreaBottom" fmla="*/ 1440 h 360"/>
+                            <a:gd name="textAreaBottom" fmla="*/ 2880 h 360"/>
                           </a:gdLst>
                           <a:ahLst/>
                           <a:rect l="textAreaLeft" t="textAreaTop" r="textAreaRight" b="textAreaBottom"/>
@@ -15172,16 +15214,16 @@
                       <wps:cNvSpPr/>
                       <wps:spPr>
                         <a:xfrm>
-                          <a:off x="6089760" y="5760"/>
-                          <a:ext cx="720" cy="38160"/>
+                          <a:off x="6090120" y="5760"/>
+                          <a:ext cx="720" cy="37440"/>
                         </a:xfrm>
                         <a:custGeom>
                           <a:avLst/>
                           <a:gdLst>
                             <a:gd name="textAreaLeft" fmla="*/ 0 w 360"/>
-                            <a:gd name="textAreaRight" fmla="*/ 1440 w 360"/>
-                            <a:gd name="textAreaTop" fmla="*/ 0 h 21600"/>
-                            <a:gd name="textAreaBottom" fmla="*/ 22320 h 21600"/>
+                            <a:gd name="textAreaRight" fmla="*/ 2880 w 360"/>
+                            <a:gd name="textAreaTop" fmla="*/ 0 h 21240"/>
+                            <a:gd name="textAreaBottom" fmla="*/ 22320 h 21240"/>
                           </a:gdLst>
                           <a:ahLst/>
                           <a:rect l="textAreaLeft" t="textAreaTop" r="textAreaRight" b="textAreaBottom"/>
@@ -15226,16 +15268,16 @@
                       <wps:cNvSpPr/>
                       <wps:spPr>
                         <a:xfrm>
-                          <a:off x="6089760" y="0"/>
-                          <a:ext cx="668160" cy="720"/>
+                          <a:off x="6090120" y="0"/>
+                          <a:ext cx="667440" cy="720"/>
                         </a:xfrm>
                         <a:custGeom>
                           <a:avLst/>
                           <a:gdLst>
-                            <a:gd name="textAreaLeft" fmla="*/ 0 w 378720"/>
-                            <a:gd name="textAreaRight" fmla="*/ 379440 w 378720"/>
+                            <a:gd name="textAreaLeft" fmla="*/ 0 w 378360"/>
+                            <a:gd name="textAreaRight" fmla="*/ 379440 w 378360"/>
                             <a:gd name="textAreaTop" fmla="*/ 0 h 360"/>
-                            <a:gd name="textAreaBottom" fmla="*/ 1440 h 360"/>
+                            <a:gd name="textAreaBottom" fmla="*/ 2880 h 360"/>
                           </a:gdLst>
                           <a:ahLst/>
                           <a:rect l="textAreaLeft" t="textAreaTop" r="textAreaRight" b="textAreaBottom"/>
@@ -15280,16 +15322,16 @@
                       <wps:cNvSpPr/>
                       <wps:spPr>
                         <a:xfrm>
-                          <a:off x="6089760" y="230040"/>
-                          <a:ext cx="668160" cy="38160"/>
+                          <a:off x="6090120" y="230400"/>
+                          <a:ext cx="667440" cy="37440"/>
                         </a:xfrm>
                         <a:custGeom>
                           <a:avLst/>
                           <a:gdLst>
-                            <a:gd name="textAreaLeft" fmla="*/ 0 w 378720"/>
-                            <a:gd name="textAreaRight" fmla="*/ 379440 w 378720"/>
-                            <a:gd name="textAreaTop" fmla="*/ 0 h 21600"/>
-                            <a:gd name="textAreaBottom" fmla="*/ 22320 h 21600"/>
+                            <a:gd name="textAreaLeft" fmla="*/ 0 w 378360"/>
+                            <a:gd name="textAreaRight" fmla="*/ 379440 w 378360"/>
+                            <a:gd name="textAreaTop" fmla="*/ 0 h 21240"/>
+                            <a:gd name="textAreaBottom" fmla="*/ 22320 h 21240"/>
                           </a:gdLst>
                           <a:ahLst/>
                           <a:rect l="textAreaLeft" t="textAreaTop" r="textAreaRight" b="textAreaBottom"/>
@@ -15337,7 +15379,7 @@
         </mc:Choice>
         <mc:Fallback>
           <w:pict>
-            <v:group id="shape_0" alt="Group 1" style="position:absolute;margin-left:31.2pt;margin-top:800.75pt;width:532.25pt;height:21.1pt" coordorigin="624,16015" coordsize="10645,422"/>
+            <v:group id="shape_0" alt="Group 1" style="position:absolute;margin-left:31.2pt;margin-top:800.75pt;width:532.2pt;height:21.1pt" coordorigin="624,16015" coordsize="10644,422"/>
           </w:pict>
         </mc:Fallback>
       </mc:AlternateContent>

</xml_diff>

<commit_message>
Changed Junior logo, updated all indicazioni_alimentari with interactions with drugs
</commit_message>
<xml_diff>
--- a/static/Indicazioni_alimentari.docx
+++ b/static/Indicazioni_alimentari.docx
@@ -1,10 +1,10 @@
 
 <file path=word/document.xml><?xml version="1.0" encoding="utf-8"?>
-<w:document xmlns:wpc="http://schemas.microsoft.com/office/word/2010/wordprocessingCanvas" xmlns:cx="http://schemas.microsoft.com/office/drawing/2014/chartex" xmlns:cx1="http://schemas.microsoft.com/office/drawing/2015/9/8/chartex" xmlns:cx2="http://schemas.microsoft.com/office/drawing/2015/10/21/chartex" xmlns:cx3="http://schemas.microsoft.com/office/drawing/2016/5/9/chartex" xmlns:cx4="http://schemas.microsoft.com/office/drawing/2016/5/10/chartex" xmlns:cx5="http://schemas.microsoft.com/office/drawing/2016/5/11/chartex" xmlns:cx6="http://schemas.microsoft.com/office/drawing/2016/5/12/chartex" xmlns:cx7="http://schemas.microsoft.com/office/drawing/2016/5/13/chartex" xmlns:cx8="http://schemas.microsoft.com/office/drawing/2016/5/14/chartex" xmlns:mc="http://schemas.openxmlformats.org/markup-compatibility/2006" xmlns:aink="http://schemas.microsoft.com/office/drawing/2016/ink" xmlns:am3d="http://schemas.microsoft.com/office/drawing/2017/model3d" xmlns:o="urn:schemas-microsoft-com:office:office" xmlns:oel="http://schemas.microsoft.com/office/2019/extlst" xmlns:r="http://schemas.openxmlformats.org/officeDocument/2006/relationships" xmlns:m="http://schemas.openxmlformats.org/officeDocument/2006/math" xmlns:v="urn:schemas-microsoft-com:vml" xmlns:wp14="http://schemas.microsoft.com/office/word/2010/wordprocessingDrawing" xmlns:wp="http://schemas.openxmlformats.org/drawingml/2006/wordprocessingDrawing" xmlns:w10="urn:schemas-microsoft-com:office:word" xmlns:w="http://schemas.openxmlformats.org/wordprocessingml/2006/main" xmlns:w14="http://schemas.microsoft.com/office/word/2010/wordml" xmlns:w15="http://schemas.microsoft.com/office/word/2012/wordml" xmlns:w16cex="http://schemas.microsoft.com/office/word/2018/wordml/cex" xmlns:w16cid="http://schemas.microsoft.com/office/word/2016/wordml/cid" xmlns:w16="http://schemas.microsoft.com/office/word/2018/wordml" xmlns:w16du="http://schemas.microsoft.com/office/word/2023/wordml/word16du" xmlns:w16sdtdh="http://schemas.microsoft.com/office/word/2020/wordml/sdtdatahash" xmlns:w16se="http://schemas.microsoft.com/office/word/2015/wordml/symex" xmlns:wpg="http://schemas.microsoft.com/office/word/2010/wordprocessingGroup" xmlns:wpi="http://schemas.microsoft.com/office/word/2010/wordprocessingInk" xmlns:wne="http://schemas.microsoft.com/office/word/2006/wordml" xmlns:wps="http://schemas.microsoft.com/office/word/2010/wordprocessingShape" mc:Ignorable="w14 w15 w16se w16cid w16 w16cex w16sdtdh w16du wp14">
+<w:document xmlns:wpc="http://schemas.microsoft.com/office/word/2010/wordprocessingCanvas" xmlns:cx="http://schemas.microsoft.com/office/drawing/2014/chartex" xmlns:cx1="http://schemas.microsoft.com/office/drawing/2015/9/8/chartex" xmlns:cx2="http://schemas.microsoft.com/office/drawing/2015/10/21/chartex" xmlns:cx3="http://schemas.microsoft.com/office/drawing/2016/5/9/chartex" xmlns:cx4="http://schemas.microsoft.com/office/drawing/2016/5/10/chartex" xmlns:cx5="http://schemas.microsoft.com/office/drawing/2016/5/11/chartex" xmlns:cx6="http://schemas.microsoft.com/office/drawing/2016/5/12/chartex" xmlns:cx7="http://schemas.microsoft.com/office/drawing/2016/5/13/chartex" xmlns:cx8="http://schemas.microsoft.com/office/drawing/2016/5/14/chartex" xmlns:mc="http://schemas.openxmlformats.org/markup-compatibility/2006" xmlns:aink="http://schemas.microsoft.com/office/drawing/2016/ink" xmlns:am3d="http://schemas.microsoft.com/office/drawing/2017/model3d" xmlns:o="urn:schemas-microsoft-com:office:office" xmlns:oel="http://schemas.microsoft.com/office/2019/extlst" xmlns:r="http://schemas.openxmlformats.org/officeDocument/2006/relationships" xmlns:m="http://schemas.openxmlformats.org/officeDocument/2006/math" xmlns:v="urn:schemas-microsoft-com:vml" xmlns:wp14="http://schemas.microsoft.com/office/word/2010/wordprocessingDrawing" xmlns:wp="http://schemas.openxmlformats.org/drawingml/2006/wordprocessingDrawing" xmlns:w10="urn:schemas-microsoft-com:office:word" xmlns:w="http://schemas.openxmlformats.org/wordprocessingml/2006/main" xmlns:w14="http://schemas.microsoft.com/office/word/2010/wordml" xmlns:w15="http://schemas.microsoft.com/office/word/2012/wordml" xmlns:w16cex="http://schemas.microsoft.com/office/word/2018/wordml/cex" xmlns:w16cid="http://schemas.microsoft.com/office/word/2016/wordml/cid" xmlns:w16="http://schemas.microsoft.com/office/word/2018/wordml" xmlns:w16du="http://schemas.microsoft.com/office/word/2023/wordml/word16du" xmlns:w16sdtdh="http://schemas.microsoft.com/office/word/2020/wordml/sdtdatahash" xmlns:w16sdtfl="http://schemas.microsoft.com/office/word/2024/wordml/sdtformatlock" xmlns:w16se="http://schemas.microsoft.com/office/word/2015/wordml/symex" xmlns:wpg="http://schemas.microsoft.com/office/word/2010/wordprocessingGroup" xmlns:wpi="http://schemas.microsoft.com/office/word/2010/wordprocessingInk" xmlns:wne="http://schemas.microsoft.com/office/word/2006/wordml" xmlns:wps="http://schemas.microsoft.com/office/word/2010/wordprocessingShape" mc:Ignorable="w14 w15 w16se w16cid w16 w16cex w16sdtdh w16sdtfl w16du wp14">
   <w:body>
     <w:p>
       <w:pPr>
-        <w:pStyle w:val="Titolo1"/>
+        <w:pStyle w:val="Heading1"/>
         <w:spacing w:before="274" w:line="389" w:lineRule="exact"/>
         <w:ind w:right="719"/>
         <w:jc w:val="center"/>
@@ -62,12 +62,12 @@
     </w:p>
     <w:p>
       <w:pPr>
-        <w:pStyle w:val="Corpotesto"/>
+        <w:pStyle w:val="BodyText"/>
       </w:pPr>
     </w:p>
     <w:p>
       <w:pPr>
-        <w:pStyle w:val="Corpotesto"/>
+        <w:pStyle w:val="BodyText"/>
         <w:spacing w:line="276" w:lineRule="auto"/>
       </w:pPr>
       <w:r>
@@ -76,7 +76,7 @@
     </w:p>
     <w:p>
       <w:pPr>
-        <w:pStyle w:val="Corpotesto"/>
+        <w:pStyle w:val="BodyText"/>
         <w:spacing w:line="276" w:lineRule="auto"/>
       </w:pPr>
       <w:r>
@@ -85,13 +85,13 @@
     </w:p>
     <w:p>
       <w:pPr>
-        <w:pStyle w:val="Corpotesto"/>
+        <w:pStyle w:val="BodyText"/>
         <w:spacing w:line="276" w:lineRule="auto"/>
       </w:pPr>
     </w:p>
     <w:tbl>
       <w:tblPr>
-        <w:tblStyle w:val="TableNormal"/>
+        <w:tblStyle w:val="TableNormal1"/>
         <w:tblW w:w="10183" w:type="dxa"/>
         <w:tblInd w:w="364" w:type="dxa"/>
         <w:tblLayout w:type="fixed"/>
@@ -1482,7 +1482,7 @@
     </w:p>
     <w:p>
       <w:pPr>
-        <w:pStyle w:val="Titolo1"/>
+        <w:pStyle w:val="Heading1"/>
         <w:spacing w:before="0"/>
         <w:ind w:left="647"/>
       </w:pPr>
@@ -1559,7 +1559,7 @@
     </w:p>
     <w:p>
       <w:pPr>
-        <w:pStyle w:val="Corpotesto"/>
+        <w:pStyle w:val="BodyText"/>
         <w:spacing w:before="23"/>
         <w:rPr>
           <w:b/>
@@ -1568,7 +1568,7 @@
     </w:p>
     <w:p>
       <w:pPr>
-        <w:pStyle w:val="Corpotesto"/>
+        <w:pStyle w:val="BodyText"/>
         <w:spacing w:before="23"/>
         <w:rPr>
           <w:b/>
@@ -1577,7 +1577,7 @@
     </w:p>
     <w:tbl>
       <w:tblPr>
-        <w:tblStyle w:val="TableNormal"/>
+        <w:tblStyle w:val="TableNormal1"/>
         <w:tblW w:w="10701" w:type="dxa"/>
         <w:tblInd w:w="180" w:type="dxa"/>
         <w:tblLayout w:type="fixed"/>
@@ -2002,25 +2002,7 @@
                 <w:sz w:val="18"/>
                 <w:szCs w:val="18"/>
               </w:rPr>
-              <w:t>&lt;</w:t>
-            </w:r>
-            <w:proofErr w:type="spellStart"/>
-            <w:r>
-              <w:rPr>
-                <w:spacing w:val="-2"/>
-                <w:sz w:val="18"/>
-                <w:szCs w:val="18"/>
-              </w:rPr>
-              <w:t>pesce_consigliati</w:t>
-            </w:r>
-            <w:proofErr w:type="spellEnd"/>
-            <w:r>
-              <w:rPr>
-                <w:spacing w:val="-2"/>
-                <w:sz w:val="18"/>
-                <w:szCs w:val="18"/>
-              </w:rPr>
-              <w:t>&gt;</w:t>
+              <w:t>&lt;pesce_consigliati&gt;</w:t>
             </w:r>
           </w:p>
         </w:tc>
@@ -2067,25 +2049,7 @@
                 <w:sz w:val="18"/>
                 <w:szCs w:val="18"/>
               </w:rPr>
-              <w:t>&lt;</w:t>
-            </w:r>
-            <w:proofErr w:type="spellStart"/>
-            <w:r>
-              <w:rPr>
-                <w:spacing w:val="-2"/>
-                <w:sz w:val="18"/>
-                <w:szCs w:val="18"/>
-              </w:rPr>
-              <w:t>pesce_tollerati</w:t>
-            </w:r>
-            <w:proofErr w:type="spellEnd"/>
-            <w:r>
-              <w:rPr>
-                <w:spacing w:val="-2"/>
-                <w:sz w:val="18"/>
-                <w:szCs w:val="18"/>
-              </w:rPr>
-              <w:t>&gt;</w:t>
+              <w:t>&lt;pesce_tollerati&gt;</w:t>
             </w:r>
           </w:p>
         </w:tc>
@@ -2132,25 +2096,7 @@
                 <w:sz w:val="18"/>
                 <w:szCs w:val="18"/>
               </w:rPr>
-              <w:t>&lt;</w:t>
-            </w:r>
-            <w:proofErr w:type="spellStart"/>
-            <w:r>
-              <w:rPr>
-                <w:spacing w:val="-2"/>
-                <w:sz w:val="18"/>
-                <w:szCs w:val="18"/>
-              </w:rPr>
-              <w:t>pesce_sconsigliati</w:t>
-            </w:r>
-            <w:proofErr w:type="spellEnd"/>
-            <w:r>
-              <w:rPr>
-                <w:spacing w:val="-2"/>
-                <w:sz w:val="18"/>
-                <w:szCs w:val="18"/>
-              </w:rPr>
-              <w:t>&gt;</w:t>
+              <w:t>&lt;pesce_sconsigliati&gt;</w:t>
             </w:r>
           </w:p>
         </w:tc>
@@ -2422,23 +2368,7 @@
                 <w:sz w:val="18"/>
                 <w:szCs w:val="18"/>
               </w:rPr>
-              <w:t>&lt;</w:t>
-            </w:r>
-            <w:proofErr w:type="spellStart"/>
-            <w:r>
-              <w:rPr>
-                <w:sz w:val="18"/>
-                <w:szCs w:val="18"/>
-              </w:rPr>
-              <w:t>carne_consigliati</w:t>
-            </w:r>
-            <w:proofErr w:type="spellEnd"/>
-            <w:r>
-              <w:rPr>
-                <w:sz w:val="18"/>
-                <w:szCs w:val="18"/>
-              </w:rPr>
-              <w:t>&gt;</w:t>
+              <w:t>&lt;carne_consigliati&gt;</w:t>
             </w:r>
           </w:p>
         </w:tc>
@@ -2486,25 +2416,7 @@
                 <w:sz w:val="18"/>
                 <w:szCs w:val="18"/>
               </w:rPr>
-              <w:t>&lt;</w:t>
-            </w:r>
-            <w:proofErr w:type="spellStart"/>
-            <w:r>
-              <w:rPr>
-                <w:spacing w:val="-4"/>
-                <w:sz w:val="18"/>
-                <w:szCs w:val="18"/>
-              </w:rPr>
-              <w:t>carne_tollerati</w:t>
-            </w:r>
-            <w:proofErr w:type="spellEnd"/>
-            <w:r>
-              <w:rPr>
-                <w:spacing w:val="-4"/>
-                <w:sz w:val="18"/>
-                <w:szCs w:val="18"/>
-              </w:rPr>
-              <w:t>&gt;</w:t>
+              <w:t>&lt;carne_tollerati&gt;</w:t>
             </w:r>
           </w:p>
         </w:tc>
@@ -2552,25 +2464,7 @@
                 <w:sz w:val="18"/>
                 <w:szCs w:val="18"/>
               </w:rPr>
-              <w:t>&lt;</w:t>
-            </w:r>
-            <w:proofErr w:type="spellStart"/>
-            <w:r>
-              <w:rPr>
-                <w:spacing w:val="-2"/>
-                <w:sz w:val="18"/>
-                <w:szCs w:val="18"/>
-              </w:rPr>
-              <w:t>carne_sconsigliati</w:t>
-            </w:r>
-            <w:proofErr w:type="spellEnd"/>
-            <w:r>
-              <w:rPr>
-                <w:spacing w:val="-2"/>
-                <w:sz w:val="18"/>
-                <w:szCs w:val="18"/>
-              </w:rPr>
-              <w:t>&gt;</w:t>
+              <w:t>&lt;carne_sconsigliati&gt;</w:t>
             </w:r>
           </w:p>
         </w:tc>
@@ -2912,23 +2806,7 @@
                 <w:sz w:val="18"/>
                 <w:szCs w:val="18"/>
               </w:rPr>
-              <w:t>&lt;</w:t>
-            </w:r>
-            <w:proofErr w:type="spellStart"/>
-            <w:r>
-              <w:rPr>
-                <w:sz w:val="18"/>
-                <w:szCs w:val="18"/>
-              </w:rPr>
-              <w:t>veg_consigliati</w:t>
-            </w:r>
-            <w:proofErr w:type="spellEnd"/>
-            <w:r>
-              <w:rPr>
-                <w:sz w:val="18"/>
-                <w:szCs w:val="18"/>
-              </w:rPr>
-              <w:t>&gt;</w:t>
+              <w:t>&lt;veg_consigliati&gt;</w:t>
             </w:r>
           </w:p>
         </w:tc>
@@ -2976,25 +2854,7 @@
                 <w:sz w:val="18"/>
                 <w:szCs w:val="18"/>
               </w:rPr>
-              <w:t>&lt;</w:t>
-            </w:r>
-            <w:proofErr w:type="spellStart"/>
-            <w:r>
-              <w:rPr>
-                <w:spacing w:val="-4"/>
-                <w:sz w:val="18"/>
-                <w:szCs w:val="18"/>
-              </w:rPr>
-              <w:t>veg_tollerati</w:t>
-            </w:r>
-            <w:proofErr w:type="spellEnd"/>
-            <w:r>
-              <w:rPr>
-                <w:spacing w:val="-4"/>
-                <w:sz w:val="18"/>
-                <w:szCs w:val="18"/>
-              </w:rPr>
-              <w:t>&gt;</w:t>
+              <w:t>&lt;veg_tollerati&gt;</w:t>
             </w:r>
           </w:p>
         </w:tc>
@@ -3042,25 +2902,7 @@
                 <w:sz w:val="18"/>
                 <w:szCs w:val="18"/>
               </w:rPr>
-              <w:t>&lt;</w:t>
-            </w:r>
-            <w:proofErr w:type="spellStart"/>
-            <w:r>
-              <w:rPr>
-                <w:spacing w:val="-2"/>
-                <w:sz w:val="18"/>
-                <w:szCs w:val="18"/>
-              </w:rPr>
-              <w:t>veg_sconsigliati</w:t>
-            </w:r>
-            <w:proofErr w:type="spellEnd"/>
-            <w:r>
-              <w:rPr>
-                <w:spacing w:val="-2"/>
-                <w:sz w:val="18"/>
-                <w:szCs w:val="18"/>
-              </w:rPr>
-              <w:t>&gt;</w:t>
+              <w:t>&lt;veg_sconsigliati&gt;</w:t>
             </w:r>
           </w:p>
         </w:tc>
@@ -3085,7 +2927,7 @@
     </w:p>
     <w:p>
       <w:pPr>
-        <w:pStyle w:val="Corpotesto"/>
+        <w:pStyle w:val="BodyText"/>
         <w:spacing w:before="20"/>
         <w:rPr>
           <w:b/>
@@ -3094,7 +2936,7 @@
     </w:p>
     <w:p>
       <w:pPr>
-        <w:pStyle w:val="Corpotesto"/>
+        <w:pStyle w:val="BodyText"/>
         <w:spacing w:before="20"/>
         <w:rPr>
           <w:b/>
@@ -3103,7 +2945,7 @@
     </w:p>
     <w:tbl>
       <w:tblPr>
-        <w:tblStyle w:val="TableNormal"/>
+        <w:tblStyle w:val="TableNormal1"/>
         <w:tblW w:w="10701" w:type="dxa"/>
         <w:tblInd w:w="180" w:type="dxa"/>
         <w:tblLayout w:type="fixed"/>
@@ -3907,23 +3749,7 @@
                 <w:sz w:val="18"/>
                 <w:szCs w:val="18"/>
               </w:rPr>
-              <w:t>&lt;</w:t>
-            </w:r>
-            <w:proofErr w:type="spellStart"/>
-            <w:r>
-              <w:rPr>
-                <w:sz w:val="18"/>
-                <w:szCs w:val="18"/>
-              </w:rPr>
-              <w:t>latt_consigliati</w:t>
-            </w:r>
-            <w:proofErr w:type="spellEnd"/>
-            <w:r>
-              <w:rPr>
-                <w:sz w:val="18"/>
-                <w:szCs w:val="18"/>
-              </w:rPr>
-              <w:t>&gt;</w:t>
+              <w:t>&lt;latt_consigliati&gt;</w:t>
             </w:r>
           </w:p>
         </w:tc>
@@ -3968,23 +3794,7 @@
                 <w:sz w:val="18"/>
                 <w:szCs w:val="18"/>
               </w:rPr>
-              <w:t>&lt;</w:t>
-            </w:r>
-            <w:proofErr w:type="spellStart"/>
-            <w:r>
-              <w:rPr>
-                <w:sz w:val="18"/>
-                <w:szCs w:val="18"/>
-              </w:rPr>
-              <w:t>latt_tollerati</w:t>
-            </w:r>
-            <w:proofErr w:type="spellEnd"/>
-            <w:r>
-              <w:rPr>
-                <w:sz w:val="18"/>
-                <w:szCs w:val="18"/>
-              </w:rPr>
-              <w:t>&gt;</w:t>
+              <w:t>&lt;latt_tollerati&gt;</w:t>
             </w:r>
           </w:p>
         </w:tc>
@@ -4029,23 +3839,7 @@
                 <w:sz w:val="18"/>
                 <w:szCs w:val="18"/>
               </w:rPr>
-              <w:t>&lt;</w:t>
-            </w:r>
-            <w:proofErr w:type="spellStart"/>
-            <w:r>
-              <w:rPr>
-                <w:sz w:val="18"/>
-                <w:szCs w:val="18"/>
-              </w:rPr>
-              <w:t>latt_sconsigliati</w:t>
-            </w:r>
-            <w:proofErr w:type="spellEnd"/>
-            <w:r>
-              <w:rPr>
-                <w:sz w:val="18"/>
-                <w:szCs w:val="18"/>
-              </w:rPr>
-              <w:t>&gt;</w:t>
+              <w:t>&lt;latt_sconsigliati&gt;</w:t>
             </w:r>
           </w:p>
         </w:tc>
@@ -4487,23 +4281,7 @@
                 <w:sz w:val="18"/>
                 <w:szCs w:val="18"/>
               </w:rPr>
-              <w:t>&lt;</w:t>
-            </w:r>
-            <w:proofErr w:type="spellStart"/>
-            <w:r>
-              <w:rPr>
-                <w:sz w:val="18"/>
-                <w:szCs w:val="18"/>
-              </w:rPr>
-              <w:t>legumi_consigliati</w:t>
-            </w:r>
-            <w:proofErr w:type="spellEnd"/>
-            <w:r>
-              <w:rPr>
-                <w:sz w:val="18"/>
-                <w:szCs w:val="18"/>
-              </w:rPr>
-              <w:t>&gt;</w:t>
+              <w:t>&lt;legumi_consigliati&gt;</w:t>
             </w:r>
           </w:p>
         </w:tc>
@@ -4550,23 +4328,7 @@
                 <w:sz w:val="18"/>
                 <w:szCs w:val="18"/>
               </w:rPr>
-              <w:t>&lt;</w:t>
-            </w:r>
-            <w:proofErr w:type="spellStart"/>
-            <w:r>
-              <w:rPr>
-                <w:sz w:val="18"/>
-                <w:szCs w:val="18"/>
-              </w:rPr>
-              <w:t>legumi_tollerati</w:t>
-            </w:r>
-            <w:proofErr w:type="spellEnd"/>
-            <w:r>
-              <w:rPr>
-                <w:sz w:val="18"/>
-                <w:szCs w:val="18"/>
-              </w:rPr>
-              <w:t>&gt;</w:t>
+              <w:t>&lt;legumi_tollerati&gt;</w:t>
             </w:r>
           </w:p>
         </w:tc>
@@ -4613,23 +4375,7 @@
                 <w:sz w:val="18"/>
                 <w:szCs w:val="18"/>
               </w:rPr>
-              <w:t>&lt;</w:t>
-            </w:r>
-            <w:proofErr w:type="spellStart"/>
-            <w:r>
-              <w:rPr>
-                <w:sz w:val="18"/>
-                <w:szCs w:val="18"/>
-              </w:rPr>
-              <w:t>legumi_sconsigliati</w:t>
-            </w:r>
-            <w:proofErr w:type="spellEnd"/>
-            <w:r>
-              <w:rPr>
-                <w:sz w:val="18"/>
-                <w:szCs w:val="18"/>
-              </w:rPr>
-              <w:t>&gt;</w:t>
+              <w:t>&lt;legumi_sconsigliati&gt;</w:t>
             </w:r>
           </w:p>
         </w:tc>
@@ -4983,25 +4729,7 @@
                 <w:sz w:val="18"/>
                 <w:szCs w:val="18"/>
               </w:rPr>
-              <w:t>&lt;</w:t>
-            </w:r>
-            <w:proofErr w:type="spellStart"/>
-            <w:r>
-              <w:rPr>
-                <w:spacing w:val="-2"/>
-                <w:sz w:val="18"/>
-                <w:szCs w:val="18"/>
-              </w:rPr>
-              <w:t>uova_consigliati</w:t>
-            </w:r>
-            <w:proofErr w:type="spellEnd"/>
-            <w:r>
-              <w:rPr>
-                <w:spacing w:val="-2"/>
-                <w:sz w:val="18"/>
-                <w:szCs w:val="18"/>
-              </w:rPr>
-              <w:t>&gt;</w:t>
+              <w:t>&lt;uova_consigliati&gt;</w:t>
             </w:r>
           </w:p>
         </w:tc>
@@ -5048,25 +4776,7 @@
                 <w:sz w:val="18"/>
                 <w:szCs w:val="18"/>
               </w:rPr>
-              <w:t>&lt;</w:t>
-            </w:r>
-            <w:proofErr w:type="spellStart"/>
-            <w:r>
-              <w:rPr>
-                <w:spacing w:val="-2"/>
-                <w:sz w:val="18"/>
-                <w:szCs w:val="18"/>
-              </w:rPr>
-              <w:t>uova_tollerati</w:t>
-            </w:r>
-            <w:proofErr w:type="spellEnd"/>
-            <w:r>
-              <w:rPr>
-                <w:spacing w:val="-2"/>
-                <w:sz w:val="18"/>
-                <w:szCs w:val="18"/>
-              </w:rPr>
-              <w:t>&gt;</w:t>
+              <w:t>&lt;uova_tollerati&gt;</w:t>
             </w:r>
           </w:p>
         </w:tc>
@@ -5114,27 +4824,7 @@
                 <w:sz w:val="18"/>
                 <w:szCs w:val="18"/>
               </w:rPr>
-              <w:t>&lt;</w:t>
-            </w:r>
-            <w:proofErr w:type="spellStart"/>
-            <w:r>
-              <w:rPr>
-                <w:rFonts w:eastAsiaTheme="minorHAnsi"/>
-                <w:spacing w:val="-2"/>
-                <w:sz w:val="18"/>
-                <w:szCs w:val="18"/>
-              </w:rPr>
-              <w:t>uova_sconsigliati</w:t>
-            </w:r>
-            <w:proofErr w:type="spellEnd"/>
-            <w:r>
-              <w:rPr>
-                <w:rFonts w:eastAsiaTheme="minorHAnsi"/>
-                <w:spacing w:val="-2"/>
-                <w:sz w:val="18"/>
-                <w:szCs w:val="18"/>
-              </w:rPr>
-              <w:t>&gt;</w:t>
+              <w:t>&lt;uova_sconsigliati&gt;</w:t>
             </w:r>
           </w:p>
         </w:tc>
@@ -5153,7 +4843,7 @@
     </w:p>
     <w:tbl>
       <w:tblPr>
-        <w:tblStyle w:val="TableNormal"/>
+        <w:tblStyle w:val="TableNormal1"/>
         <w:tblW w:w="10769" w:type="dxa"/>
         <w:tblInd w:w="117" w:type="dxa"/>
         <w:tblLayout w:type="fixed"/>
@@ -5758,23 +5448,7 @@
                 <w:sz w:val="18"/>
                 <w:szCs w:val="18"/>
               </w:rPr>
-              <w:t>&lt;</w:t>
-            </w:r>
-            <w:proofErr w:type="spellStart"/>
-            <w:r>
-              <w:rPr>
-                <w:sz w:val="18"/>
-                <w:szCs w:val="18"/>
-              </w:rPr>
-              <w:t>cereali_consigliati</w:t>
-            </w:r>
-            <w:proofErr w:type="spellEnd"/>
-            <w:r>
-              <w:rPr>
-                <w:sz w:val="18"/>
-                <w:szCs w:val="18"/>
-              </w:rPr>
-              <w:t>&gt;</w:t>
+              <w:t>&lt;cereali_consigliati&gt;</w:t>
             </w:r>
           </w:p>
         </w:tc>
@@ -5821,25 +5495,7 @@
                 <w:sz w:val="18"/>
                 <w:szCs w:val="18"/>
               </w:rPr>
-              <w:t>&lt;</w:t>
-            </w:r>
-            <w:proofErr w:type="spellStart"/>
-            <w:r>
-              <w:rPr>
-                <w:spacing w:val="-4"/>
-                <w:sz w:val="18"/>
-                <w:szCs w:val="18"/>
-              </w:rPr>
-              <w:t>cereali_tollerati</w:t>
-            </w:r>
-            <w:proofErr w:type="spellEnd"/>
-            <w:r>
-              <w:rPr>
-                <w:spacing w:val="-4"/>
-                <w:sz w:val="18"/>
-                <w:szCs w:val="18"/>
-              </w:rPr>
-              <w:t>&gt;</w:t>
+              <w:t>&lt;cereali_tollerati&gt;</w:t>
             </w:r>
           </w:p>
         </w:tc>
@@ -5886,25 +5542,7 @@
                 <w:sz w:val="18"/>
                 <w:szCs w:val="18"/>
               </w:rPr>
-              <w:t>&lt;</w:t>
-            </w:r>
-            <w:proofErr w:type="spellStart"/>
-            <w:r>
-              <w:rPr>
-                <w:spacing w:val="-2"/>
-                <w:sz w:val="18"/>
-                <w:szCs w:val="18"/>
-              </w:rPr>
-              <w:t>cereali_sconsigliati</w:t>
-            </w:r>
-            <w:proofErr w:type="spellEnd"/>
-            <w:r>
-              <w:rPr>
-                <w:spacing w:val="-2"/>
-                <w:sz w:val="18"/>
-                <w:szCs w:val="18"/>
-              </w:rPr>
-              <w:t>&gt;</w:t>
+              <w:t>&lt;cereali_sconsigliati&gt;</w:t>
             </w:r>
           </w:p>
         </w:tc>
@@ -6266,23 +5904,7 @@
                 <w:sz w:val="18"/>
                 <w:szCs w:val="18"/>
               </w:rPr>
-              <w:t>&lt;</w:t>
-            </w:r>
-            <w:proofErr w:type="spellStart"/>
-            <w:r>
-              <w:rPr>
-                <w:sz w:val="18"/>
-                <w:szCs w:val="18"/>
-              </w:rPr>
-              <w:t>pseudoc_consigliati</w:t>
-            </w:r>
-            <w:proofErr w:type="spellEnd"/>
-            <w:r>
-              <w:rPr>
-                <w:sz w:val="18"/>
-                <w:szCs w:val="18"/>
-              </w:rPr>
-              <w:t>&gt;</w:t>
+              <w:t>&lt;pseudoc_consigliati&gt;</w:t>
             </w:r>
           </w:p>
         </w:tc>
@@ -6329,25 +5951,7 @@
                 <w:sz w:val="18"/>
                 <w:szCs w:val="18"/>
               </w:rPr>
-              <w:t>&lt;</w:t>
-            </w:r>
-            <w:proofErr w:type="spellStart"/>
-            <w:r>
-              <w:rPr>
-                <w:spacing w:val="-4"/>
-                <w:sz w:val="18"/>
-                <w:szCs w:val="18"/>
-              </w:rPr>
-              <w:t>pseudoc_tollerati</w:t>
-            </w:r>
-            <w:proofErr w:type="spellEnd"/>
-            <w:r>
-              <w:rPr>
-                <w:spacing w:val="-4"/>
-                <w:sz w:val="18"/>
-                <w:szCs w:val="18"/>
-              </w:rPr>
-              <w:t>&gt;</w:t>
+              <w:t>&lt;pseudoc_tollerati&gt;</w:t>
             </w:r>
           </w:p>
         </w:tc>
@@ -6393,23 +5997,7 @@
                 <w:sz w:val="18"/>
                 <w:szCs w:val="18"/>
               </w:rPr>
-              <w:t>&lt;</w:t>
-            </w:r>
-            <w:proofErr w:type="spellStart"/>
-            <w:r>
-              <w:rPr>
-                <w:sz w:val="18"/>
-                <w:szCs w:val="18"/>
-              </w:rPr>
-              <w:t>pseudoc_sconsigliati</w:t>
-            </w:r>
-            <w:proofErr w:type="spellEnd"/>
-            <w:r>
-              <w:rPr>
-                <w:sz w:val="18"/>
-                <w:szCs w:val="18"/>
-              </w:rPr>
-              <w:t>&gt;</w:t>
+              <w:t>&lt;pseudoc_sconsigliati&gt;</w:t>
             </w:r>
           </w:p>
         </w:tc>
@@ -6728,23 +6316,7 @@
                 <w:sz w:val="18"/>
                 <w:szCs w:val="18"/>
               </w:rPr>
-              <w:t>&lt;</w:t>
-            </w:r>
-            <w:proofErr w:type="spellStart"/>
-            <w:r>
-              <w:rPr>
-                <w:sz w:val="18"/>
-                <w:szCs w:val="18"/>
-              </w:rPr>
-              <w:t>frutta_consigliati</w:t>
-            </w:r>
-            <w:proofErr w:type="spellEnd"/>
-            <w:r>
-              <w:rPr>
-                <w:sz w:val="18"/>
-                <w:szCs w:val="18"/>
-              </w:rPr>
-              <w:t>&gt;</w:t>
+              <w:t>&lt;frutta_consigliati&gt;</w:t>
             </w:r>
           </w:p>
         </w:tc>
@@ -6790,23 +6362,7 @@
                 <w:sz w:val="18"/>
                 <w:szCs w:val="18"/>
               </w:rPr>
-              <w:t>&lt;</w:t>
-            </w:r>
-            <w:proofErr w:type="spellStart"/>
-            <w:r>
-              <w:rPr>
-                <w:sz w:val="18"/>
-                <w:szCs w:val="18"/>
-              </w:rPr>
-              <w:t>frutta_tollerati</w:t>
-            </w:r>
-            <w:proofErr w:type="spellEnd"/>
-            <w:r>
-              <w:rPr>
-                <w:sz w:val="18"/>
-                <w:szCs w:val="18"/>
-              </w:rPr>
-              <w:t>&gt;</w:t>
+              <w:t>&lt;frutta_tollerati&gt;</w:t>
             </w:r>
           </w:p>
         </w:tc>
@@ -6852,23 +6408,7 @@
                 <w:sz w:val="18"/>
                 <w:szCs w:val="18"/>
               </w:rPr>
-              <w:t>&lt;</w:t>
-            </w:r>
-            <w:proofErr w:type="spellStart"/>
-            <w:r>
-              <w:rPr>
-                <w:sz w:val="18"/>
-                <w:szCs w:val="18"/>
-              </w:rPr>
-              <w:t>frutta_sconsigliati</w:t>
-            </w:r>
-            <w:proofErr w:type="spellEnd"/>
-            <w:r>
-              <w:rPr>
-                <w:sz w:val="18"/>
-                <w:szCs w:val="18"/>
-              </w:rPr>
-              <w:t>&gt;</w:t>
+              <w:t>&lt;frutta_sconsigliati&gt;</w:t>
             </w:r>
           </w:p>
         </w:tc>
@@ -6876,7 +6416,7 @@
     </w:tbl>
     <w:p>
       <w:pPr>
-        <w:pStyle w:val="Corpotesto"/>
+        <w:pStyle w:val="BodyText"/>
         <w:spacing w:before="197"/>
         <w:rPr>
           <w:b/>
@@ -6888,17 +6428,17 @@
     </w:p>
     <w:p>
       <w:pPr>
-        <w:pStyle w:val="Corpotesto"/>
+        <w:pStyle w:val="BodyText"/>
       </w:pPr>
     </w:p>
     <w:p>
       <w:pPr>
-        <w:pStyle w:val="Corpotesto"/>
+        <w:pStyle w:val="BodyText"/>
       </w:pPr>
     </w:p>
     <w:tbl>
       <w:tblPr>
-        <w:tblStyle w:val="TableNormal"/>
+        <w:tblStyle w:val="TableNormal1"/>
         <w:tblW w:w="10773" w:type="dxa"/>
         <w:tblInd w:w="117" w:type="dxa"/>
         <w:tblLayout w:type="fixed"/>
@@ -7402,23 +6942,7 @@
                 <w:sz w:val="18"/>
                 <w:szCs w:val="18"/>
               </w:rPr>
-              <w:t>&lt;</w:t>
-            </w:r>
-            <w:proofErr w:type="spellStart"/>
-            <w:r>
-              <w:rPr>
-                <w:sz w:val="18"/>
-                <w:szCs w:val="18"/>
-              </w:rPr>
-              <w:t>grassi_insat_consigliati</w:t>
-            </w:r>
-            <w:proofErr w:type="spellEnd"/>
-            <w:r>
-              <w:rPr>
-                <w:sz w:val="18"/>
-                <w:szCs w:val="18"/>
-              </w:rPr>
-              <w:t>&gt;</w:t>
+              <w:t>&lt;grassi_insat_consigliati&gt;</w:t>
             </w:r>
           </w:p>
         </w:tc>
@@ -7465,25 +6989,7 @@
                 <w:sz w:val="18"/>
                 <w:szCs w:val="18"/>
               </w:rPr>
-              <w:t>&lt;</w:t>
-            </w:r>
-            <w:proofErr w:type="spellStart"/>
-            <w:r>
-              <w:rPr>
-                <w:spacing w:val="-2"/>
-                <w:sz w:val="18"/>
-                <w:szCs w:val="18"/>
-              </w:rPr>
-              <w:t>grassi_insat_tollerati</w:t>
-            </w:r>
-            <w:proofErr w:type="spellEnd"/>
-            <w:r>
-              <w:rPr>
-                <w:spacing w:val="-2"/>
-                <w:sz w:val="18"/>
-                <w:szCs w:val="18"/>
-              </w:rPr>
-              <w:t>&gt;</w:t>
+              <w:t>&lt;grassi_insat_tollerati&gt;</w:t>
             </w:r>
           </w:p>
         </w:tc>
@@ -7531,27 +7037,7 @@
                 <w:sz w:val="18"/>
                 <w:szCs w:val="18"/>
               </w:rPr>
-              <w:t>&lt;</w:t>
-            </w:r>
-            <w:proofErr w:type="spellStart"/>
-            <w:r>
-              <w:rPr>
-                <w:rFonts w:eastAsiaTheme="minorHAnsi"/>
-                <w:spacing w:val="-2"/>
-                <w:sz w:val="18"/>
-                <w:szCs w:val="18"/>
-              </w:rPr>
-              <w:t>grassi_insat_sconsigliati</w:t>
-            </w:r>
-            <w:proofErr w:type="spellEnd"/>
-            <w:r>
-              <w:rPr>
-                <w:rFonts w:eastAsiaTheme="minorHAnsi"/>
-                <w:spacing w:val="-2"/>
-                <w:sz w:val="18"/>
-                <w:szCs w:val="18"/>
-              </w:rPr>
-              <w:t>&gt;</w:t>
+              <w:t>&lt;grassi_insat_sconsigliati&gt;</w:t>
             </w:r>
           </w:p>
         </w:tc>
@@ -7861,25 +7347,7 @@
                 <w:sz w:val="18"/>
                 <w:szCs w:val="18"/>
               </w:rPr>
-              <w:t>&lt;</w:t>
-            </w:r>
-            <w:proofErr w:type="spellStart"/>
-            <w:r>
-              <w:rPr>
-                <w:rFonts w:eastAsiaTheme="minorHAnsi"/>
-                <w:sz w:val="18"/>
-                <w:szCs w:val="18"/>
-              </w:rPr>
-              <w:t>grassi_sat_consigliati</w:t>
-            </w:r>
-            <w:proofErr w:type="spellEnd"/>
-            <w:r>
-              <w:rPr>
-                <w:rFonts w:eastAsiaTheme="minorHAnsi"/>
-                <w:sz w:val="18"/>
-                <w:szCs w:val="18"/>
-              </w:rPr>
-              <w:t>&gt;</w:t>
+              <w:t>&lt;grassi_sat_consigliati&gt;</w:t>
             </w:r>
           </w:p>
         </w:tc>
@@ -7926,25 +7394,7 @@
                 <w:sz w:val="18"/>
                 <w:szCs w:val="18"/>
               </w:rPr>
-              <w:t>&lt;</w:t>
-            </w:r>
-            <w:proofErr w:type="spellStart"/>
-            <w:r>
-              <w:rPr>
-                <w:rFonts w:eastAsiaTheme="minorHAnsi"/>
-                <w:sz w:val="18"/>
-                <w:szCs w:val="18"/>
-              </w:rPr>
-              <w:t>grassi_sat_tollerati</w:t>
-            </w:r>
-            <w:proofErr w:type="spellEnd"/>
-            <w:r>
-              <w:rPr>
-                <w:rFonts w:eastAsiaTheme="minorHAnsi"/>
-                <w:sz w:val="18"/>
-                <w:szCs w:val="18"/>
-              </w:rPr>
-              <w:t>&gt;</w:t>
+              <w:t>&lt;grassi_sat_tollerati&gt;</w:t>
             </w:r>
           </w:p>
         </w:tc>
@@ -7991,25 +7441,7 @@
                 <w:sz w:val="18"/>
                 <w:szCs w:val="18"/>
               </w:rPr>
-              <w:t>&lt;</w:t>
-            </w:r>
-            <w:proofErr w:type="spellStart"/>
-            <w:r>
-              <w:rPr>
-                <w:rFonts w:eastAsiaTheme="minorHAnsi"/>
-                <w:sz w:val="18"/>
-                <w:szCs w:val="18"/>
-              </w:rPr>
-              <w:t>grassi_sat_sconsigliati</w:t>
-            </w:r>
-            <w:proofErr w:type="spellEnd"/>
-            <w:r>
-              <w:rPr>
-                <w:rFonts w:eastAsiaTheme="minorHAnsi"/>
-                <w:sz w:val="18"/>
-                <w:szCs w:val="18"/>
-              </w:rPr>
-              <w:t>&gt;</w:t>
+              <w:t>&lt;grassi_sat_sconsigliati&gt;</w:t>
             </w:r>
           </w:p>
         </w:tc>
@@ -8017,7 +7449,7 @@
     </w:tbl>
     <w:p>
       <w:pPr>
-        <w:pStyle w:val="Corpotesto"/>
+        <w:pStyle w:val="BodyText"/>
         <w:spacing w:before="91"/>
         <w:ind w:left="239" w:right="393"/>
         <w:rPr>
@@ -8417,7 +7849,7 @@
     </w:p>
     <w:p>
       <w:pPr>
-        <w:pStyle w:val="Corpotesto"/>
+        <w:pStyle w:val="BodyText"/>
         <w:spacing w:before="280" w:line="276" w:lineRule="auto"/>
         <w:ind w:left="239" w:right="338"/>
       </w:pPr>
@@ -8430,7 +7862,7 @@
     </w:p>
     <w:p>
       <w:pPr>
-        <w:pStyle w:val="Corpotesto"/>
+        <w:pStyle w:val="BodyText"/>
         <w:spacing w:before="280"/>
         <w:ind w:left="239" w:right="338"/>
         <w:jc w:val="both"/>
@@ -8449,7 +7881,7 @@
     </w:p>
     <w:p>
       <w:pPr>
-        <w:pStyle w:val="Corpotesto"/>
+        <w:pStyle w:val="BodyText"/>
         <w:spacing w:before="280" w:line="276" w:lineRule="auto"/>
         <w:ind w:left="239" w:right="338"/>
       </w:pPr>
@@ -8462,9 +7894,12 @@
     </w:p>
     <w:p>
       <w:pPr>
-        <w:pStyle w:val="Corpotesto"/>
+        <w:pStyle w:val="BodyText"/>
         <w:spacing w:before="280" w:line="276" w:lineRule="auto"/>
         <w:ind w:left="239" w:right="338"/>
+        <w:rPr>
+          <w:color w:val="000000"/>
+        </w:rPr>
       </w:pPr>
       <w:r>
         <w:rPr>
@@ -8481,6 +7916,888 @@
         </w:rPr>
         <w:t>: Si raccomanda di verificare mediante analisi cliniche la reale necessità di integrazione e di consultare un professionista sanitario prima di iniziare l’assunzione, soprattutto in presenza di altri farmaci o condizioni mediche preesistenti.</w:t>
       </w:r>
+    </w:p>
+    <w:p>
+      <w:pPr>
+        <w:widowControl/>
+        <w:rPr>
+          <w:rFonts w:ascii="Calibri" w:eastAsia="Calibri" w:hAnsi="Calibri"/>
+          <w:color w:val="000000"/>
+          <w:sz w:val="20"/>
+          <w:szCs w:val="20"/>
+        </w:rPr>
+      </w:pPr>
+      <w:r>
+        <w:rPr>
+          <w:color w:val="000000"/>
+        </w:rPr>
+        <w:br w:type="page"/>
+      </w:r>
+    </w:p>
+    <w:p>
+      <w:pPr>
+        <w:spacing w:before="267"/>
+        <w:ind w:firstLine="239"/>
+        <w:rPr>
+          <w:rFonts w:ascii="Cambria" w:hAnsi="Cambria"/>
+          <w:b/>
+          <w:i/>
+          <w:color w:val="FF0000"/>
+          <w:spacing w:val="-2"/>
+          <w:sz w:val="36"/>
+        </w:rPr>
+      </w:pPr>
+      <w:r>
+        <w:rPr>
+          <w:rFonts w:ascii="Cambria" w:hAnsi="Cambria"/>
+          <w:b/>
+          <w:i/>
+          <w:color w:val="FF0000"/>
+          <w:spacing w:val="-2"/>
+          <w:sz w:val="36"/>
+        </w:rPr>
+        <w:lastRenderedPageBreak/>
+        <w:t>ALIMENTI CHE POSSONO INFLUENZARE I FARMACI</w:t>
+      </w:r>
+    </w:p>
+    <w:p>
+      <w:pPr>
+        <w:pStyle w:val="BodyText"/>
+        <w:spacing w:before="280" w:line="276" w:lineRule="auto"/>
+        <w:ind w:left="239" w:right="338"/>
+        <w:rPr>
+          <w:color w:val="000000"/>
+        </w:rPr>
+      </w:pPr>
+      <w:r>
+        <w:rPr>
+          <w:color w:val="000000"/>
+        </w:rPr>
+        <w:t>Alcuni cibi possono modificare l’effetto dei farmaci nel corpo, rendendoli più forti o meno efficaci. Ecco un elenco dei principali alimenti da tenere sotto controllo:</w:t>
+      </w:r>
+      <w:r>
+        <w:rPr>
+          <w:color w:val="000000"/>
+        </w:rPr>
+        <w:br/>
+      </w:r>
+    </w:p>
+    <w:tbl>
+      <w:tblPr>
+        <w:tblStyle w:val="GridTable1Light"/>
+        <w:tblW w:w="10329" w:type="dxa"/>
+        <w:tblInd w:w="392" w:type="dxa"/>
+        <w:tblLook w:val="04A0" w:firstRow="1" w:lastRow="0" w:firstColumn="1" w:lastColumn="0" w:noHBand="0" w:noVBand="1"/>
+      </w:tblPr>
+      <w:tblGrid>
+        <w:gridCol w:w="2425"/>
+        <w:gridCol w:w="4237"/>
+        <w:gridCol w:w="3667"/>
+      </w:tblGrid>
+      <w:tr>
+        <w:trPr>
+          <w:cnfStyle w:val="100000000000" w:firstRow="1" w:lastRow="0" w:firstColumn="0" w:lastColumn="0" w:oddVBand="0" w:evenVBand="0" w:oddHBand="0" w:evenHBand="0" w:firstRowFirstColumn="0" w:firstRowLastColumn="0" w:lastRowFirstColumn="0" w:lastRowLastColumn="0"/>
+          <w:trHeight w:val="351"/>
+        </w:trPr>
+        <w:tc>
+          <w:tcPr>
+            <w:cnfStyle w:val="001000000000" w:firstRow="0" w:lastRow="0" w:firstColumn="1" w:lastColumn="0" w:oddVBand="0" w:evenVBand="0" w:oddHBand="0" w:evenHBand="0" w:firstRowFirstColumn="0" w:firstRowLastColumn="0" w:lastRowFirstColumn="0" w:lastRowLastColumn="0"/>
+            <w:tcW w:w="2425" w:type="dxa"/>
+          </w:tcPr>
+          <w:p>
+            <w:pPr>
+              <w:ind w:left="142"/>
+              <w:jc w:val="center"/>
+              <w:rPr>
+                <w:rFonts w:ascii="Calibri" w:hAnsi="Calibri"/>
+                <w:b w:val="0"/>
+                <w:bCs w:val="0"/>
+                <w:sz w:val="20"/>
+                <w:szCs w:val="20"/>
+              </w:rPr>
+            </w:pPr>
+            <w:r>
+              <w:rPr>
+                <w:rStyle w:val="Strong"/>
+                <w:rFonts w:ascii="Calibri" w:eastAsia="SimSun" w:hAnsi="Calibri"/>
+                <w:b/>
+                <w:bCs/>
+                <w:sz w:val="20"/>
+                <w:szCs w:val="20"/>
+                <w:lang w:val="en-US" w:eastAsia="zh-CN" w:bidi="ar"/>
+              </w:rPr>
+              <w:t>Alimento</w:t>
+            </w:r>
+          </w:p>
+        </w:tc>
+        <w:tc>
+          <w:tcPr>
+            <w:tcW w:w="4237" w:type="dxa"/>
+          </w:tcPr>
+          <w:p>
+            <w:pPr>
+              <w:ind w:left="142"/>
+              <w:jc w:val="center"/>
+              <w:cnfStyle w:val="100000000000" w:firstRow="1" w:lastRow="0" w:firstColumn="0" w:lastColumn="0" w:oddVBand="0" w:evenVBand="0" w:oddHBand="0" w:evenHBand="0" w:firstRowFirstColumn="0" w:firstRowLastColumn="0" w:lastRowFirstColumn="0" w:lastRowLastColumn="0"/>
+              <w:rPr>
+                <w:rFonts w:ascii="Calibri" w:hAnsi="Calibri"/>
+                <w:b w:val="0"/>
+                <w:bCs w:val="0"/>
+                <w:sz w:val="20"/>
+                <w:szCs w:val="20"/>
+              </w:rPr>
+            </w:pPr>
+            <w:proofErr w:type="spellStart"/>
+            <w:r>
+              <w:rPr>
+                <w:rStyle w:val="Strong"/>
+                <w:rFonts w:ascii="Calibri" w:eastAsia="SimSun" w:hAnsi="Calibri"/>
+                <w:b/>
+                <w:bCs/>
+                <w:sz w:val="20"/>
+                <w:szCs w:val="20"/>
+                <w:lang w:val="en-US" w:eastAsia="zh-CN" w:bidi="ar"/>
+              </w:rPr>
+              <w:t>Effetto</w:t>
+            </w:r>
+            <w:proofErr w:type="spellEnd"/>
+            <w:r>
+              <w:rPr>
+                <w:rStyle w:val="Strong"/>
+                <w:rFonts w:ascii="Calibri" w:eastAsia="SimSun" w:hAnsi="Calibri"/>
+                <w:b/>
+                <w:bCs/>
+                <w:sz w:val="20"/>
+                <w:szCs w:val="20"/>
+                <w:lang w:val="en-US" w:eastAsia="zh-CN" w:bidi="ar"/>
+              </w:rPr>
+              <w:t xml:space="preserve"> </w:t>
+            </w:r>
+            <w:proofErr w:type="spellStart"/>
+            <w:r>
+              <w:rPr>
+                <w:rStyle w:val="Strong"/>
+                <w:rFonts w:ascii="Calibri" w:eastAsia="SimSun" w:hAnsi="Calibri"/>
+                <w:b/>
+                <w:bCs/>
+                <w:sz w:val="20"/>
+                <w:szCs w:val="20"/>
+                <w:lang w:val="en-US" w:eastAsia="zh-CN" w:bidi="ar"/>
+              </w:rPr>
+              <w:t>sul</w:t>
+            </w:r>
+            <w:proofErr w:type="spellEnd"/>
+            <w:r>
+              <w:rPr>
+                <w:rStyle w:val="Strong"/>
+                <w:rFonts w:ascii="Calibri" w:eastAsia="SimSun" w:hAnsi="Calibri"/>
+                <w:b/>
+                <w:bCs/>
+                <w:sz w:val="20"/>
+                <w:szCs w:val="20"/>
+                <w:lang w:val="en-US" w:eastAsia="zh-CN" w:bidi="ar"/>
+              </w:rPr>
+              <w:t xml:space="preserve"> </w:t>
+            </w:r>
+            <w:proofErr w:type="spellStart"/>
+            <w:r>
+              <w:rPr>
+                <w:rStyle w:val="Strong"/>
+                <w:rFonts w:ascii="Calibri" w:eastAsia="SimSun" w:hAnsi="Calibri"/>
+                <w:b/>
+                <w:bCs/>
+                <w:sz w:val="20"/>
+                <w:szCs w:val="20"/>
+                <w:lang w:val="en-US" w:eastAsia="zh-CN" w:bidi="ar"/>
+              </w:rPr>
+              <w:t>Farmaco</w:t>
+            </w:r>
+            <w:proofErr w:type="spellEnd"/>
+          </w:p>
+        </w:tc>
+        <w:tc>
+          <w:tcPr>
+            <w:tcW w:w="3667" w:type="dxa"/>
+          </w:tcPr>
+          <w:p>
+            <w:pPr>
+              <w:ind w:left="142"/>
+              <w:jc w:val="center"/>
+              <w:cnfStyle w:val="100000000000" w:firstRow="1" w:lastRow="0" w:firstColumn="0" w:lastColumn="0" w:oddVBand="0" w:evenVBand="0" w:oddHBand="0" w:evenHBand="0" w:firstRowFirstColumn="0" w:firstRowLastColumn="0" w:lastRowFirstColumn="0" w:lastRowLastColumn="0"/>
+              <w:rPr>
+                <w:rFonts w:ascii="Calibri" w:hAnsi="Calibri"/>
+                <w:b w:val="0"/>
+                <w:bCs w:val="0"/>
+                <w:sz w:val="20"/>
+                <w:szCs w:val="20"/>
+              </w:rPr>
+            </w:pPr>
+            <w:proofErr w:type="spellStart"/>
+            <w:r>
+              <w:rPr>
+                <w:rStyle w:val="Strong"/>
+                <w:rFonts w:ascii="Calibri" w:eastAsia="SimSun" w:hAnsi="Calibri"/>
+                <w:b/>
+                <w:bCs/>
+                <w:sz w:val="20"/>
+                <w:szCs w:val="20"/>
+                <w:lang w:val="en-US" w:eastAsia="zh-CN" w:bidi="ar"/>
+              </w:rPr>
+              <w:t>Possibili</w:t>
+            </w:r>
+            <w:proofErr w:type="spellEnd"/>
+            <w:r>
+              <w:rPr>
+                <w:rStyle w:val="Strong"/>
+                <w:rFonts w:ascii="Calibri" w:eastAsia="SimSun" w:hAnsi="Calibri"/>
+                <w:b/>
+                <w:bCs/>
+                <w:sz w:val="20"/>
+                <w:szCs w:val="20"/>
+                <w:lang w:val="en-US" w:eastAsia="zh-CN" w:bidi="ar"/>
+              </w:rPr>
+              <w:t xml:space="preserve"> Rischi</w:t>
+            </w:r>
+          </w:p>
+        </w:tc>
+      </w:tr>
+      <w:tr>
+        <w:trPr>
+          <w:trHeight w:val="836"/>
+        </w:trPr>
+        <w:tc>
+          <w:tcPr>
+            <w:cnfStyle w:val="001000000000" w:firstRow="0" w:lastRow="0" w:firstColumn="1" w:lastColumn="0" w:oddVBand="0" w:evenVBand="0" w:oddHBand="0" w:evenHBand="0" w:firstRowFirstColumn="0" w:firstRowLastColumn="0" w:lastRowFirstColumn="0" w:lastRowLastColumn="0"/>
+            <w:tcW w:w="2425" w:type="dxa"/>
+            <w:vAlign w:val="center"/>
+          </w:tcPr>
+          <w:p>
+            <w:pPr>
+              <w:ind w:left="142"/>
+              <w:jc w:val="center"/>
+              <w:rPr>
+                <w:rFonts w:ascii="Calibri" w:hAnsi="Calibri"/>
+                <w:sz w:val="18"/>
+                <w:szCs w:val="18"/>
+              </w:rPr>
+            </w:pPr>
+            <w:proofErr w:type="spellStart"/>
+            <w:r>
+              <w:rPr>
+                <w:rStyle w:val="Strong"/>
+                <w:rFonts w:ascii="Calibri" w:eastAsia="SimSun" w:hAnsi="Calibri"/>
+                <w:sz w:val="18"/>
+                <w:szCs w:val="18"/>
+                <w:lang w:val="en-US" w:eastAsia="zh-CN" w:bidi="ar"/>
+              </w:rPr>
+              <w:t>Pompelmo</w:t>
+            </w:r>
+            <w:proofErr w:type="spellEnd"/>
+          </w:p>
+        </w:tc>
+        <w:tc>
+          <w:tcPr>
+            <w:tcW w:w="4237" w:type="dxa"/>
+            <w:vAlign w:val="center"/>
+          </w:tcPr>
+          <w:p>
+            <w:pPr>
+              <w:ind w:left="142"/>
+              <w:jc w:val="center"/>
+              <w:cnfStyle w:val="000000000000" w:firstRow="0" w:lastRow="0" w:firstColumn="0" w:lastColumn="0" w:oddVBand="0" w:evenVBand="0" w:oddHBand="0" w:evenHBand="0" w:firstRowFirstColumn="0" w:firstRowLastColumn="0" w:lastRowFirstColumn="0" w:lastRowLastColumn="0"/>
+              <w:rPr>
+                <w:rFonts w:ascii="Calibri" w:eastAsia="SimSun" w:hAnsi="Calibri"/>
+                <w:sz w:val="18"/>
+                <w:szCs w:val="18"/>
+                <w:lang w:eastAsia="zh-CN" w:bidi="ar"/>
+              </w:rPr>
+            </w:pPr>
+            <w:r>
+              <w:rPr>
+                <w:rFonts w:ascii="Calibri" w:eastAsia="SimSun" w:hAnsi="Calibri"/>
+                <w:sz w:val="18"/>
+                <w:szCs w:val="18"/>
+                <w:lang w:eastAsia="zh-CN" w:bidi="ar"/>
+              </w:rPr>
+              <w:t>Rallenta la degradazione di alcuni farmaci nel fegato (es. statine, ansiolitici)</w:t>
+            </w:r>
+          </w:p>
+        </w:tc>
+        <w:tc>
+          <w:tcPr>
+            <w:tcW w:w="3667" w:type="dxa"/>
+            <w:vAlign w:val="center"/>
+          </w:tcPr>
+          <w:p>
+            <w:pPr>
+              <w:ind w:left="142"/>
+              <w:jc w:val="center"/>
+              <w:cnfStyle w:val="000000000000" w:firstRow="0" w:lastRow="0" w:firstColumn="0" w:lastColumn="0" w:oddVBand="0" w:evenVBand="0" w:oddHBand="0" w:evenHBand="0" w:firstRowFirstColumn="0" w:firstRowLastColumn="0" w:lastRowFirstColumn="0" w:lastRowLastColumn="0"/>
+              <w:rPr>
+                <w:rFonts w:ascii="Calibri" w:hAnsi="Calibri"/>
+                <w:sz w:val="18"/>
+                <w:szCs w:val="18"/>
+              </w:rPr>
+            </w:pPr>
+            <w:r>
+              <w:rPr>
+                <w:rFonts w:ascii="Calibri" w:eastAsia="SimSun" w:hAnsi="Calibri"/>
+                <w:sz w:val="18"/>
+                <w:szCs w:val="18"/>
+                <w:lang w:eastAsia="zh-CN" w:bidi="ar"/>
+              </w:rPr>
+              <w:t>Il farmaco può accumularsi nel sangue e diventare tossico</w:t>
+            </w:r>
+          </w:p>
+        </w:tc>
+      </w:tr>
+      <w:tr>
+        <w:trPr>
+          <w:trHeight w:val="652"/>
+        </w:trPr>
+        <w:tc>
+          <w:tcPr>
+            <w:cnfStyle w:val="001000000000" w:firstRow="0" w:lastRow="0" w:firstColumn="1" w:lastColumn="0" w:oddVBand="0" w:evenVBand="0" w:oddHBand="0" w:evenHBand="0" w:firstRowFirstColumn="0" w:firstRowLastColumn="0" w:lastRowFirstColumn="0" w:lastRowLastColumn="0"/>
+            <w:tcW w:w="2425" w:type="dxa"/>
+            <w:vAlign w:val="center"/>
+          </w:tcPr>
+          <w:p>
+            <w:pPr>
+              <w:ind w:left="142"/>
+              <w:jc w:val="center"/>
+              <w:rPr>
+                <w:rFonts w:ascii="Calibri" w:eastAsia="SimSun" w:hAnsi="Calibri"/>
+                <w:sz w:val="18"/>
+                <w:szCs w:val="18"/>
+                <w:lang w:eastAsia="zh-CN" w:bidi="ar"/>
+              </w:rPr>
+            </w:pPr>
+            <w:r>
+              <w:rPr>
+                <w:rStyle w:val="Strong"/>
+                <w:rFonts w:ascii="Calibri" w:eastAsia="SimSun" w:hAnsi="Calibri"/>
+                <w:sz w:val="18"/>
+                <w:szCs w:val="18"/>
+                <w:lang w:eastAsia="zh-CN" w:bidi="ar"/>
+              </w:rPr>
+              <w:t>Verdure a foglia verde (spinaci, cavoli, lattuga)</w:t>
+            </w:r>
+          </w:p>
+        </w:tc>
+        <w:tc>
+          <w:tcPr>
+            <w:tcW w:w="4237" w:type="dxa"/>
+            <w:vAlign w:val="center"/>
+          </w:tcPr>
+          <w:p>
+            <w:pPr>
+              <w:ind w:left="142"/>
+              <w:jc w:val="center"/>
+              <w:cnfStyle w:val="000000000000" w:firstRow="0" w:lastRow="0" w:firstColumn="0" w:lastColumn="0" w:oddVBand="0" w:evenVBand="0" w:oddHBand="0" w:evenHBand="0" w:firstRowFirstColumn="0" w:firstRowLastColumn="0" w:lastRowFirstColumn="0" w:lastRowLastColumn="0"/>
+              <w:rPr>
+                <w:rFonts w:ascii="Calibri" w:hAnsi="Calibri"/>
+                <w:sz w:val="18"/>
+                <w:szCs w:val="18"/>
+              </w:rPr>
+            </w:pPr>
+            <w:r>
+              <w:rPr>
+                <w:rFonts w:ascii="Calibri" w:eastAsia="SimSun" w:hAnsi="Calibri"/>
+                <w:sz w:val="18"/>
+                <w:szCs w:val="18"/>
+                <w:lang w:eastAsia="zh-CN" w:bidi="ar"/>
+              </w:rPr>
+              <w:t>Possono ridurre l’effetto dei farmaci anticoagulanti (es. warfarin)</w:t>
+            </w:r>
+          </w:p>
+        </w:tc>
+        <w:tc>
+          <w:tcPr>
+            <w:tcW w:w="3667" w:type="dxa"/>
+            <w:vAlign w:val="center"/>
+          </w:tcPr>
+          <w:p>
+            <w:pPr>
+              <w:ind w:left="142"/>
+              <w:jc w:val="center"/>
+              <w:cnfStyle w:val="000000000000" w:firstRow="0" w:lastRow="0" w:firstColumn="0" w:lastColumn="0" w:oddVBand="0" w:evenVBand="0" w:oddHBand="0" w:evenHBand="0" w:firstRowFirstColumn="0" w:firstRowLastColumn="0" w:lastRowFirstColumn="0" w:lastRowLastColumn="0"/>
+              <w:rPr>
+                <w:rFonts w:ascii="Calibri" w:hAnsi="Calibri"/>
+                <w:sz w:val="18"/>
+                <w:szCs w:val="18"/>
+              </w:rPr>
+            </w:pPr>
+            <w:r>
+              <w:rPr>
+                <w:rFonts w:ascii="Calibri" w:eastAsia="SimSun" w:hAnsi="Calibri"/>
+                <w:sz w:val="18"/>
+                <w:szCs w:val="18"/>
+                <w:lang w:eastAsia="zh-CN" w:bidi="ar"/>
+              </w:rPr>
+              <w:t>Rischio di trombosi o sanguinamenti</w:t>
+            </w:r>
+          </w:p>
+        </w:tc>
+      </w:tr>
+      <w:tr>
+        <w:trPr>
+          <w:trHeight w:val="770"/>
+        </w:trPr>
+        <w:tc>
+          <w:tcPr>
+            <w:cnfStyle w:val="001000000000" w:firstRow="0" w:lastRow="0" w:firstColumn="1" w:lastColumn="0" w:oddVBand="0" w:evenVBand="0" w:oddHBand="0" w:evenHBand="0" w:firstRowFirstColumn="0" w:firstRowLastColumn="0" w:lastRowFirstColumn="0" w:lastRowLastColumn="0"/>
+            <w:tcW w:w="2425" w:type="dxa"/>
+            <w:vAlign w:val="center"/>
+          </w:tcPr>
+          <w:p>
+            <w:pPr>
+              <w:ind w:left="142"/>
+              <w:jc w:val="center"/>
+              <w:rPr>
+                <w:rFonts w:ascii="Calibri" w:hAnsi="Calibri"/>
+                <w:sz w:val="18"/>
+                <w:szCs w:val="18"/>
+              </w:rPr>
+            </w:pPr>
+            <w:proofErr w:type="spellStart"/>
+            <w:r>
+              <w:rPr>
+                <w:rStyle w:val="Strong"/>
+                <w:rFonts w:ascii="Calibri" w:eastAsia="SimSun" w:hAnsi="Calibri"/>
+                <w:sz w:val="18"/>
+                <w:szCs w:val="18"/>
+                <w:lang w:val="en-US" w:eastAsia="zh-CN" w:bidi="ar"/>
+              </w:rPr>
+              <w:t>Alcol</w:t>
+            </w:r>
+            <w:proofErr w:type="spellEnd"/>
+          </w:p>
+        </w:tc>
+        <w:tc>
+          <w:tcPr>
+            <w:tcW w:w="4237" w:type="dxa"/>
+            <w:vAlign w:val="center"/>
+          </w:tcPr>
+          <w:p>
+            <w:pPr>
+              <w:ind w:left="142"/>
+              <w:jc w:val="center"/>
+              <w:cnfStyle w:val="000000000000" w:firstRow="0" w:lastRow="0" w:firstColumn="0" w:lastColumn="0" w:oddVBand="0" w:evenVBand="0" w:oddHBand="0" w:evenHBand="0" w:firstRowFirstColumn="0" w:firstRowLastColumn="0" w:lastRowFirstColumn="0" w:lastRowLastColumn="0"/>
+              <w:rPr>
+                <w:rFonts w:ascii="Calibri" w:eastAsia="SimSun" w:hAnsi="Calibri"/>
+                <w:sz w:val="18"/>
+                <w:szCs w:val="18"/>
+                <w:lang w:eastAsia="zh-CN" w:bidi="ar"/>
+              </w:rPr>
+            </w:pPr>
+            <w:r>
+              <w:rPr>
+                <w:rFonts w:ascii="Calibri" w:eastAsia="SimSun" w:hAnsi="Calibri"/>
+                <w:sz w:val="18"/>
+                <w:szCs w:val="18"/>
+                <w:lang w:eastAsia="zh-CN" w:bidi="ar"/>
+              </w:rPr>
+              <w:t>Può aumentare o ridurre l’effetto di alcuni farmaci (es. antidolorifici, sedativi, insulina)</w:t>
+            </w:r>
+          </w:p>
+        </w:tc>
+        <w:tc>
+          <w:tcPr>
+            <w:tcW w:w="3667" w:type="dxa"/>
+            <w:vAlign w:val="center"/>
+          </w:tcPr>
+          <w:p>
+            <w:pPr>
+              <w:ind w:left="142"/>
+              <w:jc w:val="center"/>
+              <w:cnfStyle w:val="000000000000" w:firstRow="0" w:lastRow="0" w:firstColumn="0" w:lastColumn="0" w:oddVBand="0" w:evenVBand="0" w:oddHBand="0" w:evenHBand="0" w:firstRowFirstColumn="0" w:firstRowLastColumn="0" w:lastRowFirstColumn="0" w:lastRowLastColumn="0"/>
+              <w:rPr>
+                <w:rFonts w:ascii="Calibri" w:hAnsi="Calibri"/>
+                <w:sz w:val="18"/>
+                <w:szCs w:val="18"/>
+              </w:rPr>
+            </w:pPr>
+            <w:r>
+              <w:rPr>
+                <w:rFonts w:ascii="Calibri" w:eastAsia="SimSun" w:hAnsi="Calibri"/>
+                <w:sz w:val="18"/>
+                <w:szCs w:val="18"/>
+                <w:lang w:eastAsia="zh-CN" w:bidi="ar"/>
+              </w:rPr>
+              <w:t>Rischio di danni al fegato, svenimenti, glicemia bassa</w:t>
+            </w:r>
+          </w:p>
+        </w:tc>
+      </w:tr>
+      <w:tr>
+        <w:trPr>
+          <w:trHeight w:val="626"/>
+        </w:trPr>
+        <w:tc>
+          <w:tcPr>
+            <w:cnfStyle w:val="001000000000" w:firstRow="0" w:lastRow="0" w:firstColumn="1" w:lastColumn="0" w:oddVBand="0" w:evenVBand="0" w:oddHBand="0" w:evenHBand="0" w:firstRowFirstColumn="0" w:firstRowLastColumn="0" w:lastRowFirstColumn="0" w:lastRowLastColumn="0"/>
+            <w:tcW w:w="2425" w:type="dxa"/>
+            <w:vAlign w:val="center"/>
+          </w:tcPr>
+          <w:p>
+            <w:pPr>
+              <w:ind w:left="142"/>
+              <w:jc w:val="center"/>
+              <w:rPr>
+                <w:rFonts w:ascii="Calibri" w:eastAsia="SimSun" w:hAnsi="Calibri"/>
+                <w:sz w:val="18"/>
+                <w:szCs w:val="18"/>
+                <w:lang w:val="en-US" w:eastAsia="zh-CN" w:bidi="ar"/>
+              </w:rPr>
+            </w:pPr>
+            <w:r>
+              <w:rPr>
+                <w:rStyle w:val="Strong"/>
+                <w:rFonts w:ascii="Calibri" w:eastAsia="SimSun" w:hAnsi="Calibri"/>
+                <w:sz w:val="18"/>
+                <w:szCs w:val="18"/>
+                <w:lang w:val="en-US" w:eastAsia="zh-CN" w:bidi="ar"/>
+              </w:rPr>
+              <w:t xml:space="preserve">Caffè, </w:t>
+            </w:r>
+            <w:proofErr w:type="spellStart"/>
+            <w:r>
+              <w:rPr>
+                <w:rStyle w:val="Strong"/>
+                <w:rFonts w:ascii="Calibri" w:eastAsia="SimSun" w:hAnsi="Calibri"/>
+                <w:sz w:val="18"/>
+                <w:szCs w:val="18"/>
+                <w:lang w:val="en-US" w:eastAsia="zh-CN" w:bidi="ar"/>
+              </w:rPr>
+              <w:t>tè</w:t>
+            </w:r>
+            <w:proofErr w:type="spellEnd"/>
+            <w:r>
+              <w:rPr>
+                <w:rStyle w:val="Strong"/>
+                <w:rFonts w:ascii="Calibri" w:eastAsia="SimSun" w:hAnsi="Calibri"/>
+                <w:sz w:val="18"/>
+                <w:szCs w:val="18"/>
+                <w:lang w:val="en-US" w:eastAsia="zh-CN" w:bidi="ar"/>
+              </w:rPr>
+              <w:t xml:space="preserve">, </w:t>
+            </w:r>
+            <w:proofErr w:type="spellStart"/>
+            <w:r>
+              <w:rPr>
+                <w:rStyle w:val="Strong"/>
+                <w:rFonts w:ascii="Calibri" w:eastAsia="SimSun" w:hAnsi="Calibri"/>
+                <w:sz w:val="18"/>
+                <w:szCs w:val="18"/>
+                <w:lang w:val="en-US" w:eastAsia="zh-CN" w:bidi="ar"/>
+              </w:rPr>
+              <w:t>bevande</w:t>
+            </w:r>
+            <w:proofErr w:type="spellEnd"/>
+            <w:r>
+              <w:rPr>
+                <w:rStyle w:val="Strong"/>
+                <w:rFonts w:ascii="Calibri" w:eastAsia="SimSun" w:hAnsi="Calibri"/>
+                <w:sz w:val="18"/>
+                <w:szCs w:val="18"/>
+                <w:lang w:val="en-US" w:eastAsia="zh-CN" w:bidi="ar"/>
+              </w:rPr>
+              <w:t xml:space="preserve"> </w:t>
+            </w:r>
+            <w:proofErr w:type="spellStart"/>
+            <w:r>
+              <w:rPr>
+                <w:rStyle w:val="Strong"/>
+                <w:rFonts w:ascii="Calibri" w:eastAsia="SimSun" w:hAnsi="Calibri"/>
+                <w:sz w:val="18"/>
+                <w:szCs w:val="18"/>
+                <w:lang w:val="en-US" w:eastAsia="zh-CN" w:bidi="ar"/>
+              </w:rPr>
+              <w:t>energetiche</w:t>
+            </w:r>
+            <w:proofErr w:type="spellEnd"/>
+          </w:p>
+        </w:tc>
+        <w:tc>
+          <w:tcPr>
+            <w:tcW w:w="4237" w:type="dxa"/>
+            <w:vAlign w:val="center"/>
+          </w:tcPr>
+          <w:p>
+            <w:pPr>
+              <w:ind w:left="142"/>
+              <w:jc w:val="center"/>
+              <w:cnfStyle w:val="000000000000" w:firstRow="0" w:lastRow="0" w:firstColumn="0" w:lastColumn="0" w:oddVBand="0" w:evenVBand="0" w:oddHBand="0" w:evenHBand="0" w:firstRowFirstColumn="0" w:firstRowLastColumn="0" w:lastRowFirstColumn="0" w:lastRowLastColumn="0"/>
+              <w:rPr>
+                <w:rFonts w:ascii="Calibri" w:hAnsi="Calibri"/>
+                <w:sz w:val="18"/>
+                <w:szCs w:val="18"/>
+              </w:rPr>
+            </w:pPr>
+            <w:r>
+              <w:rPr>
+                <w:rFonts w:ascii="Calibri" w:eastAsia="SimSun" w:hAnsi="Calibri"/>
+                <w:sz w:val="18"/>
+                <w:szCs w:val="18"/>
+                <w:lang w:eastAsia="zh-CN" w:bidi="ar"/>
+              </w:rPr>
+              <w:t>Può potenziare farmaci stimolanti o ridurre l’effetto dei calmanti</w:t>
+            </w:r>
+          </w:p>
+        </w:tc>
+        <w:tc>
+          <w:tcPr>
+            <w:tcW w:w="3667" w:type="dxa"/>
+            <w:vAlign w:val="center"/>
+          </w:tcPr>
+          <w:p>
+            <w:pPr>
+              <w:ind w:left="142"/>
+              <w:jc w:val="center"/>
+              <w:cnfStyle w:val="000000000000" w:firstRow="0" w:lastRow="0" w:firstColumn="0" w:lastColumn="0" w:oddVBand="0" w:evenVBand="0" w:oddHBand="0" w:evenHBand="0" w:firstRowFirstColumn="0" w:firstRowLastColumn="0" w:lastRowFirstColumn="0" w:lastRowLastColumn="0"/>
+              <w:rPr>
+                <w:rFonts w:ascii="Calibri" w:hAnsi="Calibri"/>
+                <w:sz w:val="18"/>
+                <w:szCs w:val="18"/>
+              </w:rPr>
+            </w:pPr>
+            <w:r>
+              <w:rPr>
+                <w:rFonts w:ascii="Calibri" w:eastAsia="SimSun" w:hAnsi="Calibri"/>
+                <w:sz w:val="18"/>
+                <w:szCs w:val="18"/>
+                <w:lang w:eastAsia="zh-CN" w:bidi="ar"/>
+              </w:rPr>
+              <w:t>Aumento di battito cardiaco, ansia, insonnia</w:t>
+            </w:r>
+          </w:p>
+        </w:tc>
+      </w:tr>
+      <w:tr>
+        <w:trPr>
+          <w:trHeight w:val="717"/>
+        </w:trPr>
+        <w:tc>
+          <w:tcPr>
+            <w:cnfStyle w:val="001000000000" w:firstRow="0" w:lastRow="0" w:firstColumn="1" w:lastColumn="0" w:oddVBand="0" w:evenVBand="0" w:oddHBand="0" w:evenHBand="0" w:firstRowFirstColumn="0" w:firstRowLastColumn="0" w:lastRowFirstColumn="0" w:lastRowLastColumn="0"/>
+            <w:tcW w:w="2425" w:type="dxa"/>
+            <w:vAlign w:val="center"/>
+          </w:tcPr>
+          <w:p>
+            <w:pPr>
+              <w:ind w:left="142"/>
+              <w:jc w:val="center"/>
+              <w:rPr>
+                <w:rFonts w:ascii="Calibri" w:hAnsi="Calibri"/>
+                <w:sz w:val="18"/>
+                <w:szCs w:val="18"/>
+              </w:rPr>
+            </w:pPr>
+            <w:r>
+              <w:rPr>
+                <w:rStyle w:val="Strong"/>
+                <w:rFonts w:ascii="Calibri" w:eastAsia="SimSun" w:hAnsi="Calibri"/>
+                <w:sz w:val="18"/>
+                <w:szCs w:val="18"/>
+                <w:lang w:val="en-US" w:eastAsia="zh-CN" w:bidi="ar"/>
+              </w:rPr>
+              <w:t xml:space="preserve">Latte e </w:t>
+            </w:r>
+            <w:proofErr w:type="spellStart"/>
+            <w:r>
+              <w:rPr>
+                <w:rStyle w:val="Strong"/>
+                <w:rFonts w:ascii="Calibri" w:eastAsia="SimSun" w:hAnsi="Calibri"/>
+                <w:sz w:val="18"/>
+                <w:szCs w:val="18"/>
+                <w:lang w:val="en-US" w:eastAsia="zh-CN" w:bidi="ar"/>
+              </w:rPr>
+              <w:t>latticini</w:t>
+            </w:r>
+            <w:proofErr w:type="spellEnd"/>
+          </w:p>
+        </w:tc>
+        <w:tc>
+          <w:tcPr>
+            <w:tcW w:w="4237" w:type="dxa"/>
+            <w:vAlign w:val="center"/>
+          </w:tcPr>
+          <w:p>
+            <w:pPr>
+              <w:ind w:left="142"/>
+              <w:jc w:val="center"/>
+              <w:cnfStyle w:val="000000000000" w:firstRow="0" w:lastRow="0" w:firstColumn="0" w:lastColumn="0" w:oddVBand="0" w:evenVBand="0" w:oddHBand="0" w:evenHBand="0" w:firstRowFirstColumn="0" w:firstRowLastColumn="0" w:lastRowFirstColumn="0" w:lastRowLastColumn="0"/>
+              <w:rPr>
+                <w:rFonts w:ascii="Calibri" w:hAnsi="Calibri"/>
+                <w:sz w:val="18"/>
+                <w:szCs w:val="18"/>
+              </w:rPr>
+            </w:pPr>
+            <w:r>
+              <w:rPr>
+                <w:rFonts w:ascii="Calibri" w:eastAsia="SimSun" w:hAnsi="Calibri"/>
+                <w:sz w:val="18"/>
+                <w:szCs w:val="18"/>
+                <w:lang w:eastAsia="zh-CN" w:bidi="ar"/>
+              </w:rPr>
+              <w:t>Possono ridurre l’assorbimento di alcuni antibiotici (es. tetracicline)</w:t>
+            </w:r>
+          </w:p>
+        </w:tc>
+        <w:tc>
+          <w:tcPr>
+            <w:tcW w:w="3667" w:type="dxa"/>
+            <w:vAlign w:val="center"/>
+          </w:tcPr>
+          <w:p>
+            <w:pPr>
+              <w:ind w:left="142"/>
+              <w:jc w:val="center"/>
+              <w:cnfStyle w:val="000000000000" w:firstRow="0" w:lastRow="0" w:firstColumn="0" w:lastColumn="0" w:oddVBand="0" w:evenVBand="0" w:oddHBand="0" w:evenHBand="0" w:firstRowFirstColumn="0" w:firstRowLastColumn="0" w:lastRowFirstColumn="0" w:lastRowLastColumn="0"/>
+              <w:rPr>
+                <w:rFonts w:ascii="Calibri" w:hAnsi="Calibri"/>
+                <w:sz w:val="18"/>
+                <w:szCs w:val="18"/>
+              </w:rPr>
+            </w:pPr>
+            <w:r>
+              <w:rPr>
+                <w:rFonts w:ascii="Calibri" w:eastAsia="SimSun" w:hAnsi="Calibri"/>
+                <w:sz w:val="18"/>
+                <w:szCs w:val="18"/>
+                <w:lang w:eastAsia="zh-CN" w:bidi="ar"/>
+              </w:rPr>
+              <w:t>Il farmaco potrebbe non funzionare bene contro le infezioni</w:t>
+            </w:r>
+          </w:p>
+        </w:tc>
+      </w:tr>
+      <w:tr>
+        <w:trPr>
+          <w:trHeight w:val="842"/>
+        </w:trPr>
+        <w:tc>
+          <w:tcPr>
+            <w:cnfStyle w:val="001000000000" w:firstRow="0" w:lastRow="0" w:firstColumn="1" w:lastColumn="0" w:oddVBand="0" w:evenVBand="0" w:oddHBand="0" w:evenHBand="0" w:firstRowFirstColumn="0" w:firstRowLastColumn="0" w:lastRowFirstColumn="0" w:lastRowLastColumn="0"/>
+            <w:tcW w:w="2425" w:type="dxa"/>
+            <w:vAlign w:val="center"/>
+          </w:tcPr>
+          <w:p>
+            <w:pPr>
+              <w:ind w:left="142"/>
+              <w:jc w:val="center"/>
+              <w:rPr>
+                <w:rFonts w:ascii="Calibri" w:eastAsia="SimSun" w:hAnsi="Calibri"/>
+                <w:sz w:val="18"/>
+                <w:szCs w:val="18"/>
+                <w:lang w:eastAsia="zh-CN" w:bidi="ar"/>
+              </w:rPr>
+            </w:pPr>
+            <w:r>
+              <w:rPr>
+                <w:rStyle w:val="Strong"/>
+                <w:rFonts w:ascii="Calibri" w:eastAsia="SimSun" w:hAnsi="Calibri"/>
+                <w:sz w:val="18"/>
+                <w:szCs w:val="18"/>
+                <w:lang w:eastAsia="zh-CN" w:bidi="ar"/>
+              </w:rPr>
+              <w:t>Formaggi stagionati, salumi, vino rosso</w:t>
+            </w:r>
+          </w:p>
+        </w:tc>
+        <w:tc>
+          <w:tcPr>
+            <w:tcW w:w="4237" w:type="dxa"/>
+            <w:vAlign w:val="center"/>
+          </w:tcPr>
+          <w:p>
+            <w:pPr>
+              <w:ind w:left="142"/>
+              <w:jc w:val="center"/>
+              <w:cnfStyle w:val="000000000000" w:firstRow="0" w:lastRow="0" w:firstColumn="0" w:lastColumn="0" w:oddVBand="0" w:evenVBand="0" w:oddHBand="0" w:evenHBand="0" w:firstRowFirstColumn="0" w:firstRowLastColumn="0" w:lastRowFirstColumn="0" w:lastRowLastColumn="0"/>
+              <w:rPr>
+                <w:rFonts w:ascii="Calibri" w:hAnsi="Calibri"/>
+                <w:sz w:val="18"/>
+                <w:szCs w:val="18"/>
+              </w:rPr>
+            </w:pPr>
+            <w:r>
+              <w:rPr>
+                <w:rFonts w:ascii="Calibri" w:eastAsia="SimSun" w:hAnsi="Calibri"/>
+                <w:sz w:val="18"/>
+                <w:szCs w:val="18"/>
+                <w:lang w:eastAsia="zh-CN" w:bidi="ar"/>
+              </w:rPr>
+              <w:t>Possono interagire con alcuni farmaci per la depressione (IMAO)</w:t>
+            </w:r>
+          </w:p>
+        </w:tc>
+        <w:tc>
+          <w:tcPr>
+            <w:tcW w:w="3667" w:type="dxa"/>
+            <w:vAlign w:val="center"/>
+          </w:tcPr>
+          <w:p>
+            <w:pPr>
+              <w:ind w:left="142"/>
+              <w:jc w:val="center"/>
+              <w:cnfStyle w:val="000000000000" w:firstRow="0" w:lastRow="0" w:firstColumn="0" w:lastColumn="0" w:oddVBand="0" w:evenVBand="0" w:oddHBand="0" w:evenHBand="0" w:firstRowFirstColumn="0" w:firstRowLastColumn="0" w:lastRowFirstColumn="0" w:lastRowLastColumn="0"/>
+              <w:rPr>
+                <w:rFonts w:ascii="Calibri" w:hAnsi="Calibri"/>
+                <w:sz w:val="18"/>
+                <w:szCs w:val="18"/>
+              </w:rPr>
+            </w:pPr>
+            <w:r>
+              <w:rPr>
+                <w:rFonts w:ascii="Calibri" w:eastAsia="SimSun" w:hAnsi="Calibri"/>
+                <w:sz w:val="18"/>
+                <w:szCs w:val="18"/>
+                <w:lang w:eastAsia="zh-CN" w:bidi="ar"/>
+              </w:rPr>
+              <w:t>Rischio di crisi ipertensiva (pressione molto alta)</w:t>
+            </w:r>
+          </w:p>
+        </w:tc>
+      </w:tr>
+    </w:tbl>
+    <w:p>
+      <w:pPr>
+        <w:pStyle w:val="NormalWeb"/>
+        <w:ind w:left="142"/>
+        <w:rPr>
+          <w:rFonts w:ascii="Calibri" w:hAnsi="Calibri" w:cs="Calibri"/>
+          <w:sz w:val="20"/>
+          <w:szCs w:val="20"/>
+          <w:lang w:val="it-IT"/>
+        </w:rPr>
+      </w:pPr>
+      <w:r>
+        <w:rPr>
+          <w:rStyle w:val="Strong"/>
+          <w:rFonts w:ascii="Calibri" w:hAnsi="Calibri" w:cs="Calibri"/>
+          <w:sz w:val="20"/>
+          <w:szCs w:val="20"/>
+          <w:lang w:val="it-IT"/>
+        </w:rPr>
+        <w:t>Consiglio:</w:t>
+      </w:r>
+      <w:r>
+        <w:rPr>
+          <w:rFonts w:ascii="Calibri" w:hAnsi="Calibri" w:cs="Calibri"/>
+          <w:sz w:val="20"/>
+          <w:szCs w:val="20"/>
+          <w:lang w:val="it-IT"/>
+        </w:rPr>
+        <w:t xml:space="preserve"> Se assumi farmaci, chiedi sempre al medico o al farmacista se ci sono alimenti da evitare o consumare con moderazione.</w:t>
+      </w:r>
+    </w:p>
+    <w:p>
+      <w:pPr>
+        <w:pStyle w:val="BodyText"/>
+        <w:spacing w:before="280" w:line="276" w:lineRule="auto"/>
+        <w:ind w:left="239" w:right="338"/>
+      </w:pPr>
     </w:p>
     <w:sectPr>
       <w:headerReference w:type="even" r:id="rId18"/>
@@ -8500,7 +8817,7 @@
 </file>
 
 <file path=word/endnotes.xml><?xml version="1.0" encoding="utf-8"?>
-<w:endnotes xmlns:wpc="http://schemas.microsoft.com/office/word/2010/wordprocessingCanvas" xmlns:cx="http://schemas.microsoft.com/office/drawing/2014/chartex" xmlns:cx1="http://schemas.microsoft.com/office/drawing/2015/9/8/chartex" xmlns:cx2="http://schemas.microsoft.com/office/drawing/2015/10/21/chartex" xmlns:cx3="http://schemas.microsoft.com/office/drawing/2016/5/9/chartex" xmlns:cx4="http://schemas.microsoft.com/office/drawing/2016/5/10/chartex" xmlns:cx5="http://schemas.microsoft.com/office/drawing/2016/5/11/chartex" xmlns:cx6="http://schemas.microsoft.com/office/drawing/2016/5/12/chartex" xmlns:cx7="http://schemas.microsoft.com/office/drawing/2016/5/13/chartex" xmlns:cx8="http://schemas.microsoft.com/office/drawing/2016/5/14/chartex" xmlns:mc="http://schemas.openxmlformats.org/markup-compatibility/2006" xmlns:aink="http://schemas.microsoft.com/office/drawing/2016/ink" xmlns:am3d="http://schemas.microsoft.com/office/drawing/2017/model3d" xmlns:o="urn:schemas-microsoft-com:office:office" xmlns:oel="http://schemas.microsoft.com/office/2019/extlst" xmlns:r="http://schemas.openxmlformats.org/officeDocument/2006/relationships" xmlns:m="http://schemas.openxmlformats.org/officeDocument/2006/math" xmlns:v="urn:schemas-microsoft-com:vml" xmlns:wp14="http://schemas.microsoft.com/office/word/2010/wordprocessingDrawing" xmlns:wp="http://schemas.openxmlformats.org/drawingml/2006/wordprocessingDrawing" xmlns:w10="urn:schemas-microsoft-com:office:word" xmlns:w="http://schemas.openxmlformats.org/wordprocessingml/2006/main" xmlns:w14="http://schemas.microsoft.com/office/word/2010/wordml" xmlns:w15="http://schemas.microsoft.com/office/word/2012/wordml" xmlns:w16cex="http://schemas.microsoft.com/office/word/2018/wordml/cex" xmlns:w16cid="http://schemas.microsoft.com/office/word/2016/wordml/cid" xmlns:w16="http://schemas.microsoft.com/office/word/2018/wordml" xmlns:w16du="http://schemas.microsoft.com/office/word/2023/wordml/word16du" xmlns:w16sdtdh="http://schemas.microsoft.com/office/word/2020/wordml/sdtdatahash" xmlns:w16se="http://schemas.microsoft.com/office/word/2015/wordml/symex" xmlns:wpg="http://schemas.microsoft.com/office/word/2010/wordprocessingGroup" xmlns:wpi="http://schemas.microsoft.com/office/word/2010/wordprocessingInk" xmlns:wne="http://schemas.microsoft.com/office/word/2006/wordml" xmlns:wps="http://schemas.microsoft.com/office/word/2010/wordprocessingShape" mc:Ignorable="w14 w15 w16se w16cid w16 w16cex w16sdtdh w16du wp14">
+<w:endnotes xmlns:wpc="http://schemas.microsoft.com/office/word/2010/wordprocessingCanvas" xmlns:cx="http://schemas.microsoft.com/office/drawing/2014/chartex" xmlns:cx1="http://schemas.microsoft.com/office/drawing/2015/9/8/chartex" xmlns:cx2="http://schemas.microsoft.com/office/drawing/2015/10/21/chartex" xmlns:cx3="http://schemas.microsoft.com/office/drawing/2016/5/9/chartex" xmlns:cx4="http://schemas.microsoft.com/office/drawing/2016/5/10/chartex" xmlns:cx5="http://schemas.microsoft.com/office/drawing/2016/5/11/chartex" xmlns:cx6="http://schemas.microsoft.com/office/drawing/2016/5/12/chartex" xmlns:cx7="http://schemas.microsoft.com/office/drawing/2016/5/13/chartex" xmlns:cx8="http://schemas.microsoft.com/office/drawing/2016/5/14/chartex" xmlns:mc="http://schemas.openxmlformats.org/markup-compatibility/2006" xmlns:aink="http://schemas.microsoft.com/office/drawing/2016/ink" xmlns:am3d="http://schemas.microsoft.com/office/drawing/2017/model3d" xmlns:o="urn:schemas-microsoft-com:office:office" xmlns:oel="http://schemas.microsoft.com/office/2019/extlst" xmlns:r="http://schemas.openxmlformats.org/officeDocument/2006/relationships" xmlns:m="http://schemas.openxmlformats.org/officeDocument/2006/math" xmlns:v="urn:schemas-microsoft-com:vml" xmlns:wp14="http://schemas.microsoft.com/office/word/2010/wordprocessingDrawing" xmlns:wp="http://schemas.openxmlformats.org/drawingml/2006/wordprocessingDrawing" xmlns:w10="urn:schemas-microsoft-com:office:word" xmlns:w="http://schemas.openxmlformats.org/wordprocessingml/2006/main" xmlns:w14="http://schemas.microsoft.com/office/word/2010/wordml" xmlns:w15="http://schemas.microsoft.com/office/word/2012/wordml" xmlns:w16cex="http://schemas.microsoft.com/office/word/2018/wordml/cex" xmlns:w16cid="http://schemas.microsoft.com/office/word/2016/wordml/cid" xmlns:w16="http://schemas.microsoft.com/office/word/2018/wordml" xmlns:w16du="http://schemas.microsoft.com/office/word/2023/wordml/word16du" xmlns:w16sdtdh="http://schemas.microsoft.com/office/word/2020/wordml/sdtdatahash" xmlns:w16sdtfl="http://schemas.microsoft.com/office/word/2024/wordml/sdtformatlock" xmlns:w16se="http://schemas.microsoft.com/office/word/2015/wordml/symex" xmlns:wpg="http://schemas.microsoft.com/office/word/2010/wordprocessingGroup" xmlns:wpi="http://schemas.microsoft.com/office/word/2010/wordprocessingInk" xmlns:wne="http://schemas.microsoft.com/office/word/2006/wordml" xmlns:wps="http://schemas.microsoft.com/office/word/2010/wordprocessingShape" mc:Ignorable="w14 w15 w16se w16cid w16 w16cex w16sdtdh w16sdtfl w16du wp14">
   <w:endnote w:type="separator" w:id="-1">
     <w:p>
       <w:r>
@@ -8519,20 +8836,20 @@
 </file>
 
 <file path=word/footer1.xml><?xml version="1.0" encoding="utf-8"?>
-<w:ftr xmlns:wpc="http://schemas.microsoft.com/office/word/2010/wordprocessingCanvas" xmlns:cx="http://schemas.microsoft.com/office/drawing/2014/chartex" xmlns:cx1="http://schemas.microsoft.com/office/drawing/2015/9/8/chartex" xmlns:cx2="http://schemas.microsoft.com/office/drawing/2015/10/21/chartex" xmlns:cx3="http://schemas.microsoft.com/office/drawing/2016/5/9/chartex" xmlns:cx4="http://schemas.microsoft.com/office/drawing/2016/5/10/chartex" xmlns:cx5="http://schemas.microsoft.com/office/drawing/2016/5/11/chartex" xmlns:cx6="http://schemas.microsoft.com/office/drawing/2016/5/12/chartex" xmlns:cx7="http://schemas.microsoft.com/office/drawing/2016/5/13/chartex" xmlns:cx8="http://schemas.microsoft.com/office/drawing/2016/5/14/chartex" xmlns:mc="http://schemas.openxmlformats.org/markup-compatibility/2006" xmlns:aink="http://schemas.microsoft.com/office/drawing/2016/ink" xmlns:am3d="http://schemas.microsoft.com/office/drawing/2017/model3d" xmlns:o="urn:schemas-microsoft-com:office:office" xmlns:oel="http://schemas.microsoft.com/office/2019/extlst" xmlns:r="http://schemas.openxmlformats.org/officeDocument/2006/relationships" xmlns:m="http://schemas.openxmlformats.org/officeDocument/2006/math" xmlns:v="urn:schemas-microsoft-com:vml" xmlns:wp14="http://schemas.microsoft.com/office/word/2010/wordprocessingDrawing" xmlns:wp="http://schemas.openxmlformats.org/drawingml/2006/wordprocessingDrawing" xmlns:w10="urn:schemas-microsoft-com:office:word" xmlns:w="http://schemas.openxmlformats.org/wordprocessingml/2006/main" xmlns:w14="http://schemas.microsoft.com/office/word/2010/wordml" xmlns:w15="http://schemas.microsoft.com/office/word/2012/wordml" xmlns:w16cex="http://schemas.microsoft.com/office/word/2018/wordml/cex" xmlns:w16cid="http://schemas.microsoft.com/office/word/2016/wordml/cid" xmlns:w16="http://schemas.microsoft.com/office/word/2018/wordml" xmlns:w16du="http://schemas.microsoft.com/office/word/2023/wordml/word16du" xmlns:w16sdtdh="http://schemas.microsoft.com/office/word/2020/wordml/sdtdatahash" xmlns:w16se="http://schemas.microsoft.com/office/word/2015/wordml/symex" xmlns:wpg="http://schemas.microsoft.com/office/word/2010/wordprocessingGroup" xmlns:wpi="http://schemas.microsoft.com/office/word/2010/wordprocessingInk" xmlns:wne="http://schemas.microsoft.com/office/word/2006/wordml" xmlns:wps="http://schemas.microsoft.com/office/word/2010/wordprocessingShape" mc:Ignorable="w14 w15 w16se w16cid w16 w16cex w16sdtdh w16du wp14">
+<w:ftr xmlns:wpc="http://schemas.microsoft.com/office/word/2010/wordprocessingCanvas" xmlns:cx="http://schemas.microsoft.com/office/drawing/2014/chartex" xmlns:cx1="http://schemas.microsoft.com/office/drawing/2015/9/8/chartex" xmlns:cx2="http://schemas.microsoft.com/office/drawing/2015/10/21/chartex" xmlns:cx3="http://schemas.microsoft.com/office/drawing/2016/5/9/chartex" xmlns:cx4="http://schemas.microsoft.com/office/drawing/2016/5/10/chartex" xmlns:cx5="http://schemas.microsoft.com/office/drawing/2016/5/11/chartex" xmlns:cx6="http://schemas.microsoft.com/office/drawing/2016/5/12/chartex" xmlns:cx7="http://schemas.microsoft.com/office/drawing/2016/5/13/chartex" xmlns:cx8="http://schemas.microsoft.com/office/drawing/2016/5/14/chartex" xmlns:mc="http://schemas.openxmlformats.org/markup-compatibility/2006" xmlns:aink="http://schemas.microsoft.com/office/drawing/2016/ink" xmlns:am3d="http://schemas.microsoft.com/office/drawing/2017/model3d" xmlns:o="urn:schemas-microsoft-com:office:office" xmlns:oel="http://schemas.microsoft.com/office/2019/extlst" xmlns:r="http://schemas.openxmlformats.org/officeDocument/2006/relationships" xmlns:m="http://schemas.openxmlformats.org/officeDocument/2006/math" xmlns:v="urn:schemas-microsoft-com:vml" xmlns:wp14="http://schemas.microsoft.com/office/word/2010/wordprocessingDrawing" xmlns:wp="http://schemas.openxmlformats.org/drawingml/2006/wordprocessingDrawing" xmlns:w10="urn:schemas-microsoft-com:office:word" xmlns:w="http://schemas.openxmlformats.org/wordprocessingml/2006/main" xmlns:w14="http://schemas.microsoft.com/office/word/2010/wordml" xmlns:w15="http://schemas.microsoft.com/office/word/2012/wordml" xmlns:w16cex="http://schemas.microsoft.com/office/word/2018/wordml/cex" xmlns:w16cid="http://schemas.microsoft.com/office/word/2016/wordml/cid" xmlns:w16="http://schemas.microsoft.com/office/word/2018/wordml" xmlns:w16du="http://schemas.microsoft.com/office/word/2023/wordml/word16du" xmlns:w16sdtdh="http://schemas.microsoft.com/office/word/2020/wordml/sdtdatahash" xmlns:w16sdtfl="http://schemas.microsoft.com/office/word/2024/wordml/sdtformatlock" xmlns:w16se="http://schemas.microsoft.com/office/word/2015/wordml/symex" xmlns:wpg="http://schemas.microsoft.com/office/word/2010/wordprocessingGroup" xmlns:wpi="http://schemas.microsoft.com/office/word/2010/wordprocessingInk" xmlns:wne="http://schemas.microsoft.com/office/word/2006/wordml" xmlns:wps="http://schemas.microsoft.com/office/word/2010/wordprocessingShape" mc:Ignorable="w14 w15 w16se w16cid w16 w16cex w16sdtdh w16sdtfl w16du wp14">
   <w:p>
     <w:pPr>
-      <w:pStyle w:val="Pidipagina"/>
+      <w:pStyle w:val="Footer"/>
     </w:pPr>
   </w:p>
 </w:ftr>
 </file>
 
 <file path=word/footer2.xml><?xml version="1.0" encoding="utf-8"?>
-<w:ftr xmlns:wpc="http://schemas.microsoft.com/office/word/2010/wordprocessingCanvas" xmlns:cx="http://schemas.microsoft.com/office/drawing/2014/chartex" xmlns:cx1="http://schemas.microsoft.com/office/drawing/2015/9/8/chartex" xmlns:cx2="http://schemas.microsoft.com/office/drawing/2015/10/21/chartex" xmlns:cx3="http://schemas.microsoft.com/office/drawing/2016/5/9/chartex" xmlns:cx4="http://schemas.microsoft.com/office/drawing/2016/5/10/chartex" xmlns:cx5="http://schemas.microsoft.com/office/drawing/2016/5/11/chartex" xmlns:cx6="http://schemas.microsoft.com/office/drawing/2016/5/12/chartex" xmlns:cx7="http://schemas.microsoft.com/office/drawing/2016/5/13/chartex" xmlns:cx8="http://schemas.microsoft.com/office/drawing/2016/5/14/chartex" xmlns:mc="http://schemas.openxmlformats.org/markup-compatibility/2006" xmlns:aink="http://schemas.microsoft.com/office/drawing/2016/ink" xmlns:am3d="http://schemas.microsoft.com/office/drawing/2017/model3d" xmlns:o="urn:schemas-microsoft-com:office:office" xmlns:oel="http://schemas.microsoft.com/office/2019/extlst" xmlns:r="http://schemas.openxmlformats.org/officeDocument/2006/relationships" xmlns:m="http://schemas.openxmlformats.org/officeDocument/2006/math" xmlns:v="urn:schemas-microsoft-com:vml" xmlns:wp14="http://schemas.microsoft.com/office/word/2010/wordprocessingDrawing" xmlns:wp="http://schemas.openxmlformats.org/drawingml/2006/wordprocessingDrawing" xmlns:w10="urn:schemas-microsoft-com:office:word" xmlns:w="http://schemas.openxmlformats.org/wordprocessingml/2006/main" xmlns:w14="http://schemas.microsoft.com/office/word/2010/wordml" xmlns:w15="http://schemas.microsoft.com/office/word/2012/wordml" xmlns:w16cex="http://schemas.microsoft.com/office/word/2018/wordml/cex" xmlns:w16cid="http://schemas.microsoft.com/office/word/2016/wordml/cid" xmlns:w16="http://schemas.microsoft.com/office/word/2018/wordml" xmlns:w16du="http://schemas.microsoft.com/office/word/2023/wordml/word16du" xmlns:w16sdtdh="http://schemas.microsoft.com/office/word/2020/wordml/sdtdatahash" xmlns:w16se="http://schemas.microsoft.com/office/word/2015/wordml/symex" xmlns:wpg="http://schemas.microsoft.com/office/word/2010/wordprocessingGroup" xmlns:wpi="http://schemas.microsoft.com/office/word/2010/wordprocessingInk" xmlns:wne="http://schemas.microsoft.com/office/word/2006/wordml" xmlns:wps="http://schemas.microsoft.com/office/word/2010/wordprocessingShape" mc:Ignorable="w14 w15 w16se w16cid w16 w16cex w16sdtdh w16du wp14">
+<w:ftr xmlns:wpc="http://schemas.microsoft.com/office/word/2010/wordprocessingCanvas" xmlns:cx="http://schemas.microsoft.com/office/drawing/2014/chartex" xmlns:cx1="http://schemas.microsoft.com/office/drawing/2015/9/8/chartex" xmlns:cx2="http://schemas.microsoft.com/office/drawing/2015/10/21/chartex" xmlns:cx3="http://schemas.microsoft.com/office/drawing/2016/5/9/chartex" xmlns:cx4="http://schemas.microsoft.com/office/drawing/2016/5/10/chartex" xmlns:cx5="http://schemas.microsoft.com/office/drawing/2016/5/11/chartex" xmlns:cx6="http://schemas.microsoft.com/office/drawing/2016/5/12/chartex" xmlns:cx7="http://schemas.microsoft.com/office/drawing/2016/5/13/chartex" xmlns:cx8="http://schemas.microsoft.com/office/drawing/2016/5/14/chartex" xmlns:mc="http://schemas.openxmlformats.org/markup-compatibility/2006" xmlns:aink="http://schemas.microsoft.com/office/drawing/2016/ink" xmlns:am3d="http://schemas.microsoft.com/office/drawing/2017/model3d" xmlns:o="urn:schemas-microsoft-com:office:office" xmlns:oel="http://schemas.microsoft.com/office/2019/extlst" xmlns:r="http://schemas.openxmlformats.org/officeDocument/2006/relationships" xmlns:m="http://schemas.openxmlformats.org/officeDocument/2006/math" xmlns:v="urn:schemas-microsoft-com:vml" xmlns:wp14="http://schemas.microsoft.com/office/word/2010/wordprocessingDrawing" xmlns:wp="http://schemas.openxmlformats.org/drawingml/2006/wordprocessingDrawing" xmlns:w10="urn:schemas-microsoft-com:office:word" xmlns:w="http://schemas.openxmlformats.org/wordprocessingml/2006/main" xmlns:w14="http://schemas.microsoft.com/office/word/2010/wordml" xmlns:w15="http://schemas.microsoft.com/office/word/2012/wordml" xmlns:w16cex="http://schemas.microsoft.com/office/word/2018/wordml/cex" xmlns:w16cid="http://schemas.microsoft.com/office/word/2016/wordml/cid" xmlns:w16="http://schemas.microsoft.com/office/word/2018/wordml" xmlns:w16du="http://schemas.microsoft.com/office/word/2023/wordml/word16du" xmlns:w16sdtdh="http://schemas.microsoft.com/office/word/2020/wordml/sdtdatahash" xmlns:w16sdtfl="http://schemas.microsoft.com/office/word/2024/wordml/sdtformatlock" xmlns:w16se="http://schemas.microsoft.com/office/word/2015/wordml/symex" xmlns:wpg="http://schemas.microsoft.com/office/word/2010/wordprocessingGroup" xmlns:wpi="http://schemas.microsoft.com/office/word/2010/wordprocessingInk" xmlns:wne="http://schemas.microsoft.com/office/word/2006/wordml" xmlns:wps="http://schemas.microsoft.com/office/word/2010/wordprocessingShape" mc:Ignorable="w14 w15 w16se w16cid w16 w16cex w16sdtdh w16sdtfl w16du wp14">
   <w:p>
     <w:pPr>
-      <w:pStyle w:val="Corpotesto"/>
+      <w:pStyle w:val="BodyText"/>
       <w:spacing w:line="0" w:lineRule="atLeast"/>
     </w:pPr>
     <w:r>
@@ -8671,7 +8988,6 @@
                   </w:rPr>
                   <w:t xml:space="preserve"> </w:t>
                 </w:r>
-                <w:proofErr w:type="spellStart"/>
                 <w:r>
                   <w:rPr>
                     <w:rFonts w:ascii="Arial" w:hAnsi="Arial"/>
@@ -8683,7 +8999,6 @@
                   </w:rPr>
                   <w:t>Altamedica</w:t>
                 </w:r>
-                <w:proofErr w:type="spellEnd"/>
                 <w:r>
                   <w:rPr>
                     <w:rFonts w:ascii="Arial" w:hAnsi="Arial"/>
@@ -8839,10 +9154,10 @@
 </file>
 
 <file path=word/footer3.xml><?xml version="1.0" encoding="utf-8"?>
-<w:ftr xmlns:wpc="http://schemas.microsoft.com/office/word/2010/wordprocessingCanvas" xmlns:cx="http://schemas.microsoft.com/office/drawing/2014/chartex" xmlns:cx1="http://schemas.microsoft.com/office/drawing/2015/9/8/chartex" xmlns:cx2="http://schemas.microsoft.com/office/drawing/2015/10/21/chartex" xmlns:cx3="http://schemas.microsoft.com/office/drawing/2016/5/9/chartex" xmlns:cx4="http://schemas.microsoft.com/office/drawing/2016/5/10/chartex" xmlns:cx5="http://schemas.microsoft.com/office/drawing/2016/5/11/chartex" xmlns:cx6="http://schemas.microsoft.com/office/drawing/2016/5/12/chartex" xmlns:cx7="http://schemas.microsoft.com/office/drawing/2016/5/13/chartex" xmlns:cx8="http://schemas.microsoft.com/office/drawing/2016/5/14/chartex" xmlns:mc="http://schemas.openxmlformats.org/markup-compatibility/2006" xmlns:aink="http://schemas.microsoft.com/office/drawing/2016/ink" xmlns:am3d="http://schemas.microsoft.com/office/drawing/2017/model3d" xmlns:o="urn:schemas-microsoft-com:office:office" xmlns:oel="http://schemas.microsoft.com/office/2019/extlst" xmlns:r="http://schemas.openxmlformats.org/officeDocument/2006/relationships" xmlns:m="http://schemas.openxmlformats.org/officeDocument/2006/math" xmlns:v="urn:schemas-microsoft-com:vml" xmlns:wp14="http://schemas.microsoft.com/office/word/2010/wordprocessingDrawing" xmlns:wp="http://schemas.openxmlformats.org/drawingml/2006/wordprocessingDrawing" xmlns:w10="urn:schemas-microsoft-com:office:word" xmlns:w="http://schemas.openxmlformats.org/wordprocessingml/2006/main" xmlns:w14="http://schemas.microsoft.com/office/word/2010/wordml" xmlns:w15="http://schemas.microsoft.com/office/word/2012/wordml" xmlns:w16cex="http://schemas.microsoft.com/office/word/2018/wordml/cex" xmlns:w16cid="http://schemas.microsoft.com/office/word/2016/wordml/cid" xmlns:w16="http://schemas.microsoft.com/office/word/2018/wordml" xmlns:w16du="http://schemas.microsoft.com/office/word/2023/wordml/word16du" xmlns:w16sdtdh="http://schemas.microsoft.com/office/word/2020/wordml/sdtdatahash" xmlns:w16se="http://schemas.microsoft.com/office/word/2015/wordml/symex" xmlns:wpg="http://schemas.microsoft.com/office/word/2010/wordprocessingGroup" xmlns:wpi="http://schemas.microsoft.com/office/word/2010/wordprocessingInk" xmlns:wne="http://schemas.microsoft.com/office/word/2006/wordml" xmlns:wps="http://schemas.microsoft.com/office/word/2010/wordprocessingShape" mc:Ignorable="w14 w15 w16se w16cid w16 w16cex w16sdtdh w16du wp14">
+<w:ftr xmlns:wpc="http://schemas.microsoft.com/office/word/2010/wordprocessingCanvas" xmlns:cx="http://schemas.microsoft.com/office/drawing/2014/chartex" xmlns:cx1="http://schemas.microsoft.com/office/drawing/2015/9/8/chartex" xmlns:cx2="http://schemas.microsoft.com/office/drawing/2015/10/21/chartex" xmlns:cx3="http://schemas.microsoft.com/office/drawing/2016/5/9/chartex" xmlns:cx4="http://schemas.microsoft.com/office/drawing/2016/5/10/chartex" xmlns:cx5="http://schemas.microsoft.com/office/drawing/2016/5/11/chartex" xmlns:cx6="http://schemas.microsoft.com/office/drawing/2016/5/12/chartex" xmlns:cx7="http://schemas.microsoft.com/office/drawing/2016/5/13/chartex" xmlns:cx8="http://schemas.microsoft.com/office/drawing/2016/5/14/chartex" xmlns:mc="http://schemas.openxmlformats.org/markup-compatibility/2006" xmlns:aink="http://schemas.microsoft.com/office/drawing/2016/ink" xmlns:am3d="http://schemas.microsoft.com/office/drawing/2017/model3d" xmlns:o="urn:schemas-microsoft-com:office:office" xmlns:oel="http://schemas.microsoft.com/office/2019/extlst" xmlns:r="http://schemas.openxmlformats.org/officeDocument/2006/relationships" xmlns:m="http://schemas.openxmlformats.org/officeDocument/2006/math" xmlns:v="urn:schemas-microsoft-com:vml" xmlns:wp14="http://schemas.microsoft.com/office/word/2010/wordprocessingDrawing" xmlns:wp="http://schemas.openxmlformats.org/drawingml/2006/wordprocessingDrawing" xmlns:w10="urn:schemas-microsoft-com:office:word" xmlns:w="http://schemas.openxmlformats.org/wordprocessingml/2006/main" xmlns:w14="http://schemas.microsoft.com/office/word/2010/wordml" xmlns:w15="http://schemas.microsoft.com/office/word/2012/wordml" xmlns:w16cex="http://schemas.microsoft.com/office/word/2018/wordml/cex" xmlns:w16cid="http://schemas.microsoft.com/office/word/2016/wordml/cid" xmlns:w16="http://schemas.microsoft.com/office/word/2018/wordml" xmlns:w16du="http://schemas.microsoft.com/office/word/2023/wordml/word16du" xmlns:w16sdtdh="http://schemas.microsoft.com/office/word/2020/wordml/sdtdatahash" xmlns:w16sdtfl="http://schemas.microsoft.com/office/word/2024/wordml/sdtformatlock" xmlns:w16se="http://schemas.microsoft.com/office/word/2015/wordml/symex" xmlns:wpg="http://schemas.microsoft.com/office/word/2010/wordprocessingGroup" xmlns:wpi="http://schemas.microsoft.com/office/word/2010/wordprocessingInk" xmlns:wne="http://schemas.microsoft.com/office/word/2006/wordml" xmlns:wps="http://schemas.microsoft.com/office/word/2010/wordprocessingShape" mc:Ignorable="w14 w15 w16se w16cid w16 w16cex w16sdtdh w16sdtfl w16du wp14">
   <w:p>
     <w:pPr>
-      <w:pStyle w:val="Corpotesto"/>
+      <w:pStyle w:val="BodyText"/>
       <w:spacing w:line="0" w:lineRule="atLeast"/>
     </w:pPr>
     <w:r>
@@ -8981,7 +9296,6 @@
                   </w:rPr>
                   <w:t xml:space="preserve"> </w:t>
                 </w:r>
-                <w:proofErr w:type="spellStart"/>
                 <w:r>
                   <w:rPr>
                     <w:rFonts w:ascii="Arial" w:hAnsi="Arial"/>
@@ -8993,7 +9307,6 @@
                   </w:rPr>
                   <w:t>Altamedica</w:t>
                 </w:r>
-                <w:proofErr w:type="spellEnd"/>
                 <w:r>
                   <w:rPr>
                     <w:rFonts w:ascii="Arial" w:hAnsi="Arial"/>
@@ -9149,10 +9462,10 @@
 </file>
 
 <file path=word/footer4.xml><?xml version="1.0" encoding="utf-8"?>
-<w:ftr xmlns:wpc="http://schemas.microsoft.com/office/word/2010/wordprocessingCanvas" xmlns:cx="http://schemas.microsoft.com/office/drawing/2014/chartex" xmlns:cx1="http://schemas.microsoft.com/office/drawing/2015/9/8/chartex" xmlns:cx2="http://schemas.microsoft.com/office/drawing/2015/10/21/chartex" xmlns:cx3="http://schemas.microsoft.com/office/drawing/2016/5/9/chartex" xmlns:cx4="http://schemas.microsoft.com/office/drawing/2016/5/10/chartex" xmlns:cx5="http://schemas.microsoft.com/office/drawing/2016/5/11/chartex" xmlns:cx6="http://schemas.microsoft.com/office/drawing/2016/5/12/chartex" xmlns:cx7="http://schemas.microsoft.com/office/drawing/2016/5/13/chartex" xmlns:cx8="http://schemas.microsoft.com/office/drawing/2016/5/14/chartex" xmlns:mc="http://schemas.openxmlformats.org/markup-compatibility/2006" xmlns:aink="http://schemas.microsoft.com/office/drawing/2016/ink" xmlns:am3d="http://schemas.microsoft.com/office/drawing/2017/model3d" xmlns:o="urn:schemas-microsoft-com:office:office" xmlns:oel="http://schemas.microsoft.com/office/2019/extlst" xmlns:r="http://schemas.openxmlformats.org/officeDocument/2006/relationships" xmlns:m="http://schemas.openxmlformats.org/officeDocument/2006/math" xmlns:v="urn:schemas-microsoft-com:vml" xmlns:wp14="http://schemas.microsoft.com/office/word/2010/wordprocessingDrawing" xmlns:wp="http://schemas.openxmlformats.org/drawingml/2006/wordprocessingDrawing" xmlns:w10="urn:schemas-microsoft-com:office:word" xmlns:w="http://schemas.openxmlformats.org/wordprocessingml/2006/main" xmlns:w14="http://schemas.microsoft.com/office/word/2010/wordml" xmlns:w15="http://schemas.microsoft.com/office/word/2012/wordml" xmlns:w16cex="http://schemas.microsoft.com/office/word/2018/wordml/cex" xmlns:w16cid="http://schemas.microsoft.com/office/word/2016/wordml/cid" xmlns:w16="http://schemas.microsoft.com/office/word/2018/wordml" xmlns:w16du="http://schemas.microsoft.com/office/word/2023/wordml/word16du" xmlns:w16sdtdh="http://schemas.microsoft.com/office/word/2020/wordml/sdtdatahash" xmlns:w16se="http://schemas.microsoft.com/office/word/2015/wordml/symex" xmlns:wpg="http://schemas.microsoft.com/office/word/2010/wordprocessingGroup" xmlns:wpi="http://schemas.microsoft.com/office/word/2010/wordprocessingInk" xmlns:wne="http://schemas.microsoft.com/office/word/2006/wordml" xmlns:wps="http://schemas.microsoft.com/office/word/2010/wordprocessingShape" mc:Ignorable="w14 w15 w16se w16cid w16 w16cex w16sdtdh w16du wp14">
+<w:ftr xmlns:wpc="http://schemas.microsoft.com/office/word/2010/wordprocessingCanvas" xmlns:cx="http://schemas.microsoft.com/office/drawing/2014/chartex" xmlns:cx1="http://schemas.microsoft.com/office/drawing/2015/9/8/chartex" xmlns:cx2="http://schemas.microsoft.com/office/drawing/2015/10/21/chartex" xmlns:cx3="http://schemas.microsoft.com/office/drawing/2016/5/9/chartex" xmlns:cx4="http://schemas.microsoft.com/office/drawing/2016/5/10/chartex" xmlns:cx5="http://schemas.microsoft.com/office/drawing/2016/5/11/chartex" xmlns:cx6="http://schemas.microsoft.com/office/drawing/2016/5/12/chartex" xmlns:cx7="http://schemas.microsoft.com/office/drawing/2016/5/13/chartex" xmlns:cx8="http://schemas.microsoft.com/office/drawing/2016/5/14/chartex" xmlns:mc="http://schemas.openxmlformats.org/markup-compatibility/2006" xmlns:aink="http://schemas.microsoft.com/office/drawing/2016/ink" xmlns:am3d="http://schemas.microsoft.com/office/drawing/2017/model3d" xmlns:o="urn:schemas-microsoft-com:office:office" xmlns:oel="http://schemas.microsoft.com/office/2019/extlst" xmlns:r="http://schemas.openxmlformats.org/officeDocument/2006/relationships" xmlns:m="http://schemas.openxmlformats.org/officeDocument/2006/math" xmlns:v="urn:schemas-microsoft-com:vml" xmlns:wp14="http://schemas.microsoft.com/office/word/2010/wordprocessingDrawing" xmlns:wp="http://schemas.openxmlformats.org/drawingml/2006/wordprocessingDrawing" xmlns:w10="urn:schemas-microsoft-com:office:word" xmlns:w="http://schemas.openxmlformats.org/wordprocessingml/2006/main" xmlns:w14="http://schemas.microsoft.com/office/word/2010/wordml" xmlns:w15="http://schemas.microsoft.com/office/word/2012/wordml" xmlns:w16cex="http://schemas.microsoft.com/office/word/2018/wordml/cex" xmlns:w16cid="http://schemas.microsoft.com/office/word/2016/wordml/cid" xmlns:w16="http://schemas.microsoft.com/office/word/2018/wordml" xmlns:w16du="http://schemas.microsoft.com/office/word/2023/wordml/word16du" xmlns:w16sdtdh="http://schemas.microsoft.com/office/word/2020/wordml/sdtdatahash" xmlns:w16sdtfl="http://schemas.microsoft.com/office/word/2024/wordml/sdtformatlock" xmlns:w16se="http://schemas.microsoft.com/office/word/2015/wordml/symex" xmlns:wpg="http://schemas.microsoft.com/office/word/2010/wordprocessingGroup" xmlns:wpi="http://schemas.microsoft.com/office/word/2010/wordprocessingInk" xmlns:wne="http://schemas.microsoft.com/office/word/2006/wordml" xmlns:wps="http://schemas.microsoft.com/office/word/2010/wordprocessingShape" mc:Ignorable="w14 w15 w16se w16cid w16 w16cex w16sdtdh w16sdtfl w16du wp14">
   <w:p>
     <w:pPr>
-      <w:pStyle w:val="Corpotesto"/>
+      <w:pStyle w:val="BodyText"/>
       <w:spacing w:line="0" w:lineRule="atLeast"/>
     </w:pPr>
     <w:r>
@@ -9291,7 +9604,6 @@
                   </w:rPr>
                   <w:t xml:space="preserve"> </w:t>
                 </w:r>
-                <w:proofErr w:type="spellStart"/>
                 <w:r>
                   <w:rPr>
                     <w:rFonts w:ascii="Arial" w:hAnsi="Arial"/>
@@ -9303,7 +9615,6 @@
                   </w:rPr>
                   <w:t>Altamedica</w:t>
                 </w:r>
-                <w:proofErr w:type="spellEnd"/>
                 <w:r>
                   <w:rPr>
                     <w:rFonts w:ascii="Arial" w:hAnsi="Arial"/>
@@ -9395,10 +9706,10 @@
 </file>
 
 <file path=word/footer5.xml><?xml version="1.0" encoding="utf-8"?>
-<w:ftr xmlns:wpc="http://schemas.microsoft.com/office/word/2010/wordprocessingCanvas" xmlns:cx="http://schemas.microsoft.com/office/drawing/2014/chartex" xmlns:cx1="http://schemas.microsoft.com/office/drawing/2015/9/8/chartex" xmlns:cx2="http://schemas.microsoft.com/office/drawing/2015/10/21/chartex" xmlns:cx3="http://schemas.microsoft.com/office/drawing/2016/5/9/chartex" xmlns:cx4="http://schemas.microsoft.com/office/drawing/2016/5/10/chartex" xmlns:cx5="http://schemas.microsoft.com/office/drawing/2016/5/11/chartex" xmlns:cx6="http://schemas.microsoft.com/office/drawing/2016/5/12/chartex" xmlns:cx7="http://schemas.microsoft.com/office/drawing/2016/5/13/chartex" xmlns:cx8="http://schemas.microsoft.com/office/drawing/2016/5/14/chartex" xmlns:mc="http://schemas.openxmlformats.org/markup-compatibility/2006" xmlns:aink="http://schemas.microsoft.com/office/drawing/2016/ink" xmlns:am3d="http://schemas.microsoft.com/office/drawing/2017/model3d" xmlns:o="urn:schemas-microsoft-com:office:office" xmlns:oel="http://schemas.microsoft.com/office/2019/extlst" xmlns:r="http://schemas.openxmlformats.org/officeDocument/2006/relationships" xmlns:m="http://schemas.openxmlformats.org/officeDocument/2006/math" xmlns:v="urn:schemas-microsoft-com:vml" xmlns:wp14="http://schemas.microsoft.com/office/word/2010/wordprocessingDrawing" xmlns:wp="http://schemas.openxmlformats.org/drawingml/2006/wordprocessingDrawing" xmlns:w10="urn:schemas-microsoft-com:office:word" xmlns:w="http://schemas.openxmlformats.org/wordprocessingml/2006/main" xmlns:w14="http://schemas.microsoft.com/office/word/2010/wordml" xmlns:w15="http://schemas.microsoft.com/office/word/2012/wordml" xmlns:w16cex="http://schemas.microsoft.com/office/word/2018/wordml/cex" xmlns:w16cid="http://schemas.microsoft.com/office/word/2016/wordml/cid" xmlns:w16="http://schemas.microsoft.com/office/word/2018/wordml" xmlns:w16du="http://schemas.microsoft.com/office/word/2023/wordml/word16du" xmlns:w16sdtdh="http://schemas.microsoft.com/office/word/2020/wordml/sdtdatahash" xmlns:w16se="http://schemas.microsoft.com/office/word/2015/wordml/symex" xmlns:wpg="http://schemas.microsoft.com/office/word/2010/wordprocessingGroup" xmlns:wpi="http://schemas.microsoft.com/office/word/2010/wordprocessingInk" xmlns:wne="http://schemas.microsoft.com/office/word/2006/wordml" xmlns:wps="http://schemas.microsoft.com/office/word/2010/wordprocessingShape" mc:Ignorable="w14 w15 w16se w16cid w16 w16cex w16sdtdh w16du wp14">
+<w:ftr xmlns:wpc="http://schemas.microsoft.com/office/word/2010/wordprocessingCanvas" xmlns:cx="http://schemas.microsoft.com/office/drawing/2014/chartex" xmlns:cx1="http://schemas.microsoft.com/office/drawing/2015/9/8/chartex" xmlns:cx2="http://schemas.microsoft.com/office/drawing/2015/10/21/chartex" xmlns:cx3="http://schemas.microsoft.com/office/drawing/2016/5/9/chartex" xmlns:cx4="http://schemas.microsoft.com/office/drawing/2016/5/10/chartex" xmlns:cx5="http://schemas.microsoft.com/office/drawing/2016/5/11/chartex" xmlns:cx6="http://schemas.microsoft.com/office/drawing/2016/5/12/chartex" xmlns:cx7="http://schemas.microsoft.com/office/drawing/2016/5/13/chartex" xmlns:cx8="http://schemas.microsoft.com/office/drawing/2016/5/14/chartex" xmlns:mc="http://schemas.openxmlformats.org/markup-compatibility/2006" xmlns:aink="http://schemas.microsoft.com/office/drawing/2016/ink" xmlns:am3d="http://schemas.microsoft.com/office/drawing/2017/model3d" xmlns:o="urn:schemas-microsoft-com:office:office" xmlns:oel="http://schemas.microsoft.com/office/2019/extlst" xmlns:r="http://schemas.openxmlformats.org/officeDocument/2006/relationships" xmlns:m="http://schemas.openxmlformats.org/officeDocument/2006/math" xmlns:v="urn:schemas-microsoft-com:vml" xmlns:wp14="http://schemas.microsoft.com/office/word/2010/wordprocessingDrawing" xmlns:wp="http://schemas.openxmlformats.org/drawingml/2006/wordprocessingDrawing" xmlns:w10="urn:schemas-microsoft-com:office:word" xmlns:w="http://schemas.openxmlformats.org/wordprocessingml/2006/main" xmlns:w14="http://schemas.microsoft.com/office/word/2010/wordml" xmlns:w15="http://schemas.microsoft.com/office/word/2012/wordml" xmlns:w16cex="http://schemas.microsoft.com/office/word/2018/wordml/cex" xmlns:w16cid="http://schemas.microsoft.com/office/word/2016/wordml/cid" xmlns:w16="http://schemas.microsoft.com/office/word/2018/wordml" xmlns:w16du="http://schemas.microsoft.com/office/word/2023/wordml/word16du" xmlns:w16sdtdh="http://schemas.microsoft.com/office/word/2020/wordml/sdtdatahash" xmlns:w16sdtfl="http://schemas.microsoft.com/office/word/2024/wordml/sdtformatlock" xmlns:w16se="http://schemas.microsoft.com/office/word/2015/wordml/symex" xmlns:wpg="http://schemas.microsoft.com/office/word/2010/wordprocessingGroup" xmlns:wpi="http://schemas.microsoft.com/office/word/2010/wordprocessingInk" xmlns:wne="http://schemas.microsoft.com/office/word/2006/wordml" xmlns:wps="http://schemas.microsoft.com/office/word/2010/wordprocessingShape" mc:Ignorable="w14 w15 w16se w16cid w16 w16cex w16sdtdh w16sdtfl w16du wp14">
   <w:p>
     <w:pPr>
-      <w:pStyle w:val="Corpotesto"/>
+      <w:pStyle w:val="BodyText"/>
       <w:spacing w:line="0" w:lineRule="atLeast"/>
     </w:pPr>
     <w:r>
@@ -9537,7 +9848,6 @@
                   </w:rPr>
                   <w:t xml:space="preserve"> </w:t>
                 </w:r>
-                <w:proofErr w:type="spellStart"/>
                 <w:r>
                   <w:rPr>
                     <w:rFonts w:ascii="Arial" w:hAnsi="Arial"/>
@@ -9549,7 +9859,6 @@
                   </w:rPr>
                   <w:t>Altamedica</w:t>
                 </w:r>
-                <w:proofErr w:type="spellEnd"/>
                 <w:r>
                   <w:rPr>
                     <w:rFonts w:ascii="Arial" w:hAnsi="Arial"/>
@@ -9705,10 +10014,10 @@
 </file>
 
 <file path=word/footer6.xml><?xml version="1.0" encoding="utf-8"?>
-<w:ftr xmlns:wpc="http://schemas.microsoft.com/office/word/2010/wordprocessingCanvas" xmlns:cx="http://schemas.microsoft.com/office/drawing/2014/chartex" xmlns:cx1="http://schemas.microsoft.com/office/drawing/2015/9/8/chartex" xmlns:cx2="http://schemas.microsoft.com/office/drawing/2015/10/21/chartex" xmlns:cx3="http://schemas.microsoft.com/office/drawing/2016/5/9/chartex" xmlns:cx4="http://schemas.microsoft.com/office/drawing/2016/5/10/chartex" xmlns:cx5="http://schemas.microsoft.com/office/drawing/2016/5/11/chartex" xmlns:cx6="http://schemas.microsoft.com/office/drawing/2016/5/12/chartex" xmlns:cx7="http://schemas.microsoft.com/office/drawing/2016/5/13/chartex" xmlns:cx8="http://schemas.microsoft.com/office/drawing/2016/5/14/chartex" xmlns:mc="http://schemas.openxmlformats.org/markup-compatibility/2006" xmlns:aink="http://schemas.microsoft.com/office/drawing/2016/ink" xmlns:am3d="http://schemas.microsoft.com/office/drawing/2017/model3d" xmlns:o="urn:schemas-microsoft-com:office:office" xmlns:oel="http://schemas.microsoft.com/office/2019/extlst" xmlns:r="http://schemas.openxmlformats.org/officeDocument/2006/relationships" xmlns:m="http://schemas.openxmlformats.org/officeDocument/2006/math" xmlns:v="urn:schemas-microsoft-com:vml" xmlns:wp14="http://schemas.microsoft.com/office/word/2010/wordprocessingDrawing" xmlns:wp="http://schemas.openxmlformats.org/drawingml/2006/wordprocessingDrawing" xmlns:w10="urn:schemas-microsoft-com:office:word" xmlns:w="http://schemas.openxmlformats.org/wordprocessingml/2006/main" xmlns:w14="http://schemas.microsoft.com/office/word/2010/wordml" xmlns:w15="http://schemas.microsoft.com/office/word/2012/wordml" xmlns:w16cex="http://schemas.microsoft.com/office/word/2018/wordml/cex" xmlns:w16cid="http://schemas.microsoft.com/office/word/2016/wordml/cid" xmlns:w16="http://schemas.microsoft.com/office/word/2018/wordml" xmlns:w16du="http://schemas.microsoft.com/office/word/2023/wordml/word16du" xmlns:w16sdtdh="http://schemas.microsoft.com/office/word/2020/wordml/sdtdatahash" xmlns:w16se="http://schemas.microsoft.com/office/word/2015/wordml/symex" xmlns:wpg="http://schemas.microsoft.com/office/word/2010/wordprocessingGroup" xmlns:wpi="http://schemas.microsoft.com/office/word/2010/wordprocessingInk" xmlns:wne="http://schemas.microsoft.com/office/word/2006/wordml" xmlns:wps="http://schemas.microsoft.com/office/word/2010/wordprocessingShape" mc:Ignorable="w14 w15 w16se w16cid w16 w16cex w16sdtdh w16du wp14">
+<w:ftr xmlns:wpc="http://schemas.microsoft.com/office/word/2010/wordprocessingCanvas" xmlns:cx="http://schemas.microsoft.com/office/drawing/2014/chartex" xmlns:cx1="http://schemas.microsoft.com/office/drawing/2015/9/8/chartex" xmlns:cx2="http://schemas.microsoft.com/office/drawing/2015/10/21/chartex" xmlns:cx3="http://schemas.microsoft.com/office/drawing/2016/5/9/chartex" xmlns:cx4="http://schemas.microsoft.com/office/drawing/2016/5/10/chartex" xmlns:cx5="http://schemas.microsoft.com/office/drawing/2016/5/11/chartex" xmlns:cx6="http://schemas.microsoft.com/office/drawing/2016/5/12/chartex" xmlns:cx7="http://schemas.microsoft.com/office/drawing/2016/5/13/chartex" xmlns:cx8="http://schemas.microsoft.com/office/drawing/2016/5/14/chartex" xmlns:mc="http://schemas.openxmlformats.org/markup-compatibility/2006" xmlns:aink="http://schemas.microsoft.com/office/drawing/2016/ink" xmlns:am3d="http://schemas.microsoft.com/office/drawing/2017/model3d" xmlns:o="urn:schemas-microsoft-com:office:office" xmlns:oel="http://schemas.microsoft.com/office/2019/extlst" xmlns:r="http://schemas.openxmlformats.org/officeDocument/2006/relationships" xmlns:m="http://schemas.openxmlformats.org/officeDocument/2006/math" xmlns:v="urn:schemas-microsoft-com:vml" xmlns:wp14="http://schemas.microsoft.com/office/word/2010/wordprocessingDrawing" xmlns:wp="http://schemas.openxmlformats.org/drawingml/2006/wordprocessingDrawing" xmlns:w10="urn:schemas-microsoft-com:office:word" xmlns:w="http://schemas.openxmlformats.org/wordprocessingml/2006/main" xmlns:w14="http://schemas.microsoft.com/office/word/2010/wordml" xmlns:w15="http://schemas.microsoft.com/office/word/2012/wordml" xmlns:w16cex="http://schemas.microsoft.com/office/word/2018/wordml/cex" xmlns:w16cid="http://schemas.microsoft.com/office/word/2016/wordml/cid" xmlns:w16="http://schemas.microsoft.com/office/word/2018/wordml" xmlns:w16du="http://schemas.microsoft.com/office/word/2023/wordml/word16du" xmlns:w16sdtdh="http://schemas.microsoft.com/office/word/2020/wordml/sdtdatahash" xmlns:w16sdtfl="http://schemas.microsoft.com/office/word/2024/wordml/sdtformatlock" xmlns:w16se="http://schemas.microsoft.com/office/word/2015/wordml/symex" xmlns:wpg="http://schemas.microsoft.com/office/word/2010/wordprocessingGroup" xmlns:wpi="http://schemas.microsoft.com/office/word/2010/wordprocessingInk" xmlns:wne="http://schemas.microsoft.com/office/word/2006/wordml" xmlns:wps="http://schemas.microsoft.com/office/word/2010/wordprocessingShape" mc:Ignorable="w14 w15 w16se w16cid w16 w16cex w16sdtdh w16sdtfl w16du wp14">
   <w:p>
     <w:pPr>
-      <w:pStyle w:val="Corpotesto"/>
+      <w:pStyle w:val="BodyText"/>
       <w:spacing w:line="0" w:lineRule="atLeast"/>
     </w:pPr>
     <w:r>
@@ -9847,7 +10156,6 @@
                   </w:rPr>
                   <w:t xml:space="preserve"> </w:t>
                 </w:r>
-                <w:proofErr w:type="spellStart"/>
                 <w:r>
                   <w:rPr>
                     <w:rFonts w:ascii="Arial" w:hAnsi="Arial"/>
@@ -9859,7 +10167,6 @@
                   </w:rPr>
                   <w:t>Altamedica</w:t>
                 </w:r>
-                <w:proofErr w:type="spellEnd"/>
                 <w:r>
                   <w:rPr>
                     <w:rFonts w:ascii="Arial" w:hAnsi="Arial"/>
@@ -10015,10 +10322,10 @@
 </file>
 
 <file path=word/footer7.xml><?xml version="1.0" encoding="utf-8"?>
-<w:ftr xmlns:wpc="http://schemas.microsoft.com/office/word/2010/wordprocessingCanvas" xmlns:cx="http://schemas.microsoft.com/office/drawing/2014/chartex" xmlns:cx1="http://schemas.microsoft.com/office/drawing/2015/9/8/chartex" xmlns:cx2="http://schemas.microsoft.com/office/drawing/2015/10/21/chartex" xmlns:cx3="http://schemas.microsoft.com/office/drawing/2016/5/9/chartex" xmlns:cx4="http://schemas.microsoft.com/office/drawing/2016/5/10/chartex" xmlns:cx5="http://schemas.microsoft.com/office/drawing/2016/5/11/chartex" xmlns:cx6="http://schemas.microsoft.com/office/drawing/2016/5/12/chartex" xmlns:cx7="http://schemas.microsoft.com/office/drawing/2016/5/13/chartex" xmlns:cx8="http://schemas.microsoft.com/office/drawing/2016/5/14/chartex" xmlns:mc="http://schemas.openxmlformats.org/markup-compatibility/2006" xmlns:aink="http://schemas.microsoft.com/office/drawing/2016/ink" xmlns:am3d="http://schemas.microsoft.com/office/drawing/2017/model3d" xmlns:o="urn:schemas-microsoft-com:office:office" xmlns:oel="http://schemas.microsoft.com/office/2019/extlst" xmlns:r="http://schemas.openxmlformats.org/officeDocument/2006/relationships" xmlns:m="http://schemas.openxmlformats.org/officeDocument/2006/math" xmlns:v="urn:schemas-microsoft-com:vml" xmlns:wp14="http://schemas.microsoft.com/office/word/2010/wordprocessingDrawing" xmlns:wp="http://schemas.openxmlformats.org/drawingml/2006/wordprocessingDrawing" xmlns:w10="urn:schemas-microsoft-com:office:word" xmlns:w="http://schemas.openxmlformats.org/wordprocessingml/2006/main" xmlns:w14="http://schemas.microsoft.com/office/word/2010/wordml" xmlns:w15="http://schemas.microsoft.com/office/word/2012/wordml" xmlns:w16cex="http://schemas.microsoft.com/office/word/2018/wordml/cex" xmlns:w16cid="http://schemas.microsoft.com/office/word/2016/wordml/cid" xmlns:w16="http://schemas.microsoft.com/office/word/2018/wordml" xmlns:w16du="http://schemas.microsoft.com/office/word/2023/wordml/word16du" xmlns:w16sdtdh="http://schemas.microsoft.com/office/word/2020/wordml/sdtdatahash" xmlns:w16se="http://schemas.microsoft.com/office/word/2015/wordml/symex" xmlns:wpg="http://schemas.microsoft.com/office/word/2010/wordprocessingGroup" xmlns:wpi="http://schemas.microsoft.com/office/word/2010/wordprocessingInk" xmlns:wne="http://schemas.microsoft.com/office/word/2006/wordml" xmlns:wps="http://schemas.microsoft.com/office/word/2010/wordprocessingShape" mc:Ignorable="w14 w15 w16se w16cid w16 w16cex w16sdtdh w16du wp14">
+<w:ftr xmlns:wpc="http://schemas.microsoft.com/office/word/2010/wordprocessingCanvas" xmlns:cx="http://schemas.microsoft.com/office/drawing/2014/chartex" xmlns:cx1="http://schemas.microsoft.com/office/drawing/2015/9/8/chartex" xmlns:cx2="http://schemas.microsoft.com/office/drawing/2015/10/21/chartex" xmlns:cx3="http://schemas.microsoft.com/office/drawing/2016/5/9/chartex" xmlns:cx4="http://schemas.microsoft.com/office/drawing/2016/5/10/chartex" xmlns:cx5="http://schemas.microsoft.com/office/drawing/2016/5/11/chartex" xmlns:cx6="http://schemas.microsoft.com/office/drawing/2016/5/12/chartex" xmlns:cx7="http://schemas.microsoft.com/office/drawing/2016/5/13/chartex" xmlns:cx8="http://schemas.microsoft.com/office/drawing/2016/5/14/chartex" xmlns:mc="http://schemas.openxmlformats.org/markup-compatibility/2006" xmlns:aink="http://schemas.microsoft.com/office/drawing/2016/ink" xmlns:am3d="http://schemas.microsoft.com/office/drawing/2017/model3d" xmlns:o="urn:schemas-microsoft-com:office:office" xmlns:oel="http://schemas.microsoft.com/office/2019/extlst" xmlns:r="http://schemas.openxmlformats.org/officeDocument/2006/relationships" xmlns:m="http://schemas.openxmlformats.org/officeDocument/2006/math" xmlns:v="urn:schemas-microsoft-com:vml" xmlns:wp14="http://schemas.microsoft.com/office/word/2010/wordprocessingDrawing" xmlns:wp="http://schemas.openxmlformats.org/drawingml/2006/wordprocessingDrawing" xmlns:w10="urn:schemas-microsoft-com:office:word" xmlns:w="http://schemas.openxmlformats.org/wordprocessingml/2006/main" xmlns:w14="http://schemas.microsoft.com/office/word/2010/wordml" xmlns:w15="http://schemas.microsoft.com/office/word/2012/wordml" xmlns:w16cex="http://schemas.microsoft.com/office/word/2018/wordml/cex" xmlns:w16cid="http://schemas.microsoft.com/office/word/2016/wordml/cid" xmlns:w16="http://schemas.microsoft.com/office/word/2018/wordml" xmlns:w16du="http://schemas.microsoft.com/office/word/2023/wordml/word16du" xmlns:w16sdtdh="http://schemas.microsoft.com/office/word/2020/wordml/sdtdatahash" xmlns:w16sdtfl="http://schemas.microsoft.com/office/word/2024/wordml/sdtformatlock" xmlns:w16se="http://schemas.microsoft.com/office/word/2015/wordml/symex" xmlns:wpg="http://schemas.microsoft.com/office/word/2010/wordprocessingGroup" xmlns:wpi="http://schemas.microsoft.com/office/word/2010/wordprocessingInk" xmlns:wne="http://schemas.microsoft.com/office/word/2006/wordml" xmlns:wps="http://schemas.microsoft.com/office/word/2010/wordprocessingShape" mc:Ignorable="w14 w15 w16se w16cid w16 w16cex w16sdtdh w16sdtfl w16du wp14">
   <w:p>
     <w:pPr>
-      <w:pStyle w:val="Corpotesto"/>
+      <w:pStyle w:val="BodyText"/>
       <w:spacing w:line="0" w:lineRule="atLeast"/>
     </w:pPr>
     <w:r>
@@ -10157,7 +10464,6 @@
                   </w:rPr>
                   <w:t xml:space="preserve"> </w:t>
                 </w:r>
-                <w:proofErr w:type="spellStart"/>
                 <w:r>
                   <w:rPr>
                     <w:rFonts w:ascii="Arial" w:hAnsi="Arial"/>
@@ -10169,7 +10475,6 @@
                   </w:rPr>
                   <w:t>Altamedica</w:t>
                 </w:r>
-                <w:proofErr w:type="spellEnd"/>
                 <w:r>
                   <w:rPr>
                     <w:rFonts w:ascii="Arial" w:hAnsi="Arial"/>
@@ -10325,10 +10630,10 @@
 </file>
 
 <file path=word/footer8.xml><?xml version="1.0" encoding="utf-8"?>
-<w:ftr xmlns:wpc="http://schemas.microsoft.com/office/word/2010/wordprocessingCanvas" xmlns:cx="http://schemas.microsoft.com/office/drawing/2014/chartex" xmlns:cx1="http://schemas.microsoft.com/office/drawing/2015/9/8/chartex" xmlns:cx2="http://schemas.microsoft.com/office/drawing/2015/10/21/chartex" xmlns:cx3="http://schemas.microsoft.com/office/drawing/2016/5/9/chartex" xmlns:cx4="http://schemas.microsoft.com/office/drawing/2016/5/10/chartex" xmlns:cx5="http://schemas.microsoft.com/office/drawing/2016/5/11/chartex" xmlns:cx6="http://schemas.microsoft.com/office/drawing/2016/5/12/chartex" xmlns:cx7="http://schemas.microsoft.com/office/drawing/2016/5/13/chartex" xmlns:cx8="http://schemas.microsoft.com/office/drawing/2016/5/14/chartex" xmlns:mc="http://schemas.openxmlformats.org/markup-compatibility/2006" xmlns:aink="http://schemas.microsoft.com/office/drawing/2016/ink" xmlns:am3d="http://schemas.microsoft.com/office/drawing/2017/model3d" xmlns:o="urn:schemas-microsoft-com:office:office" xmlns:oel="http://schemas.microsoft.com/office/2019/extlst" xmlns:r="http://schemas.openxmlformats.org/officeDocument/2006/relationships" xmlns:m="http://schemas.openxmlformats.org/officeDocument/2006/math" xmlns:v="urn:schemas-microsoft-com:vml" xmlns:wp14="http://schemas.microsoft.com/office/word/2010/wordprocessingDrawing" xmlns:wp="http://schemas.openxmlformats.org/drawingml/2006/wordprocessingDrawing" xmlns:w10="urn:schemas-microsoft-com:office:word" xmlns:w="http://schemas.openxmlformats.org/wordprocessingml/2006/main" xmlns:w14="http://schemas.microsoft.com/office/word/2010/wordml" xmlns:w15="http://schemas.microsoft.com/office/word/2012/wordml" xmlns:w16cex="http://schemas.microsoft.com/office/word/2018/wordml/cex" xmlns:w16cid="http://schemas.microsoft.com/office/word/2016/wordml/cid" xmlns:w16="http://schemas.microsoft.com/office/word/2018/wordml" xmlns:w16du="http://schemas.microsoft.com/office/word/2023/wordml/word16du" xmlns:w16sdtdh="http://schemas.microsoft.com/office/word/2020/wordml/sdtdatahash" xmlns:w16se="http://schemas.microsoft.com/office/word/2015/wordml/symex" xmlns:wpg="http://schemas.microsoft.com/office/word/2010/wordprocessingGroup" xmlns:wpi="http://schemas.microsoft.com/office/word/2010/wordprocessingInk" xmlns:wne="http://schemas.microsoft.com/office/word/2006/wordml" xmlns:wps="http://schemas.microsoft.com/office/word/2010/wordprocessingShape" mc:Ignorable="w14 w15 w16se w16cid w16 w16cex w16sdtdh w16du wp14">
+<w:ftr xmlns:wpc="http://schemas.microsoft.com/office/word/2010/wordprocessingCanvas" xmlns:cx="http://schemas.microsoft.com/office/drawing/2014/chartex" xmlns:cx1="http://schemas.microsoft.com/office/drawing/2015/9/8/chartex" xmlns:cx2="http://schemas.microsoft.com/office/drawing/2015/10/21/chartex" xmlns:cx3="http://schemas.microsoft.com/office/drawing/2016/5/9/chartex" xmlns:cx4="http://schemas.microsoft.com/office/drawing/2016/5/10/chartex" xmlns:cx5="http://schemas.microsoft.com/office/drawing/2016/5/11/chartex" xmlns:cx6="http://schemas.microsoft.com/office/drawing/2016/5/12/chartex" xmlns:cx7="http://schemas.microsoft.com/office/drawing/2016/5/13/chartex" xmlns:cx8="http://schemas.microsoft.com/office/drawing/2016/5/14/chartex" xmlns:mc="http://schemas.openxmlformats.org/markup-compatibility/2006" xmlns:aink="http://schemas.microsoft.com/office/drawing/2016/ink" xmlns:am3d="http://schemas.microsoft.com/office/drawing/2017/model3d" xmlns:o="urn:schemas-microsoft-com:office:office" xmlns:oel="http://schemas.microsoft.com/office/2019/extlst" xmlns:r="http://schemas.openxmlformats.org/officeDocument/2006/relationships" xmlns:m="http://schemas.openxmlformats.org/officeDocument/2006/math" xmlns:v="urn:schemas-microsoft-com:vml" xmlns:wp14="http://schemas.microsoft.com/office/word/2010/wordprocessingDrawing" xmlns:wp="http://schemas.openxmlformats.org/drawingml/2006/wordprocessingDrawing" xmlns:w10="urn:schemas-microsoft-com:office:word" xmlns:w="http://schemas.openxmlformats.org/wordprocessingml/2006/main" xmlns:w14="http://schemas.microsoft.com/office/word/2010/wordml" xmlns:w15="http://schemas.microsoft.com/office/word/2012/wordml" xmlns:w16cex="http://schemas.microsoft.com/office/word/2018/wordml/cex" xmlns:w16cid="http://schemas.microsoft.com/office/word/2016/wordml/cid" xmlns:w16="http://schemas.microsoft.com/office/word/2018/wordml" xmlns:w16du="http://schemas.microsoft.com/office/word/2023/wordml/word16du" xmlns:w16sdtdh="http://schemas.microsoft.com/office/word/2020/wordml/sdtdatahash" xmlns:w16sdtfl="http://schemas.microsoft.com/office/word/2024/wordml/sdtformatlock" xmlns:w16se="http://schemas.microsoft.com/office/word/2015/wordml/symex" xmlns:wpg="http://schemas.microsoft.com/office/word/2010/wordprocessingGroup" xmlns:wpi="http://schemas.microsoft.com/office/word/2010/wordprocessingInk" xmlns:wne="http://schemas.microsoft.com/office/word/2006/wordml" xmlns:wps="http://schemas.microsoft.com/office/word/2010/wordprocessingShape" mc:Ignorable="w14 w15 w16se w16cid w16 w16cex w16sdtdh w16sdtfl w16du wp14">
   <w:p>
     <w:pPr>
-      <w:pStyle w:val="Corpotesto"/>
+      <w:pStyle w:val="BodyText"/>
       <w:spacing w:line="0" w:lineRule="atLeast"/>
     </w:pPr>
     <w:r>
@@ -10467,7 +10772,6 @@
                   </w:rPr>
                   <w:t xml:space="preserve"> </w:t>
                 </w:r>
-                <w:proofErr w:type="spellStart"/>
                 <w:r>
                   <w:rPr>
                     <w:rFonts w:ascii="Arial" w:hAnsi="Arial"/>
@@ -10479,7 +10783,6 @@
                   </w:rPr>
                   <w:t>Altamedica</w:t>
                 </w:r>
-                <w:proofErr w:type="spellEnd"/>
                 <w:r>
                   <w:rPr>
                     <w:rFonts w:ascii="Arial" w:hAnsi="Arial"/>
@@ -10635,10 +10938,10 @@
 </file>
 
 <file path=word/footer9.xml><?xml version="1.0" encoding="utf-8"?>
-<w:ftr xmlns:wpc="http://schemas.microsoft.com/office/word/2010/wordprocessingCanvas" xmlns:cx="http://schemas.microsoft.com/office/drawing/2014/chartex" xmlns:cx1="http://schemas.microsoft.com/office/drawing/2015/9/8/chartex" xmlns:cx2="http://schemas.microsoft.com/office/drawing/2015/10/21/chartex" xmlns:cx3="http://schemas.microsoft.com/office/drawing/2016/5/9/chartex" xmlns:cx4="http://schemas.microsoft.com/office/drawing/2016/5/10/chartex" xmlns:cx5="http://schemas.microsoft.com/office/drawing/2016/5/11/chartex" xmlns:cx6="http://schemas.microsoft.com/office/drawing/2016/5/12/chartex" xmlns:cx7="http://schemas.microsoft.com/office/drawing/2016/5/13/chartex" xmlns:cx8="http://schemas.microsoft.com/office/drawing/2016/5/14/chartex" xmlns:mc="http://schemas.openxmlformats.org/markup-compatibility/2006" xmlns:aink="http://schemas.microsoft.com/office/drawing/2016/ink" xmlns:am3d="http://schemas.microsoft.com/office/drawing/2017/model3d" xmlns:o="urn:schemas-microsoft-com:office:office" xmlns:oel="http://schemas.microsoft.com/office/2019/extlst" xmlns:r="http://schemas.openxmlformats.org/officeDocument/2006/relationships" xmlns:m="http://schemas.openxmlformats.org/officeDocument/2006/math" xmlns:v="urn:schemas-microsoft-com:vml" xmlns:wp14="http://schemas.microsoft.com/office/word/2010/wordprocessingDrawing" xmlns:wp="http://schemas.openxmlformats.org/drawingml/2006/wordprocessingDrawing" xmlns:w10="urn:schemas-microsoft-com:office:word" xmlns:w="http://schemas.openxmlformats.org/wordprocessingml/2006/main" xmlns:w14="http://schemas.microsoft.com/office/word/2010/wordml" xmlns:w15="http://schemas.microsoft.com/office/word/2012/wordml" xmlns:w16cex="http://schemas.microsoft.com/office/word/2018/wordml/cex" xmlns:w16cid="http://schemas.microsoft.com/office/word/2016/wordml/cid" xmlns:w16="http://schemas.microsoft.com/office/word/2018/wordml" xmlns:w16du="http://schemas.microsoft.com/office/word/2023/wordml/word16du" xmlns:w16sdtdh="http://schemas.microsoft.com/office/word/2020/wordml/sdtdatahash" xmlns:w16se="http://schemas.microsoft.com/office/word/2015/wordml/symex" xmlns:wpg="http://schemas.microsoft.com/office/word/2010/wordprocessingGroup" xmlns:wpi="http://schemas.microsoft.com/office/word/2010/wordprocessingInk" xmlns:wne="http://schemas.microsoft.com/office/word/2006/wordml" xmlns:wps="http://schemas.microsoft.com/office/word/2010/wordprocessingShape" mc:Ignorable="w14 w15 w16se w16cid w16 w16cex w16sdtdh w16du wp14">
+<w:ftr xmlns:wpc="http://schemas.microsoft.com/office/word/2010/wordprocessingCanvas" xmlns:cx="http://schemas.microsoft.com/office/drawing/2014/chartex" xmlns:cx1="http://schemas.microsoft.com/office/drawing/2015/9/8/chartex" xmlns:cx2="http://schemas.microsoft.com/office/drawing/2015/10/21/chartex" xmlns:cx3="http://schemas.microsoft.com/office/drawing/2016/5/9/chartex" xmlns:cx4="http://schemas.microsoft.com/office/drawing/2016/5/10/chartex" xmlns:cx5="http://schemas.microsoft.com/office/drawing/2016/5/11/chartex" xmlns:cx6="http://schemas.microsoft.com/office/drawing/2016/5/12/chartex" xmlns:cx7="http://schemas.microsoft.com/office/drawing/2016/5/13/chartex" xmlns:cx8="http://schemas.microsoft.com/office/drawing/2016/5/14/chartex" xmlns:mc="http://schemas.openxmlformats.org/markup-compatibility/2006" xmlns:aink="http://schemas.microsoft.com/office/drawing/2016/ink" xmlns:am3d="http://schemas.microsoft.com/office/drawing/2017/model3d" xmlns:o="urn:schemas-microsoft-com:office:office" xmlns:oel="http://schemas.microsoft.com/office/2019/extlst" xmlns:r="http://schemas.openxmlformats.org/officeDocument/2006/relationships" xmlns:m="http://schemas.openxmlformats.org/officeDocument/2006/math" xmlns:v="urn:schemas-microsoft-com:vml" xmlns:wp14="http://schemas.microsoft.com/office/word/2010/wordprocessingDrawing" xmlns:wp="http://schemas.openxmlformats.org/drawingml/2006/wordprocessingDrawing" xmlns:w10="urn:schemas-microsoft-com:office:word" xmlns:w="http://schemas.openxmlformats.org/wordprocessingml/2006/main" xmlns:w14="http://schemas.microsoft.com/office/word/2010/wordml" xmlns:w15="http://schemas.microsoft.com/office/word/2012/wordml" xmlns:w16cex="http://schemas.microsoft.com/office/word/2018/wordml/cex" xmlns:w16cid="http://schemas.microsoft.com/office/word/2016/wordml/cid" xmlns:w16="http://schemas.microsoft.com/office/word/2018/wordml" xmlns:w16du="http://schemas.microsoft.com/office/word/2023/wordml/word16du" xmlns:w16sdtdh="http://schemas.microsoft.com/office/word/2020/wordml/sdtdatahash" xmlns:w16sdtfl="http://schemas.microsoft.com/office/word/2024/wordml/sdtformatlock" xmlns:w16se="http://schemas.microsoft.com/office/word/2015/wordml/symex" xmlns:wpg="http://schemas.microsoft.com/office/word/2010/wordprocessingGroup" xmlns:wpi="http://schemas.microsoft.com/office/word/2010/wordprocessingInk" xmlns:wne="http://schemas.microsoft.com/office/word/2006/wordml" xmlns:wps="http://schemas.microsoft.com/office/word/2010/wordprocessingShape" mc:Ignorable="w14 w15 w16se w16cid w16 w16cex w16sdtdh w16sdtfl w16du wp14">
   <w:p>
     <w:pPr>
-      <w:pStyle w:val="Corpotesto"/>
+      <w:pStyle w:val="BodyText"/>
       <w:spacing w:line="0" w:lineRule="atLeast"/>
     </w:pPr>
     <w:r>
@@ -10777,7 +11080,6 @@
                   </w:rPr>
                   <w:t xml:space="preserve"> </w:t>
                 </w:r>
-                <w:proofErr w:type="spellStart"/>
                 <w:r>
                   <w:rPr>
                     <w:rFonts w:ascii="Arial" w:hAnsi="Arial"/>
@@ -10789,7 +11091,6 @@
                   </w:rPr>
                   <w:t>Altamedica</w:t>
                 </w:r>
-                <w:proofErr w:type="spellEnd"/>
                 <w:r>
                   <w:rPr>
                     <w:rFonts w:ascii="Arial" w:hAnsi="Arial"/>
@@ -10945,7 +11246,7 @@
 </file>
 
 <file path=word/footnotes.xml><?xml version="1.0" encoding="utf-8"?>
-<w:footnotes xmlns:wpc="http://schemas.microsoft.com/office/word/2010/wordprocessingCanvas" xmlns:cx="http://schemas.microsoft.com/office/drawing/2014/chartex" xmlns:cx1="http://schemas.microsoft.com/office/drawing/2015/9/8/chartex" xmlns:cx2="http://schemas.microsoft.com/office/drawing/2015/10/21/chartex" xmlns:cx3="http://schemas.microsoft.com/office/drawing/2016/5/9/chartex" xmlns:cx4="http://schemas.microsoft.com/office/drawing/2016/5/10/chartex" xmlns:cx5="http://schemas.microsoft.com/office/drawing/2016/5/11/chartex" xmlns:cx6="http://schemas.microsoft.com/office/drawing/2016/5/12/chartex" xmlns:cx7="http://schemas.microsoft.com/office/drawing/2016/5/13/chartex" xmlns:cx8="http://schemas.microsoft.com/office/drawing/2016/5/14/chartex" xmlns:mc="http://schemas.openxmlformats.org/markup-compatibility/2006" xmlns:aink="http://schemas.microsoft.com/office/drawing/2016/ink" xmlns:am3d="http://schemas.microsoft.com/office/drawing/2017/model3d" xmlns:o="urn:schemas-microsoft-com:office:office" xmlns:oel="http://schemas.microsoft.com/office/2019/extlst" xmlns:r="http://schemas.openxmlformats.org/officeDocument/2006/relationships" xmlns:m="http://schemas.openxmlformats.org/officeDocument/2006/math" xmlns:v="urn:schemas-microsoft-com:vml" xmlns:wp14="http://schemas.microsoft.com/office/word/2010/wordprocessingDrawing" xmlns:wp="http://schemas.openxmlformats.org/drawingml/2006/wordprocessingDrawing" xmlns:w10="urn:schemas-microsoft-com:office:word" xmlns:w="http://schemas.openxmlformats.org/wordprocessingml/2006/main" xmlns:w14="http://schemas.microsoft.com/office/word/2010/wordml" xmlns:w15="http://schemas.microsoft.com/office/word/2012/wordml" xmlns:w16cex="http://schemas.microsoft.com/office/word/2018/wordml/cex" xmlns:w16cid="http://schemas.microsoft.com/office/word/2016/wordml/cid" xmlns:w16="http://schemas.microsoft.com/office/word/2018/wordml" xmlns:w16du="http://schemas.microsoft.com/office/word/2023/wordml/word16du" xmlns:w16sdtdh="http://schemas.microsoft.com/office/word/2020/wordml/sdtdatahash" xmlns:w16se="http://schemas.microsoft.com/office/word/2015/wordml/symex" xmlns:wpg="http://schemas.microsoft.com/office/word/2010/wordprocessingGroup" xmlns:wpi="http://schemas.microsoft.com/office/word/2010/wordprocessingInk" xmlns:wne="http://schemas.microsoft.com/office/word/2006/wordml" xmlns:wps="http://schemas.microsoft.com/office/word/2010/wordprocessingShape" mc:Ignorable="w14 w15 w16se w16cid w16 w16cex w16sdtdh w16du wp14">
+<w:footnotes xmlns:wpc="http://schemas.microsoft.com/office/word/2010/wordprocessingCanvas" xmlns:cx="http://schemas.microsoft.com/office/drawing/2014/chartex" xmlns:cx1="http://schemas.microsoft.com/office/drawing/2015/9/8/chartex" xmlns:cx2="http://schemas.microsoft.com/office/drawing/2015/10/21/chartex" xmlns:cx3="http://schemas.microsoft.com/office/drawing/2016/5/9/chartex" xmlns:cx4="http://schemas.microsoft.com/office/drawing/2016/5/10/chartex" xmlns:cx5="http://schemas.microsoft.com/office/drawing/2016/5/11/chartex" xmlns:cx6="http://schemas.microsoft.com/office/drawing/2016/5/12/chartex" xmlns:cx7="http://schemas.microsoft.com/office/drawing/2016/5/13/chartex" xmlns:cx8="http://schemas.microsoft.com/office/drawing/2016/5/14/chartex" xmlns:mc="http://schemas.openxmlformats.org/markup-compatibility/2006" xmlns:aink="http://schemas.microsoft.com/office/drawing/2016/ink" xmlns:am3d="http://schemas.microsoft.com/office/drawing/2017/model3d" xmlns:o="urn:schemas-microsoft-com:office:office" xmlns:oel="http://schemas.microsoft.com/office/2019/extlst" xmlns:r="http://schemas.openxmlformats.org/officeDocument/2006/relationships" xmlns:m="http://schemas.openxmlformats.org/officeDocument/2006/math" xmlns:v="urn:schemas-microsoft-com:vml" xmlns:wp14="http://schemas.microsoft.com/office/word/2010/wordprocessingDrawing" xmlns:wp="http://schemas.openxmlformats.org/drawingml/2006/wordprocessingDrawing" xmlns:w10="urn:schemas-microsoft-com:office:word" xmlns:w="http://schemas.openxmlformats.org/wordprocessingml/2006/main" xmlns:w14="http://schemas.microsoft.com/office/word/2010/wordml" xmlns:w15="http://schemas.microsoft.com/office/word/2012/wordml" xmlns:w16cex="http://schemas.microsoft.com/office/word/2018/wordml/cex" xmlns:w16cid="http://schemas.microsoft.com/office/word/2016/wordml/cid" xmlns:w16="http://schemas.microsoft.com/office/word/2018/wordml" xmlns:w16du="http://schemas.microsoft.com/office/word/2023/wordml/word16du" xmlns:w16sdtdh="http://schemas.microsoft.com/office/word/2020/wordml/sdtdatahash" xmlns:w16sdtfl="http://schemas.microsoft.com/office/word/2024/wordml/sdtformatlock" xmlns:w16se="http://schemas.microsoft.com/office/word/2015/wordml/symex" xmlns:wpg="http://schemas.microsoft.com/office/word/2010/wordprocessingGroup" xmlns:wpi="http://schemas.microsoft.com/office/word/2010/wordprocessingInk" xmlns:wne="http://schemas.microsoft.com/office/word/2006/wordml" xmlns:wps="http://schemas.microsoft.com/office/word/2010/wordprocessingShape" mc:Ignorable="w14 w15 w16se w16cid w16 w16cex w16sdtdh w16sdtfl w16du wp14">
   <w:footnote w:type="separator" w:id="-1">
     <w:p>
       <w:r>
@@ -10964,20 +11265,20 @@
 </file>
 
 <file path=word/header1.xml><?xml version="1.0" encoding="utf-8"?>
-<w:hdr xmlns:wpc="http://schemas.microsoft.com/office/word/2010/wordprocessingCanvas" xmlns:cx="http://schemas.microsoft.com/office/drawing/2014/chartex" xmlns:cx1="http://schemas.microsoft.com/office/drawing/2015/9/8/chartex" xmlns:cx2="http://schemas.microsoft.com/office/drawing/2015/10/21/chartex" xmlns:cx3="http://schemas.microsoft.com/office/drawing/2016/5/9/chartex" xmlns:cx4="http://schemas.microsoft.com/office/drawing/2016/5/10/chartex" xmlns:cx5="http://schemas.microsoft.com/office/drawing/2016/5/11/chartex" xmlns:cx6="http://schemas.microsoft.com/office/drawing/2016/5/12/chartex" xmlns:cx7="http://schemas.microsoft.com/office/drawing/2016/5/13/chartex" xmlns:cx8="http://schemas.microsoft.com/office/drawing/2016/5/14/chartex" xmlns:mc="http://schemas.openxmlformats.org/markup-compatibility/2006" xmlns:aink="http://schemas.microsoft.com/office/drawing/2016/ink" xmlns:am3d="http://schemas.microsoft.com/office/drawing/2017/model3d" xmlns:o="urn:schemas-microsoft-com:office:office" xmlns:oel="http://schemas.microsoft.com/office/2019/extlst" xmlns:r="http://schemas.openxmlformats.org/officeDocument/2006/relationships" xmlns:m="http://schemas.openxmlformats.org/officeDocument/2006/math" xmlns:v="urn:schemas-microsoft-com:vml" xmlns:wp14="http://schemas.microsoft.com/office/word/2010/wordprocessingDrawing" xmlns:wp="http://schemas.openxmlformats.org/drawingml/2006/wordprocessingDrawing" xmlns:w10="urn:schemas-microsoft-com:office:word" xmlns:w="http://schemas.openxmlformats.org/wordprocessingml/2006/main" xmlns:w14="http://schemas.microsoft.com/office/word/2010/wordml" xmlns:w15="http://schemas.microsoft.com/office/word/2012/wordml" xmlns:w16cex="http://schemas.microsoft.com/office/word/2018/wordml/cex" xmlns:w16cid="http://schemas.microsoft.com/office/word/2016/wordml/cid" xmlns:w16="http://schemas.microsoft.com/office/word/2018/wordml" xmlns:w16du="http://schemas.microsoft.com/office/word/2023/wordml/word16du" xmlns:w16sdtdh="http://schemas.microsoft.com/office/word/2020/wordml/sdtdatahash" xmlns:w16se="http://schemas.microsoft.com/office/word/2015/wordml/symex" xmlns:wpg="http://schemas.microsoft.com/office/word/2010/wordprocessingGroup" xmlns:wpi="http://schemas.microsoft.com/office/word/2010/wordprocessingInk" xmlns:wne="http://schemas.microsoft.com/office/word/2006/wordml" xmlns:wps="http://schemas.microsoft.com/office/word/2010/wordprocessingShape" mc:Ignorable="w14 w15 w16se w16cid w16 w16cex w16sdtdh w16du wp14">
+<w:hdr xmlns:wpc="http://schemas.microsoft.com/office/word/2010/wordprocessingCanvas" xmlns:cx="http://schemas.microsoft.com/office/drawing/2014/chartex" xmlns:cx1="http://schemas.microsoft.com/office/drawing/2015/9/8/chartex" xmlns:cx2="http://schemas.microsoft.com/office/drawing/2015/10/21/chartex" xmlns:cx3="http://schemas.microsoft.com/office/drawing/2016/5/9/chartex" xmlns:cx4="http://schemas.microsoft.com/office/drawing/2016/5/10/chartex" xmlns:cx5="http://schemas.microsoft.com/office/drawing/2016/5/11/chartex" xmlns:cx6="http://schemas.microsoft.com/office/drawing/2016/5/12/chartex" xmlns:cx7="http://schemas.microsoft.com/office/drawing/2016/5/13/chartex" xmlns:cx8="http://schemas.microsoft.com/office/drawing/2016/5/14/chartex" xmlns:mc="http://schemas.openxmlformats.org/markup-compatibility/2006" xmlns:aink="http://schemas.microsoft.com/office/drawing/2016/ink" xmlns:am3d="http://schemas.microsoft.com/office/drawing/2017/model3d" xmlns:o="urn:schemas-microsoft-com:office:office" xmlns:oel="http://schemas.microsoft.com/office/2019/extlst" xmlns:r="http://schemas.openxmlformats.org/officeDocument/2006/relationships" xmlns:m="http://schemas.openxmlformats.org/officeDocument/2006/math" xmlns:v="urn:schemas-microsoft-com:vml" xmlns:wp14="http://schemas.microsoft.com/office/word/2010/wordprocessingDrawing" xmlns:wp="http://schemas.openxmlformats.org/drawingml/2006/wordprocessingDrawing" xmlns:w10="urn:schemas-microsoft-com:office:word" xmlns:w="http://schemas.openxmlformats.org/wordprocessingml/2006/main" xmlns:w14="http://schemas.microsoft.com/office/word/2010/wordml" xmlns:w15="http://schemas.microsoft.com/office/word/2012/wordml" xmlns:w16cex="http://schemas.microsoft.com/office/word/2018/wordml/cex" xmlns:w16cid="http://schemas.microsoft.com/office/word/2016/wordml/cid" xmlns:w16="http://schemas.microsoft.com/office/word/2018/wordml" xmlns:w16du="http://schemas.microsoft.com/office/word/2023/wordml/word16du" xmlns:w16sdtdh="http://schemas.microsoft.com/office/word/2020/wordml/sdtdatahash" xmlns:w16sdtfl="http://schemas.microsoft.com/office/word/2024/wordml/sdtformatlock" xmlns:w16se="http://schemas.microsoft.com/office/word/2015/wordml/symex" xmlns:wpg="http://schemas.microsoft.com/office/word/2010/wordprocessingGroup" xmlns:wpi="http://schemas.microsoft.com/office/word/2010/wordprocessingInk" xmlns:wne="http://schemas.microsoft.com/office/word/2006/wordml" xmlns:wps="http://schemas.microsoft.com/office/word/2010/wordprocessingShape" mc:Ignorable="w14 w15 w16se w16cid w16 w16cex w16sdtdh w16sdtfl w16du wp14">
   <w:p>
     <w:pPr>
-      <w:pStyle w:val="Intestazione"/>
+      <w:pStyle w:val="Header"/>
     </w:pPr>
   </w:p>
 </w:hdr>
 </file>
 
 <file path=word/header2.xml><?xml version="1.0" encoding="utf-8"?>
-<w:hdr xmlns:wpc="http://schemas.microsoft.com/office/word/2010/wordprocessingCanvas" xmlns:cx="http://schemas.microsoft.com/office/drawing/2014/chartex" xmlns:cx1="http://schemas.microsoft.com/office/drawing/2015/9/8/chartex" xmlns:cx2="http://schemas.microsoft.com/office/drawing/2015/10/21/chartex" xmlns:cx3="http://schemas.microsoft.com/office/drawing/2016/5/9/chartex" xmlns:cx4="http://schemas.microsoft.com/office/drawing/2016/5/10/chartex" xmlns:cx5="http://schemas.microsoft.com/office/drawing/2016/5/11/chartex" xmlns:cx6="http://schemas.microsoft.com/office/drawing/2016/5/12/chartex" xmlns:cx7="http://schemas.microsoft.com/office/drawing/2016/5/13/chartex" xmlns:cx8="http://schemas.microsoft.com/office/drawing/2016/5/14/chartex" xmlns:mc="http://schemas.openxmlformats.org/markup-compatibility/2006" xmlns:aink="http://schemas.microsoft.com/office/drawing/2016/ink" xmlns:am3d="http://schemas.microsoft.com/office/drawing/2017/model3d" xmlns:o="urn:schemas-microsoft-com:office:office" xmlns:oel="http://schemas.microsoft.com/office/2019/extlst" xmlns:r="http://schemas.openxmlformats.org/officeDocument/2006/relationships" xmlns:m="http://schemas.openxmlformats.org/officeDocument/2006/math" xmlns:v="urn:schemas-microsoft-com:vml" xmlns:wp14="http://schemas.microsoft.com/office/word/2010/wordprocessingDrawing" xmlns:wp="http://schemas.openxmlformats.org/drawingml/2006/wordprocessingDrawing" xmlns:w10="urn:schemas-microsoft-com:office:word" xmlns:w="http://schemas.openxmlformats.org/wordprocessingml/2006/main" xmlns:w14="http://schemas.microsoft.com/office/word/2010/wordml" xmlns:w15="http://schemas.microsoft.com/office/word/2012/wordml" xmlns:w16cex="http://schemas.microsoft.com/office/word/2018/wordml/cex" xmlns:w16cid="http://schemas.microsoft.com/office/word/2016/wordml/cid" xmlns:w16="http://schemas.microsoft.com/office/word/2018/wordml" xmlns:w16du="http://schemas.microsoft.com/office/word/2023/wordml/word16du" xmlns:w16sdtdh="http://schemas.microsoft.com/office/word/2020/wordml/sdtdatahash" xmlns:w16se="http://schemas.microsoft.com/office/word/2015/wordml/symex" xmlns:wpg="http://schemas.microsoft.com/office/word/2010/wordprocessingGroup" xmlns:wpi="http://schemas.microsoft.com/office/word/2010/wordprocessingInk" xmlns:wne="http://schemas.microsoft.com/office/word/2006/wordml" xmlns:wps="http://schemas.microsoft.com/office/word/2010/wordprocessingShape" mc:Ignorable="w14 w15 w16se w16cid w16 w16cex w16sdtdh w16du wp14">
+<w:hdr xmlns:wpc="http://schemas.microsoft.com/office/word/2010/wordprocessingCanvas" xmlns:cx="http://schemas.microsoft.com/office/drawing/2014/chartex" xmlns:cx1="http://schemas.microsoft.com/office/drawing/2015/9/8/chartex" xmlns:cx2="http://schemas.microsoft.com/office/drawing/2015/10/21/chartex" xmlns:cx3="http://schemas.microsoft.com/office/drawing/2016/5/9/chartex" xmlns:cx4="http://schemas.microsoft.com/office/drawing/2016/5/10/chartex" xmlns:cx5="http://schemas.microsoft.com/office/drawing/2016/5/11/chartex" xmlns:cx6="http://schemas.microsoft.com/office/drawing/2016/5/12/chartex" xmlns:cx7="http://schemas.microsoft.com/office/drawing/2016/5/13/chartex" xmlns:cx8="http://schemas.microsoft.com/office/drawing/2016/5/14/chartex" xmlns:mc="http://schemas.openxmlformats.org/markup-compatibility/2006" xmlns:aink="http://schemas.microsoft.com/office/drawing/2016/ink" xmlns:am3d="http://schemas.microsoft.com/office/drawing/2017/model3d" xmlns:o="urn:schemas-microsoft-com:office:office" xmlns:oel="http://schemas.microsoft.com/office/2019/extlst" xmlns:r="http://schemas.openxmlformats.org/officeDocument/2006/relationships" xmlns:m="http://schemas.openxmlformats.org/officeDocument/2006/math" xmlns:v="urn:schemas-microsoft-com:vml" xmlns:wp14="http://schemas.microsoft.com/office/word/2010/wordprocessingDrawing" xmlns:wp="http://schemas.openxmlformats.org/drawingml/2006/wordprocessingDrawing" xmlns:w10="urn:schemas-microsoft-com:office:word" xmlns:w="http://schemas.openxmlformats.org/wordprocessingml/2006/main" xmlns:w14="http://schemas.microsoft.com/office/word/2010/wordml" xmlns:w15="http://schemas.microsoft.com/office/word/2012/wordml" xmlns:w16cex="http://schemas.microsoft.com/office/word/2018/wordml/cex" xmlns:w16cid="http://schemas.microsoft.com/office/word/2016/wordml/cid" xmlns:w16="http://schemas.microsoft.com/office/word/2018/wordml" xmlns:w16du="http://schemas.microsoft.com/office/word/2023/wordml/word16du" xmlns:w16sdtdh="http://schemas.microsoft.com/office/word/2020/wordml/sdtdatahash" xmlns:w16sdtfl="http://schemas.microsoft.com/office/word/2024/wordml/sdtformatlock" xmlns:w16se="http://schemas.microsoft.com/office/word/2015/wordml/symex" xmlns:wpg="http://schemas.microsoft.com/office/word/2010/wordprocessingGroup" xmlns:wpi="http://schemas.microsoft.com/office/word/2010/wordprocessingInk" xmlns:wne="http://schemas.microsoft.com/office/word/2006/wordml" xmlns:wps="http://schemas.microsoft.com/office/word/2010/wordprocessingShape" mc:Ignorable="w14 w15 w16se w16cid w16 w16cex w16sdtdh w16sdtfl w16du wp14">
   <w:p>
     <w:pPr>
-      <w:pStyle w:val="Intestazione"/>
+      <w:pStyle w:val="Header"/>
       <w:ind w:left="180"/>
     </w:pPr>
   </w:p>
@@ -10985,10 +11286,10 @@
 </file>
 
 <file path=word/header3.xml><?xml version="1.0" encoding="utf-8"?>
-<w:hdr xmlns:wpc="http://schemas.microsoft.com/office/word/2010/wordprocessingCanvas" xmlns:cx="http://schemas.microsoft.com/office/drawing/2014/chartex" xmlns:cx1="http://schemas.microsoft.com/office/drawing/2015/9/8/chartex" xmlns:cx2="http://schemas.microsoft.com/office/drawing/2015/10/21/chartex" xmlns:cx3="http://schemas.microsoft.com/office/drawing/2016/5/9/chartex" xmlns:cx4="http://schemas.microsoft.com/office/drawing/2016/5/10/chartex" xmlns:cx5="http://schemas.microsoft.com/office/drawing/2016/5/11/chartex" xmlns:cx6="http://schemas.microsoft.com/office/drawing/2016/5/12/chartex" xmlns:cx7="http://schemas.microsoft.com/office/drawing/2016/5/13/chartex" xmlns:cx8="http://schemas.microsoft.com/office/drawing/2016/5/14/chartex" xmlns:mc="http://schemas.openxmlformats.org/markup-compatibility/2006" xmlns:aink="http://schemas.microsoft.com/office/drawing/2016/ink" xmlns:am3d="http://schemas.microsoft.com/office/drawing/2017/model3d" xmlns:o="urn:schemas-microsoft-com:office:office" xmlns:oel="http://schemas.microsoft.com/office/2019/extlst" xmlns:r="http://schemas.openxmlformats.org/officeDocument/2006/relationships" xmlns:m="http://schemas.openxmlformats.org/officeDocument/2006/math" xmlns:v="urn:schemas-microsoft-com:vml" xmlns:wp14="http://schemas.microsoft.com/office/word/2010/wordprocessingDrawing" xmlns:wp="http://schemas.openxmlformats.org/drawingml/2006/wordprocessingDrawing" xmlns:w10="urn:schemas-microsoft-com:office:word" xmlns:w="http://schemas.openxmlformats.org/wordprocessingml/2006/main" xmlns:w14="http://schemas.microsoft.com/office/word/2010/wordml" xmlns:w15="http://schemas.microsoft.com/office/word/2012/wordml" xmlns:w16cex="http://schemas.microsoft.com/office/word/2018/wordml/cex" xmlns:w16cid="http://schemas.microsoft.com/office/word/2016/wordml/cid" xmlns:w16="http://schemas.microsoft.com/office/word/2018/wordml" xmlns:w16du="http://schemas.microsoft.com/office/word/2023/wordml/word16du" xmlns:w16sdtdh="http://schemas.microsoft.com/office/word/2020/wordml/sdtdatahash" xmlns:w16se="http://schemas.microsoft.com/office/word/2015/wordml/symex" xmlns:wpg="http://schemas.microsoft.com/office/word/2010/wordprocessingGroup" xmlns:wpi="http://schemas.microsoft.com/office/word/2010/wordprocessingInk" xmlns:wne="http://schemas.microsoft.com/office/word/2006/wordml" xmlns:wps="http://schemas.microsoft.com/office/word/2010/wordprocessingShape" mc:Ignorable="w14 w15 w16se w16cid w16 w16cex w16sdtdh w16du wp14">
+<w:hdr xmlns:wpc="http://schemas.microsoft.com/office/word/2010/wordprocessingCanvas" xmlns:cx="http://schemas.microsoft.com/office/drawing/2014/chartex" xmlns:cx1="http://schemas.microsoft.com/office/drawing/2015/9/8/chartex" xmlns:cx2="http://schemas.microsoft.com/office/drawing/2015/10/21/chartex" xmlns:cx3="http://schemas.microsoft.com/office/drawing/2016/5/9/chartex" xmlns:cx4="http://schemas.microsoft.com/office/drawing/2016/5/10/chartex" xmlns:cx5="http://schemas.microsoft.com/office/drawing/2016/5/11/chartex" xmlns:cx6="http://schemas.microsoft.com/office/drawing/2016/5/12/chartex" xmlns:cx7="http://schemas.microsoft.com/office/drawing/2016/5/13/chartex" xmlns:cx8="http://schemas.microsoft.com/office/drawing/2016/5/14/chartex" xmlns:mc="http://schemas.openxmlformats.org/markup-compatibility/2006" xmlns:aink="http://schemas.microsoft.com/office/drawing/2016/ink" xmlns:am3d="http://schemas.microsoft.com/office/drawing/2017/model3d" xmlns:o="urn:schemas-microsoft-com:office:office" xmlns:oel="http://schemas.microsoft.com/office/2019/extlst" xmlns:r="http://schemas.openxmlformats.org/officeDocument/2006/relationships" xmlns:m="http://schemas.openxmlformats.org/officeDocument/2006/math" xmlns:v="urn:schemas-microsoft-com:vml" xmlns:wp14="http://schemas.microsoft.com/office/word/2010/wordprocessingDrawing" xmlns:wp="http://schemas.openxmlformats.org/drawingml/2006/wordprocessingDrawing" xmlns:w10="urn:schemas-microsoft-com:office:word" xmlns:w="http://schemas.openxmlformats.org/wordprocessingml/2006/main" xmlns:w14="http://schemas.microsoft.com/office/word/2010/wordml" xmlns:w15="http://schemas.microsoft.com/office/word/2012/wordml" xmlns:w16cex="http://schemas.microsoft.com/office/word/2018/wordml/cex" xmlns:w16cid="http://schemas.microsoft.com/office/word/2016/wordml/cid" xmlns:w16="http://schemas.microsoft.com/office/word/2018/wordml" xmlns:w16du="http://schemas.microsoft.com/office/word/2023/wordml/word16du" xmlns:w16sdtdh="http://schemas.microsoft.com/office/word/2020/wordml/sdtdatahash" xmlns:w16sdtfl="http://schemas.microsoft.com/office/word/2024/wordml/sdtformatlock" xmlns:w16se="http://schemas.microsoft.com/office/word/2015/wordml/symex" xmlns:wpg="http://schemas.microsoft.com/office/word/2010/wordprocessingGroup" xmlns:wpi="http://schemas.microsoft.com/office/word/2010/wordprocessingInk" xmlns:wne="http://schemas.microsoft.com/office/word/2006/wordml" xmlns:wps="http://schemas.microsoft.com/office/word/2010/wordprocessingShape" mc:Ignorable="w14 w15 w16se w16cid w16 w16cex w16sdtdh w16sdtfl w16du wp14">
   <w:p>
     <w:pPr>
-      <w:pStyle w:val="Intestazione"/>
+      <w:pStyle w:val="Header"/>
       <w:ind w:left="180"/>
     </w:pPr>
   </w:p>
@@ -10996,20 +11297,20 @@
 </file>
 
 <file path=word/header4.xml><?xml version="1.0" encoding="utf-8"?>
-<w:hdr xmlns:wpc="http://schemas.microsoft.com/office/word/2010/wordprocessingCanvas" xmlns:cx="http://schemas.microsoft.com/office/drawing/2014/chartex" xmlns:cx1="http://schemas.microsoft.com/office/drawing/2015/9/8/chartex" xmlns:cx2="http://schemas.microsoft.com/office/drawing/2015/10/21/chartex" xmlns:cx3="http://schemas.microsoft.com/office/drawing/2016/5/9/chartex" xmlns:cx4="http://schemas.microsoft.com/office/drawing/2016/5/10/chartex" xmlns:cx5="http://schemas.microsoft.com/office/drawing/2016/5/11/chartex" xmlns:cx6="http://schemas.microsoft.com/office/drawing/2016/5/12/chartex" xmlns:cx7="http://schemas.microsoft.com/office/drawing/2016/5/13/chartex" xmlns:cx8="http://schemas.microsoft.com/office/drawing/2016/5/14/chartex" xmlns:mc="http://schemas.openxmlformats.org/markup-compatibility/2006" xmlns:aink="http://schemas.microsoft.com/office/drawing/2016/ink" xmlns:am3d="http://schemas.microsoft.com/office/drawing/2017/model3d" xmlns:o="urn:schemas-microsoft-com:office:office" xmlns:oel="http://schemas.microsoft.com/office/2019/extlst" xmlns:r="http://schemas.openxmlformats.org/officeDocument/2006/relationships" xmlns:m="http://schemas.openxmlformats.org/officeDocument/2006/math" xmlns:v="urn:schemas-microsoft-com:vml" xmlns:wp14="http://schemas.microsoft.com/office/word/2010/wordprocessingDrawing" xmlns:wp="http://schemas.openxmlformats.org/drawingml/2006/wordprocessingDrawing" xmlns:w10="urn:schemas-microsoft-com:office:word" xmlns:w="http://schemas.openxmlformats.org/wordprocessingml/2006/main" xmlns:w14="http://schemas.microsoft.com/office/word/2010/wordml" xmlns:w15="http://schemas.microsoft.com/office/word/2012/wordml" xmlns:w16cex="http://schemas.microsoft.com/office/word/2018/wordml/cex" xmlns:w16cid="http://schemas.microsoft.com/office/word/2016/wordml/cid" xmlns:w16="http://schemas.microsoft.com/office/word/2018/wordml" xmlns:w16du="http://schemas.microsoft.com/office/word/2023/wordml/word16du" xmlns:w16sdtdh="http://schemas.microsoft.com/office/word/2020/wordml/sdtdatahash" xmlns:w16se="http://schemas.microsoft.com/office/word/2015/wordml/symex" xmlns:wpg="http://schemas.microsoft.com/office/word/2010/wordprocessingGroup" xmlns:wpi="http://schemas.microsoft.com/office/word/2010/wordprocessingInk" xmlns:wne="http://schemas.microsoft.com/office/word/2006/wordml" xmlns:wps="http://schemas.microsoft.com/office/word/2010/wordprocessingShape" mc:Ignorable="w14 w15 w16se w16cid w16 w16cex w16sdtdh w16du wp14">
+<w:hdr xmlns:wpc="http://schemas.microsoft.com/office/word/2010/wordprocessingCanvas" xmlns:cx="http://schemas.microsoft.com/office/drawing/2014/chartex" xmlns:cx1="http://schemas.microsoft.com/office/drawing/2015/9/8/chartex" xmlns:cx2="http://schemas.microsoft.com/office/drawing/2015/10/21/chartex" xmlns:cx3="http://schemas.microsoft.com/office/drawing/2016/5/9/chartex" xmlns:cx4="http://schemas.microsoft.com/office/drawing/2016/5/10/chartex" xmlns:cx5="http://schemas.microsoft.com/office/drawing/2016/5/11/chartex" xmlns:cx6="http://schemas.microsoft.com/office/drawing/2016/5/12/chartex" xmlns:cx7="http://schemas.microsoft.com/office/drawing/2016/5/13/chartex" xmlns:cx8="http://schemas.microsoft.com/office/drawing/2016/5/14/chartex" xmlns:mc="http://schemas.openxmlformats.org/markup-compatibility/2006" xmlns:aink="http://schemas.microsoft.com/office/drawing/2016/ink" xmlns:am3d="http://schemas.microsoft.com/office/drawing/2017/model3d" xmlns:o="urn:schemas-microsoft-com:office:office" xmlns:oel="http://schemas.microsoft.com/office/2019/extlst" xmlns:r="http://schemas.openxmlformats.org/officeDocument/2006/relationships" xmlns:m="http://schemas.openxmlformats.org/officeDocument/2006/math" xmlns:v="urn:schemas-microsoft-com:vml" xmlns:wp14="http://schemas.microsoft.com/office/word/2010/wordprocessingDrawing" xmlns:wp="http://schemas.openxmlformats.org/drawingml/2006/wordprocessingDrawing" xmlns:w10="urn:schemas-microsoft-com:office:word" xmlns:w="http://schemas.openxmlformats.org/wordprocessingml/2006/main" xmlns:w14="http://schemas.microsoft.com/office/word/2010/wordml" xmlns:w15="http://schemas.microsoft.com/office/word/2012/wordml" xmlns:w16cex="http://schemas.microsoft.com/office/word/2018/wordml/cex" xmlns:w16cid="http://schemas.microsoft.com/office/word/2016/wordml/cid" xmlns:w16="http://schemas.microsoft.com/office/word/2018/wordml" xmlns:w16du="http://schemas.microsoft.com/office/word/2023/wordml/word16du" xmlns:w16sdtdh="http://schemas.microsoft.com/office/word/2020/wordml/sdtdatahash" xmlns:w16sdtfl="http://schemas.microsoft.com/office/word/2024/wordml/sdtformatlock" xmlns:w16se="http://schemas.microsoft.com/office/word/2015/wordml/symex" xmlns:wpg="http://schemas.microsoft.com/office/word/2010/wordprocessingGroup" xmlns:wpi="http://schemas.microsoft.com/office/word/2010/wordprocessingInk" xmlns:wne="http://schemas.microsoft.com/office/word/2006/wordml" xmlns:wps="http://schemas.microsoft.com/office/word/2010/wordprocessingShape" mc:Ignorable="w14 w15 w16se w16cid w16 w16cex w16sdtdh w16sdtfl w16du wp14">
   <w:p>
     <w:pPr>
-      <w:pStyle w:val="Intestazione"/>
+      <w:pStyle w:val="Header"/>
     </w:pPr>
   </w:p>
 </w:hdr>
 </file>
 
 <file path=word/header5.xml><?xml version="1.0" encoding="utf-8"?>
-<w:hdr xmlns:wpc="http://schemas.microsoft.com/office/word/2010/wordprocessingCanvas" xmlns:cx="http://schemas.microsoft.com/office/drawing/2014/chartex" xmlns:cx1="http://schemas.microsoft.com/office/drawing/2015/9/8/chartex" xmlns:cx2="http://schemas.microsoft.com/office/drawing/2015/10/21/chartex" xmlns:cx3="http://schemas.microsoft.com/office/drawing/2016/5/9/chartex" xmlns:cx4="http://schemas.microsoft.com/office/drawing/2016/5/10/chartex" xmlns:cx5="http://schemas.microsoft.com/office/drawing/2016/5/11/chartex" xmlns:cx6="http://schemas.microsoft.com/office/drawing/2016/5/12/chartex" xmlns:cx7="http://schemas.microsoft.com/office/drawing/2016/5/13/chartex" xmlns:cx8="http://schemas.microsoft.com/office/drawing/2016/5/14/chartex" xmlns:mc="http://schemas.openxmlformats.org/markup-compatibility/2006" xmlns:aink="http://schemas.microsoft.com/office/drawing/2016/ink" xmlns:am3d="http://schemas.microsoft.com/office/drawing/2017/model3d" xmlns:o="urn:schemas-microsoft-com:office:office" xmlns:oel="http://schemas.microsoft.com/office/2019/extlst" xmlns:r="http://schemas.openxmlformats.org/officeDocument/2006/relationships" xmlns:m="http://schemas.openxmlformats.org/officeDocument/2006/math" xmlns:v="urn:schemas-microsoft-com:vml" xmlns:wp14="http://schemas.microsoft.com/office/word/2010/wordprocessingDrawing" xmlns:wp="http://schemas.openxmlformats.org/drawingml/2006/wordprocessingDrawing" xmlns:w10="urn:schemas-microsoft-com:office:word" xmlns:w="http://schemas.openxmlformats.org/wordprocessingml/2006/main" xmlns:w14="http://schemas.microsoft.com/office/word/2010/wordml" xmlns:w15="http://schemas.microsoft.com/office/word/2012/wordml" xmlns:w16cex="http://schemas.microsoft.com/office/word/2018/wordml/cex" xmlns:w16cid="http://schemas.microsoft.com/office/word/2016/wordml/cid" xmlns:w16="http://schemas.microsoft.com/office/word/2018/wordml" xmlns:w16du="http://schemas.microsoft.com/office/word/2023/wordml/word16du" xmlns:w16sdtdh="http://schemas.microsoft.com/office/word/2020/wordml/sdtdatahash" xmlns:w16se="http://schemas.microsoft.com/office/word/2015/wordml/symex" xmlns:wpg="http://schemas.microsoft.com/office/word/2010/wordprocessingGroup" xmlns:wpi="http://schemas.microsoft.com/office/word/2010/wordprocessingInk" xmlns:wne="http://schemas.microsoft.com/office/word/2006/wordml" xmlns:wps="http://schemas.microsoft.com/office/word/2010/wordprocessingShape" mc:Ignorable="w14 w15 w16se w16cid w16 w16cex w16sdtdh w16du wp14">
+<w:hdr xmlns:wpc="http://schemas.microsoft.com/office/word/2010/wordprocessingCanvas" xmlns:cx="http://schemas.microsoft.com/office/drawing/2014/chartex" xmlns:cx1="http://schemas.microsoft.com/office/drawing/2015/9/8/chartex" xmlns:cx2="http://schemas.microsoft.com/office/drawing/2015/10/21/chartex" xmlns:cx3="http://schemas.microsoft.com/office/drawing/2016/5/9/chartex" xmlns:cx4="http://schemas.microsoft.com/office/drawing/2016/5/10/chartex" xmlns:cx5="http://schemas.microsoft.com/office/drawing/2016/5/11/chartex" xmlns:cx6="http://schemas.microsoft.com/office/drawing/2016/5/12/chartex" xmlns:cx7="http://schemas.microsoft.com/office/drawing/2016/5/13/chartex" xmlns:cx8="http://schemas.microsoft.com/office/drawing/2016/5/14/chartex" xmlns:mc="http://schemas.openxmlformats.org/markup-compatibility/2006" xmlns:aink="http://schemas.microsoft.com/office/drawing/2016/ink" xmlns:am3d="http://schemas.microsoft.com/office/drawing/2017/model3d" xmlns:o="urn:schemas-microsoft-com:office:office" xmlns:oel="http://schemas.microsoft.com/office/2019/extlst" xmlns:r="http://schemas.openxmlformats.org/officeDocument/2006/relationships" xmlns:m="http://schemas.openxmlformats.org/officeDocument/2006/math" xmlns:v="urn:schemas-microsoft-com:vml" xmlns:wp14="http://schemas.microsoft.com/office/word/2010/wordprocessingDrawing" xmlns:wp="http://schemas.openxmlformats.org/drawingml/2006/wordprocessingDrawing" xmlns:w10="urn:schemas-microsoft-com:office:word" xmlns:w="http://schemas.openxmlformats.org/wordprocessingml/2006/main" xmlns:w14="http://schemas.microsoft.com/office/word/2010/wordml" xmlns:w15="http://schemas.microsoft.com/office/word/2012/wordml" xmlns:w16cex="http://schemas.microsoft.com/office/word/2018/wordml/cex" xmlns:w16cid="http://schemas.microsoft.com/office/word/2016/wordml/cid" xmlns:w16="http://schemas.microsoft.com/office/word/2018/wordml" xmlns:w16du="http://schemas.microsoft.com/office/word/2023/wordml/word16du" xmlns:w16sdtdh="http://schemas.microsoft.com/office/word/2020/wordml/sdtdatahash" xmlns:w16sdtfl="http://schemas.microsoft.com/office/word/2024/wordml/sdtformatlock" xmlns:w16se="http://schemas.microsoft.com/office/word/2015/wordml/symex" xmlns:wpg="http://schemas.microsoft.com/office/word/2010/wordprocessingGroup" xmlns:wpi="http://schemas.microsoft.com/office/word/2010/wordprocessingInk" xmlns:wne="http://schemas.microsoft.com/office/word/2006/wordml" xmlns:wps="http://schemas.microsoft.com/office/word/2010/wordprocessingShape" mc:Ignorable="w14 w15 w16se w16cid w16 w16cex w16sdtdh w16sdtfl w16du wp14">
   <w:p>
     <w:pPr>
-      <w:pStyle w:val="Intestazione"/>
+      <w:pStyle w:val="Header"/>
       <w:ind w:left="180"/>
     </w:pPr>
   </w:p>
@@ -11017,10 +11318,10 @@
 </file>
 
 <file path=word/header6.xml><?xml version="1.0" encoding="utf-8"?>
-<w:hdr xmlns:wpc="http://schemas.microsoft.com/office/word/2010/wordprocessingCanvas" xmlns:cx="http://schemas.microsoft.com/office/drawing/2014/chartex" xmlns:cx1="http://schemas.microsoft.com/office/drawing/2015/9/8/chartex" xmlns:cx2="http://schemas.microsoft.com/office/drawing/2015/10/21/chartex" xmlns:cx3="http://schemas.microsoft.com/office/drawing/2016/5/9/chartex" xmlns:cx4="http://schemas.microsoft.com/office/drawing/2016/5/10/chartex" xmlns:cx5="http://schemas.microsoft.com/office/drawing/2016/5/11/chartex" xmlns:cx6="http://schemas.microsoft.com/office/drawing/2016/5/12/chartex" xmlns:cx7="http://schemas.microsoft.com/office/drawing/2016/5/13/chartex" xmlns:cx8="http://schemas.microsoft.com/office/drawing/2016/5/14/chartex" xmlns:mc="http://schemas.openxmlformats.org/markup-compatibility/2006" xmlns:aink="http://schemas.microsoft.com/office/drawing/2016/ink" xmlns:am3d="http://schemas.microsoft.com/office/drawing/2017/model3d" xmlns:o="urn:schemas-microsoft-com:office:office" xmlns:oel="http://schemas.microsoft.com/office/2019/extlst" xmlns:r="http://schemas.openxmlformats.org/officeDocument/2006/relationships" xmlns:m="http://schemas.openxmlformats.org/officeDocument/2006/math" xmlns:v="urn:schemas-microsoft-com:vml" xmlns:wp14="http://schemas.microsoft.com/office/word/2010/wordprocessingDrawing" xmlns:wp="http://schemas.openxmlformats.org/drawingml/2006/wordprocessingDrawing" xmlns:w10="urn:schemas-microsoft-com:office:word" xmlns:w="http://schemas.openxmlformats.org/wordprocessingml/2006/main" xmlns:w14="http://schemas.microsoft.com/office/word/2010/wordml" xmlns:w15="http://schemas.microsoft.com/office/word/2012/wordml" xmlns:w16cex="http://schemas.microsoft.com/office/word/2018/wordml/cex" xmlns:w16cid="http://schemas.microsoft.com/office/word/2016/wordml/cid" xmlns:w16="http://schemas.microsoft.com/office/word/2018/wordml" xmlns:w16du="http://schemas.microsoft.com/office/word/2023/wordml/word16du" xmlns:w16sdtdh="http://schemas.microsoft.com/office/word/2020/wordml/sdtdatahash" xmlns:w16se="http://schemas.microsoft.com/office/word/2015/wordml/symex" xmlns:wpg="http://schemas.microsoft.com/office/word/2010/wordprocessingGroup" xmlns:wpi="http://schemas.microsoft.com/office/word/2010/wordprocessingInk" xmlns:wne="http://schemas.microsoft.com/office/word/2006/wordml" xmlns:wps="http://schemas.microsoft.com/office/word/2010/wordprocessingShape" mc:Ignorable="w14 w15 w16se w16cid w16 w16cex w16sdtdh w16du wp14">
+<w:hdr xmlns:wpc="http://schemas.microsoft.com/office/word/2010/wordprocessingCanvas" xmlns:cx="http://schemas.microsoft.com/office/drawing/2014/chartex" xmlns:cx1="http://schemas.microsoft.com/office/drawing/2015/9/8/chartex" xmlns:cx2="http://schemas.microsoft.com/office/drawing/2015/10/21/chartex" xmlns:cx3="http://schemas.microsoft.com/office/drawing/2016/5/9/chartex" xmlns:cx4="http://schemas.microsoft.com/office/drawing/2016/5/10/chartex" xmlns:cx5="http://schemas.microsoft.com/office/drawing/2016/5/11/chartex" xmlns:cx6="http://schemas.microsoft.com/office/drawing/2016/5/12/chartex" xmlns:cx7="http://schemas.microsoft.com/office/drawing/2016/5/13/chartex" xmlns:cx8="http://schemas.microsoft.com/office/drawing/2016/5/14/chartex" xmlns:mc="http://schemas.openxmlformats.org/markup-compatibility/2006" xmlns:aink="http://schemas.microsoft.com/office/drawing/2016/ink" xmlns:am3d="http://schemas.microsoft.com/office/drawing/2017/model3d" xmlns:o="urn:schemas-microsoft-com:office:office" xmlns:oel="http://schemas.microsoft.com/office/2019/extlst" xmlns:r="http://schemas.openxmlformats.org/officeDocument/2006/relationships" xmlns:m="http://schemas.openxmlformats.org/officeDocument/2006/math" xmlns:v="urn:schemas-microsoft-com:vml" xmlns:wp14="http://schemas.microsoft.com/office/word/2010/wordprocessingDrawing" xmlns:wp="http://schemas.openxmlformats.org/drawingml/2006/wordprocessingDrawing" xmlns:w10="urn:schemas-microsoft-com:office:word" xmlns:w="http://schemas.openxmlformats.org/wordprocessingml/2006/main" xmlns:w14="http://schemas.microsoft.com/office/word/2010/wordml" xmlns:w15="http://schemas.microsoft.com/office/word/2012/wordml" xmlns:w16cex="http://schemas.microsoft.com/office/word/2018/wordml/cex" xmlns:w16cid="http://schemas.microsoft.com/office/word/2016/wordml/cid" xmlns:w16="http://schemas.microsoft.com/office/word/2018/wordml" xmlns:w16du="http://schemas.microsoft.com/office/word/2023/wordml/word16du" xmlns:w16sdtdh="http://schemas.microsoft.com/office/word/2020/wordml/sdtdatahash" xmlns:w16sdtfl="http://schemas.microsoft.com/office/word/2024/wordml/sdtformatlock" xmlns:w16se="http://schemas.microsoft.com/office/word/2015/wordml/symex" xmlns:wpg="http://schemas.microsoft.com/office/word/2010/wordprocessingGroup" xmlns:wpi="http://schemas.microsoft.com/office/word/2010/wordprocessingInk" xmlns:wne="http://schemas.microsoft.com/office/word/2006/wordml" xmlns:wps="http://schemas.microsoft.com/office/word/2010/wordprocessingShape" mc:Ignorable="w14 w15 w16se w16cid w16 w16cex w16sdtdh w16sdtfl w16du wp14">
   <w:p>
     <w:pPr>
-      <w:pStyle w:val="Intestazione"/>
+      <w:pStyle w:val="Header"/>
       <w:ind w:left="180"/>
     </w:pPr>
   </w:p>
@@ -11028,20 +11329,20 @@
 </file>
 
 <file path=word/header7.xml><?xml version="1.0" encoding="utf-8"?>
-<w:hdr xmlns:wpc="http://schemas.microsoft.com/office/word/2010/wordprocessingCanvas" xmlns:cx="http://schemas.microsoft.com/office/drawing/2014/chartex" xmlns:cx1="http://schemas.microsoft.com/office/drawing/2015/9/8/chartex" xmlns:cx2="http://schemas.microsoft.com/office/drawing/2015/10/21/chartex" xmlns:cx3="http://schemas.microsoft.com/office/drawing/2016/5/9/chartex" xmlns:cx4="http://schemas.microsoft.com/office/drawing/2016/5/10/chartex" xmlns:cx5="http://schemas.microsoft.com/office/drawing/2016/5/11/chartex" xmlns:cx6="http://schemas.microsoft.com/office/drawing/2016/5/12/chartex" xmlns:cx7="http://schemas.microsoft.com/office/drawing/2016/5/13/chartex" xmlns:cx8="http://schemas.microsoft.com/office/drawing/2016/5/14/chartex" xmlns:mc="http://schemas.openxmlformats.org/markup-compatibility/2006" xmlns:aink="http://schemas.microsoft.com/office/drawing/2016/ink" xmlns:am3d="http://schemas.microsoft.com/office/drawing/2017/model3d" xmlns:o="urn:schemas-microsoft-com:office:office" xmlns:oel="http://schemas.microsoft.com/office/2019/extlst" xmlns:r="http://schemas.openxmlformats.org/officeDocument/2006/relationships" xmlns:m="http://schemas.openxmlformats.org/officeDocument/2006/math" xmlns:v="urn:schemas-microsoft-com:vml" xmlns:wp14="http://schemas.microsoft.com/office/word/2010/wordprocessingDrawing" xmlns:wp="http://schemas.openxmlformats.org/drawingml/2006/wordprocessingDrawing" xmlns:w10="urn:schemas-microsoft-com:office:word" xmlns:w="http://schemas.openxmlformats.org/wordprocessingml/2006/main" xmlns:w14="http://schemas.microsoft.com/office/word/2010/wordml" xmlns:w15="http://schemas.microsoft.com/office/word/2012/wordml" xmlns:w16cex="http://schemas.microsoft.com/office/word/2018/wordml/cex" xmlns:w16cid="http://schemas.microsoft.com/office/word/2016/wordml/cid" xmlns:w16="http://schemas.microsoft.com/office/word/2018/wordml" xmlns:w16du="http://schemas.microsoft.com/office/word/2023/wordml/word16du" xmlns:w16sdtdh="http://schemas.microsoft.com/office/word/2020/wordml/sdtdatahash" xmlns:w16se="http://schemas.microsoft.com/office/word/2015/wordml/symex" xmlns:wpg="http://schemas.microsoft.com/office/word/2010/wordprocessingGroup" xmlns:wpi="http://schemas.microsoft.com/office/word/2010/wordprocessingInk" xmlns:wne="http://schemas.microsoft.com/office/word/2006/wordml" xmlns:wps="http://schemas.microsoft.com/office/word/2010/wordprocessingShape" mc:Ignorable="w14 w15 w16se w16cid w16 w16cex w16sdtdh w16du wp14">
+<w:hdr xmlns:wpc="http://schemas.microsoft.com/office/word/2010/wordprocessingCanvas" xmlns:cx="http://schemas.microsoft.com/office/drawing/2014/chartex" xmlns:cx1="http://schemas.microsoft.com/office/drawing/2015/9/8/chartex" xmlns:cx2="http://schemas.microsoft.com/office/drawing/2015/10/21/chartex" xmlns:cx3="http://schemas.microsoft.com/office/drawing/2016/5/9/chartex" xmlns:cx4="http://schemas.microsoft.com/office/drawing/2016/5/10/chartex" xmlns:cx5="http://schemas.microsoft.com/office/drawing/2016/5/11/chartex" xmlns:cx6="http://schemas.microsoft.com/office/drawing/2016/5/12/chartex" xmlns:cx7="http://schemas.microsoft.com/office/drawing/2016/5/13/chartex" xmlns:cx8="http://schemas.microsoft.com/office/drawing/2016/5/14/chartex" xmlns:mc="http://schemas.openxmlformats.org/markup-compatibility/2006" xmlns:aink="http://schemas.microsoft.com/office/drawing/2016/ink" xmlns:am3d="http://schemas.microsoft.com/office/drawing/2017/model3d" xmlns:o="urn:schemas-microsoft-com:office:office" xmlns:oel="http://schemas.microsoft.com/office/2019/extlst" xmlns:r="http://schemas.openxmlformats.org/officeDocument/2006/relationships" xmlns:m="http://schemas.openxmlformats.org/officeDocument/2006/math" xmlns:v="urn:schemas-microsoft-com:vml" xmlns:wp14="http://schemas.microsoft.com/office/word/2010/wordprocessingDrawing" xmlns:wp="http://schemas.openxmlformats.org/drawingml/2006/wordprocessingDrawing" xmlns:w10="urn:schemas-microsoft-com:office:word" xmlns:w="http://schemas.openxmlformats.org/wordprocessingml/2006/main" xmlns:w14="http://schemas.microsoft.com/office/word/2010/wordml" xmlns:w15="http://schemas.microsoft.com/office/word/2012/wordml" xmlns:w16cex="http://schemas.microsoft.com/office/word/2018/wordml/cex" xmlns:w16cid="http://schemas.microsoft.com/office/word/2016/wordml/cid" xmlns:w16="http://schemas.microsoft.com/office/word/2018/wordml" xmlns:w16du="http://schemas.microsoft.com/office/word/2023/wordml/word16du" xmlns:w16sdtdh="http://schemas.microsoft.com/office/word/2020/wordml/sdtdatahash" xmlns:w16sdtfl="http://schemas.microsoft.com/office/word/2024/wordml/sdtformatlock" xmlns:w16se="http://schemas.microsoft.com/office/word/2015/wordml/symex" xmlns:wpg="http://schemas.microsoft.com/office/word/2010/wordprocessingGroup" xmlns:wpi="http://schemas.microsoft.com/office/word/2010/wordprocessingInk" xmlns:wne="http://schemas.microsoft.com/office/word/2006/wordml" xmlns:wps="http://schemas.microsoft.com/office/word/2010/wordprocessingShape" mc:Ignorable="w14 w15 w16se w16cid w16 w16cex w16sdtdh w16sdtfl w16du wp14">
   <w:p>
     <w:pPr>
-      <w:pStyle w:val="Intestazione"/>
+      <w:pStyle w:val="Header"/>
     </w:pPr>
   </w:p>
 </w:hdr>
 </file>
 
 <file path=word/header8.xml><?xml version="1.0" encoding="utf-8"?>
-<w:hdr xmlns:wpc="http://schemas.microsoft.com/office/word/2010/wordprocessingCanvas" xmlns:cx="http://schemas.microsoft.com/office/drawing/2014/chartex" xmlns:cx1="http://schemas.microsoft.com/office/drawing/2015/9/8/chartex" xmlns:cx2="http://schemas.microsoft.com/office/drawing/2015/10/21/chartex" xmlns:cx3="http://schemas.microsoft.com/office/drawing/2016/5/9/chartex" xmlns:cx4="http://schemas.microsoft.com/office/drawing/2016/5/10/chartex" xmlns:cx5="http://schemas.microsoft.com/office/drawing/2016/5/11/chartex" xmlns:cx6="http://schemas.microsoft.com/office/drawing/2016/5/12/chartex" xmlns:cx7="http://schemas.microsoft.com/office/drawing/2016/5/13/chartex" xmlns:cx8="http://schemas.microsoft.com/office/drawing/2016/5/14/chartex" xmlns:mc="http://schemas.openxmlformats.org/markup-compatibility/2006" xmlns:aink="http://schemas.microsoft.com/office/drawing/2016/ink" xmlns:am3d="http://schemas.microsoft.com/office/drawing/2017/model3d" xmlns:o="urn:schemas-microsoft-com:office:office" xmlns:oel="http://schemas.microsoft.com/office/2019/extlst" xmlns:r="http://schemas.openxmlformats.org/officeDocument/2006/relationships" xmlns:m="http://schemas.openxmlformats.org/officeDocument/2006/math" xmlns:v="urn:schemas-microsoft-com:vml" xmlns:wp14="http://schemas.microsoft.com/office/word/2010/wordprocessingDrawing" xmlns:wp="http://schemas.openxmlformats.org/drawingml/2006/wordprocessingDrawing" xmlns:w10="urn:schemas-microsoft-com:office:word" xmlns:w="http://schemas.openxmlformats.org/wordprocessingml/2006/main" xmlns:w14="http://schemas.microsoft.com/office/word/2010/wordml" xmlns:w15="http://schemas.microsoft.com/office/word/2012/wordml" xmlns:w16cex="http://schemas.microsoft.com/office/word/2018/wordml/cex" xmlns:w16cid="http://schemas.microsoft.com/office/word/2016/wordml/cid" xmlns:w16="http://schemas.microsoft.com/office/word/2018/wordml" xmlns:w16du="http://schemas.microsoft.com/office/word/2023/wordml/word16du" xmlns:w16sdtdh="http://schemas.microsoft.com/office/word/2020/wordml/sdtdatahash" xmlns:w16se="http://schemas.microsoft.com/office/word/2015/wordml/symex" xmlns:wpg="http://schemas.microsoft.com/office/word/2010/wordprocessingGroup" xmlns:wpi="http://schemas.microsoft.com/office/word/2010/wordprocessingInk" xmlns:wne="http://schemas.microsoft.com/office/word/2006/wordml" xmlns:wps="http://schemas.microsoft.com/office/word/2010/wordprocessingShape" mc:Ignorable="w14 w15 w16se w16cid w16 w16cex w16sdtdh w16du wp14">
+<w:hdr xmlns:wpc="http://schemas.microsoft.com/office/word/2010/wordprocessingCanvas" xmlns:cx="http://schemas.microsoft.com/office/drawing/2014/chartex" xmlns:cx1="http://schemas.microsoft.com/office/drawing/2015/9/8/chartex" xmlns:cx2="http://schemas.microsoft.com/office/drawing/2015/10/21/chartex" xmlns:cx3="http://schemas.microsoft.com/office/drawing/2016/5/9/chartex" xmlns:cx4="http://schemas.microsoft.com/office/drawing/2016/5/10/chartex" xmlns:cx5="http://schemas.microsoft.com/office/drawing/2016/5/11/chartex" xmlns:cx6="http://schemas.microsoft.com/office/drawing/2016/5/12/chartex" xmlns:cx7="http://schemas.microsoft.com/office/drawing/2016/5/13/chartex" xmlns:cx8="http://schemas.microsoft.com/office/drawing/2016/5/14/chartex" xmlns:mc="http://schemas.openxmlformats.org/markup-compatibility/2006" xmlns:aink="http://schemas.microsoft.com/office/drawing/2016/ink" xmlns:am3d="http://schemas.microsoft.com/office/drawing/2017/model3d" xmlns:o="urn:schemas-microsoft-com:office:office" xmlns:oel="http://schemas.microsoft.com/office/2019/extlst" xmlns:r="http://schemas.openxmlformats.org/officeDocument/2006/relationships" xmlns:m="http://schemas.openxmlformats.org/officeDocument/2006/math" xmlns:v="urn:schemas-microsoft-com:vml" xmlns:wp14="http://schemas.microsoft.com/office/word/2010/wordprocessingDrawing" xmlns:wp="http://schemas.openxmlformats.org/drawingml/2006/wordprocessingDrawing" xmlns:w10="urn:schemas-microsoft-com:office:word" xmlns:w="http://schemas.openxmlformats.org/wordprocessingml/2006/main" xmlns:w14="http://schemas.microsoft.com/office/word/2010/wordml" xmlns:w15="http://schemas.microsoft.com/office/word/2012/wordml" xmlns:w16cex="http://schemas.microsoft.com/office/word/2018/wordml/cex" xmlns:w16cid="http://schemas.microsoft.com/office/word/2016/wordml/cid" xmlns:w16="http://schemas.microsoft.com/office/word/2018/wordml" xmlns:w16du="http://schemas.microsoft.com/office/word/2023/wordml/word16du" xmlns:w16sdtdh="http://schemas.microsoft.com/office/word/2020/wordml/sdtdatahash" xmlns:w16sdtfl="http://schemas.microsoft.com/office/word/2024/wordml/sdtformatlock" xmlns:w16se="http://schemas.microsoft.com/office/word/2015/wordml/symex" xmlns:wpg="http://schemas.microsoft.com/office/word/2010/wordprocessingGroup" xmlns:wpi="http://schemas.microsoft.com/office/word/2010/wordprocessingInk" xmlns:wne="http://schemas.microsoft.com/office/word/2006/wordml" xmlns:wps="http://schemas.microsoft.com/office/word/2010/wordprocessingShape" mc:Ignorable="w14 w15 w16se w16cid w16 w16cex w16sdtdh w16sdtfl w16du wp14">
   <w:p>
     <w:pPr>
-      <w:pStyle w:val="Intestazione"/>
+      <w:pStyle w:val="Header"/>
       <w:ind w:left="180"/>
     </w:pPr>
   </w:p>
@@ -11049,10 +11350,10 @@
 </file>
 
 <file path=word/header9.xml><?xml version="1.0" encoding="utf-8"?>
-<w:hdr xmlns:wpc="http://schemas.microsoft.com/office/word/2010/wordprocessingCanvas" xmlns:cx="http://schemas.microsoft.com/office/drawing/2014/chartex" xmlns:cx1="http://schemas.microsoft.com/office/drawing/2015/9/8/chartex" xmlns:cx2="http://schemas.microsoft.com/office/drawing/2015/10/21/chartex" xmlns:cx3="http://schemas.microsoft.com/office/drawing/2016/5/9/chartex" xmlns:cx4="http://schemas.microsoft.com/office/drawing/2016/5/10/chartex" xmlns:cx5="http://schemas.microsoft.com/office/drawing/2016/5/11/chartex" xmlns:cx6="http://schemas.microsoft.com/office/drawing/2016/5/12/chartex" xmlns:cx7="http://schemas.microsoft.com/office/drawing/2016/5/13/chartex" xmlns:cx8="http://schemas.microsoft.com/office/drawing/2016/5/14/chartex" xmlns:mc="http://schemas.openxmlformats.org/markup-compatibility/2006" xmlns:aink="http://schemas.microsoft.com/office/drawing/2016/ink" xmlns:am3d="http://schemas.microsoft.com/office/drawing/2017/model3d" xmlns:o="urn:schemas-microsoft-com:office:office" xmlns:oel="http://schemas.microsoft.com/office/2019/extlst" xmlns:r="http://schemas.openxmlformats.org/officeDocument/2006/relationships" xmlns:m="http://schemas.openxmlformats.org/officeDocument/2006/math" xmlns:v="urn:schemas-microsoft-com:vml" xmlns:wp14="http://schemas.microsoft.com/office/word/2010/wordprocessingDrawing" xmlns:wp="http://schemas.openxmlformats.org/drawingml/2006/wordprocessingDrawing" xmlns:w10="urn:schemas-microsoft-com:office:word" xmlns:w="http://schemas.openxmlformats.org/wordprocessingml/2006/main" xmlns:w14="http://schemas.microsoft.com/office/word/2010/wordml" xmlns:w15="http://schemas.microsoft.com/office/word/2012/wordml" xmlns:w16cex="http://schemas.microsoft.com/office/word/2018/wordml/cex" xmlns:w16cid="http://schemas.microsoft.com/office/word/2016/wordml/cid" xmlns:w16="http://schemas.microsoft.com/office/word/2018/wordml" xmlns:w16du="http://schemas.microsoft.com/office/word/2023/wordml/word16du" xmlns:w16sdtdh="http://schemas.microsoft.com/office/word/2020/wordml/sdtdatahash" xmlns:w16se="http://schemas.microsoft.com/office/word/2015/wordml/symex" xmlns:wpg="http://schemas.microsoft.com/office/word/2010/wordprocessingGroup" xmlns:wpi="http://schemas.microsoft.com/office/word/2010/wordprocessingInk" xmlns:wne="http://schemas.microsoft.com/office/word/2006/wordml" xmlns:wps="http://schemas.microsoft.com/office/word/2010/wordprocessingShape" mc:Ignorable="w14 w15 w16se w16cid w16 w16cex w16sdtdh w16du wp14">
+<w:hdr xmlns:wpc="http://schemas.microsoft.com/office/word/2010/wordprocessingCanvas" xmlns:cx="http://schemas.microsoft.com/office/drawing/2014/chartex" xmlns:cx1="http://schemas.microsoft.com/office/drawing/2015/9/8/chartex" xmlns:cx2="http://schemas.microsoft.com/office/drawing/2015/10/21/chartex" xmlns:cx3="http://schemas.microsoft.com/office/drawing/2016/5/9/chartex" xmlns:cx4="http://schemas.microsoft.com/office/drawing/2016/5/10/chartex" xmlns:cx5="http://schemas.microsoft.com/office/drawing/2016/5/11/chartex" xmlns:cx6="http://schemas.microsoft.com/office/drawing/2016/5/12/chartex" xmlns:cx7="http://schemas.microsoft.com/office/drawing/2016/5/13/chartex" xmlns:cx8="http://schemas.microsoft.com/office/drawing/2016/5/14/chartex" xmlns:mc="http://schemas.openxmlformats.org/markup-compatibility/2006" xmlns:aink="http://schemas.microsoft.com/office/drawing/2016/ink" xmlns:am3d="http://schemas.microsoft.com/office/drawing/2017/model3d" xmlns:o="urn:schemas-microsoft-com:office:office" xmlns:oel="http://schemas.microsoft.com/office/2019/extlst" xmlns:r="http://schemas.openxmlformats.org/officeDocument/2006/relationships" xmlns:m="http://schemas.openxmlformats.org/officeDocument/2006/math" xmlns:v="urn:schemas-microsoft-com:vml" xmlns:wp14="http://schemas.microsoft.com/office/word/2010/wordprocessingDrawing" xmlns:wp="http://schemas.openxmlformats.org/drawingml/2006/wordprocessingDrawing" xmlns:w10="urn:schemas-microsoft-com:office:word" xmlns:w="http://schemas.openxmlformats.org/wordprocessingml/2006/main" xmlns:w14="http://schemas.microsoft.com/office/word/2010/wordml" xmlns:w15="http://schemas.microsoft.com/office/word/2012/wordml" xmlns:w16cex="http://schemas.microsoft.com/office/word/2018/wordml/cex" xmlns:w16cid="http://schemas.microsoft.com/office/word/2016/wordml/cid" xmlns:w16="http://schemas.microsoft.com/office/word/2018/wordml" xmlns:w16du="http://schemas.microsoft.com/office/word/2023/wordml/word16du" xmlns:w16sdtdh="http://schemas.microsoft.com/office/word/2020/wordml/sdtdatahash" xmlns:w16sdtfl="http://schemas.microsoft.com/office/word/2024/wordml/sdtformatlock" xmlns:w16se="http://schemas.microsoft.com/office/word/2015/wordml/symex" xmlns:wpg="http://schemas.microsoft.com/office/word/2010/wordprocessingGroup" xmlns:wpi="http://schemas.microsoft.com/office/word/2010/wordprocessingInk" xmlns:wne="http://schemas.microsoft.com/office/word/2006/wordml" xmlns:wps="http://schemas.microsoft.com/office/word/2010/wordprocessingShape" mc:Ignorable="w14 w15 w16se w16cid w16 w16cex w16sdtdh w16sdtfl w16du wp14">
   <w:p>
     <w:pPr>
-      <w:pStyle w:val="Intestazione"/>
+      <w:pStyle w:val="Header"/>
       <w:ind w:left="180"/>
     </w:pPr>
   </w:p>
@@ -11060,7 +11361,7 @@
 </file>
 
 <file path=word/styles.xml><?xml version="1.0" encoding="utf-8"?>
-<w:styles xmlns:mc="http://schemas.openxmlformats.org/markup-compatibility/2006" xmlns:r="http://schemas.openxmlformats.org/officeDocument/2006/relationships" xmlns:w="http://schemas.openxmlformats.org/wordprocessingml/2006/main" xmlns:w14="http://schemas.microsoft.com/office/word/2010/wordml" xmlns:w15="http://schemas.microsoft.com/office/word/2012/wordml" xmlns:w16cex="http://schemas.microsoft.com/office/word/2018/wordml/cex" xmlns:w16cid="http://schemas.microsoft.com/office/word/2016/wordml/cid" xmlns:w16="http://schemas.microsoft.com/office/word/2018/wordml" xmlns:w16du="http://schemas.microsoft.com/office/word/2023/wordml/word16du" xmlns:w16sdtdh="http://schemas.microsoft.com/office/word/2020/wordml/sdtdatahash" xmlns:w16se="http://schemas.microsoft.com/office/word/2015/wordml/symex" mc:Ignorable="w14 w15 w16se w16cid w16 w16cex w16sdtdh w16du">
+<w:styles xmlns:mc="http://schemas.openxmlformats.org/markup-compatibility/2006" xmlns:r="http://schemas.openxmlformats.org/officeDocument/2006/relationships" xmlns:w="http://schemas.openxmlformats.org/wordprocessingml/2006/main" xmlns:w14="http://schemas.microsoft.com/office/word/2010/wordml" xmlns:w15="http://schemas.microsoft.com/office/word/2012/wordml" xmlns:w16cex="http://schemas.microsoft.com/office/word/2018/wordml/cex" xmlns:w16cid="http://schemas.microsoft.com/office/word/2016/wordml/cid" xmlns:w16="http://schemas.microsoft.com/office/word/2018/wordml" xmlns:w16du="http://schemas.microsoft.com/office/word/2023/wordml/word16du" xmlns:w16sdtdh="http://schemas.microsoft.com/office/word/2020/wordml/sdtdatahash" xmlns:w16sdtfl="http://schemas.microsoft.com/office/word/2024/wordml/sdtformatlock" xmlns:w16se="http://schemas.microsoft.com/office/word/2015/wordml/symex" mc:Ignorable="w14 w15 w16se w16cid w16 w16cex w16sdtdh w16sdtfl w16du">
   <w:docDefaults>
     <w:rPrDefault>
       <w:rPr>
@@ -11164,14 +11465,14 @@
     <w:lsdException w:name="Block Text" w:semiHidden="1" w:unhideWhenUsed="1"/>
     <w:lsdException w:name="Hyperlink" w:semiHidden="1" w:unhideWhenUsed="1"/>
     <w:lsdException w:name="FollowedHyperlink" w:semiHidden="1" w:unhideWhenUsed="1"/>
-    <w:lsdException w:name="Strong" w:uiPriority="22" w:qFormat="1"/>
+    <w:lsdException w:name="Strong" w:uiPriority="0" w:qFormat="1"/>
     <w:lsdException w:name="Emphasis" w:uiPriority="20" w:qFormat="1"/>
     <w:lsdException w:name="Document Map" w:semiHidden="1" w:unhideWhenUsed="1"/>
     <w:lsdException w:name="Plain Text" w:semiHidden="1" w:unhideWhenUsed="1"/>
     <w:lsdException w:name="E-mail Signature" w:semiHidden="1" w:unhideWhenUsed="1"/>
     <w:lsdException w:name="HTML Top of Form" w:semiHidden="1" w:unhideWhenUsed="1"/>
     <w:lsdException w:name="HTML Bottom of Form" w:semiHidden="1" w:unhideWhenUsed="1"/>
-    <w:lsdException w:name="Normal (Web)" w:semiHidden="1" w:unhideWhenUsed="1"/>
+    <w:lsdException w:name="Normal (Web)" w:semiHidden="1" w:uiPriority="0" w:unhideWhenUsed="1"/>
     <w:lsdException w:name="HTML Acronym" w:semiHidden="1" w:unhideWhenUsed="1"/>
     <w:lsdException w:name="HTML Address" w:semiHidden="1" w:unhideWhenUsed="1"/>
     <w:lsdException w:name="HTML Cite" w:semiHidden="1" w:unhideWhenUsed="1"/>
@@ -11454,7 +11755,7 @@
     <w:lsdException w:name="Unresolved Mention" w:semiHidden="1" w:unhideWhenUsed="1"/>
     <w:lsdException w:name="Smart Link" w:semiHidden="1" w:unhideWhenUsed="1"/>
   </w:latentStyles>
-  <w:style w:type="paragraph" w:default="1" w:styleId="Normale">
+  <w:style w:type="paragraph" w:default="1" w:styleId="Normal">
     <w:name w:val="Normal"/>
     <w:qFormat/>
     <w:pPr>
@@ -11466,9 +11767,9 @@
       <w:lang w:val="it-IT"/>
     </w:rPr>
   </w:style>
-  <w:style w:type="paragraph" w:styleId="Titolo1">
+  <w:style w:type="paragraph" w:styleId="Heading1">
     <w:name w:val="heading 1"/>
-    <w:basedOn w:val="Normale"/>
+    <w:basedOn w:val="Normal"/>
     <w:uiPriority w:val="9"/>
     <w:qFormat/>
     <w:pPr>
@@ -11484,13 +11785,13 @@
       <w:szCs w:val="32"/>
     </w:rPr>
   </w:style>
-  <w:style w:type="character" w:default="1" w:styleId="Carpredefinitoparagrafo">
+  <w:style w:type="character" w:default="1" w:styleId="DefaultParagraphFont">
     <w:name w:val="Default Paragraph Font"/>
     <w:uiPriority w:val="1"/>
     <w:semiHidden/>
     <w:unhideWhenUsed/>
   </w:style>
-  <w:style w:type="table" w:default="1" w:styleId="Tabellanormale">
+  <w:style w:type="table" w:default="1" w:styleId="TableNormal">
     <w:name w:val="Normal Table"/>
     <w:uiPriority w:val="99"/>
     <w:semiHidden/>
@@ -11505,13 +11806,13 @@
       </w:tblCellMar>
     </w:tblPr>
   </w:style>
-  <w:style w:type="numbering" w:default="1" w:styleId="Nessunelenco">
+  <w:style w:type="numbering" w:default="1" w:styleId="NoList">
     <w:name w:val="No List"/>
     <w:uiPriority w:val="99"/>
     <w:semiHidden/>
     <w:unhideWhenUsed/>
   </w:style>
-  <w:style w:type="character" w:styleId="Collegamentoipertestuale">
+  <w:style w:type="character" w:styleId="Hyperlink">
     <w:name w:val="Hyperlink"/>
     <w:rPr>
       <w:color w:val="000080"/>
@@ -11520,8 +11821,8 @@
   </w:style>
   <w:style w:type="paragraph" w:customStyle="1" w:styleId="Heading">
     <w:name w:val="Heading"/>
-    <w:basedOn w:val="Normale"/>
-    <w:next w:val="Corpotesto"/>
+    <w:basedOn w:val="Normal"/>
+    <w:next w:val="BodyText"/>
     <w:qFormat/>
     <w:pPr>
       <w:keepNext/>
@@ -11533,9 +11834,9 @@
       <w:szCs w:val="28"/>
     </w:rPr>
   </w:style>
-  <w:style w:type="paragraph" w:styleId="Corpotesto">
+  <w:style w:type="paragraph" w:styleId="BodyText">
     <w:name w:val="Body Text"/>
-    <w:basedOn w:val="Normale"/>
+    <w:basedOn w:val="Normal"/>
     <w:uiPriority w:val="1"/>
     <w:qFormat/>
     <w:rPr>
@@ -11544,16 +11845,16 @@
       <w:szCs w:val="20"/>
     </w:rPr>
   </w:style>
-  <w:style w:type="paragraph" w:styleId="Elenco">
+  <w:style w:type="paragraph" w:styleId="List">
     <w:name w:val="List"/>
-    <w:basedOn w:val="Corpotesto"/>
+    <w:basedOn w:val="BodyText"/>
     <w:rPr>
       <w:rFonts w:ascii="Times New Roman" w:hAnsi="Times New Roman"/>
     </w:rPr>
   </w:style>
-  <w:style w:type="paragraph" w:styleId="Didascalia">
+  <w:style w:type="paragraph" w:styleId="Caption">
     <w:name w:val="caption"/>
-    <w:basedOn w:val="Normale"/>
+    <w:basedOn w:val="Normal"/>
     <w:qFormat/>
     <w:pPr>
       <w:suppressLineNumbers/>
@@ -11569,7 +11870,7 @@
   </w:style>
   <w:style w:type="paragraph" w:customStyle="1" w:styleId="Index">
     <w:name w:val="Index"/>
-    <w:basedOn w:val="Normale"/>
+    <w:basedOn w:val="Normal"/>
     <w:qFormat/>
     <w:pPr>
       <w:suppressLineNumbers/>
@@ -11578,15 +11879,15 @@
       <w:rFonts w:ascii="Times New Roman" w:hAnsi="Times New Roman"/>
     </w:rPr>
   </w:style>
-  <w:style w:type="paragraph" w:styleId="Paragrafoelenco">
+  <w:style w:type="paragraph" w:styleId="ListParagraph">
     <w:name w:val="List Paragraph"/>
-    <w:basedOn w:val="Normale"/>
+    <w:basedOn w:val="Normal"/>
     <w:uiPriority w:val="1"/>
     <w:qFormat/>
   </w:style>
   <w:style w:type="paragraph" w:customStyle="1" w:styleId="TableParagraph">
     <w:name w:val="Table Paragraph"/>
-    <w:basedOn w:val="Normale"/>
+    <w:basedOn w:val="Normal"/>
     <w:uiPriority w:val="1"/>
     <w:qFormat/>
     <w:rPr>
@@ -11595,25 +11896,25 @@
   </w:style>
   <w:style w:type="paragraph" w:customStyle="1" w:styleId="HeaderandFooter">
     <w:name w:val="Header and Footer"/>
-    <w:basedOn w:val="Normale"/>
+    <w:basedOn w:val="Normal"/>
     <w:qFormat/>
   </w:style>
-  <w:style w:type="paragraph" w:styleId="Intestazione">
+  <w:style w:type="paragraph" w:styleId="Header">
     <w:name w:val="header"/>
     <w:basedOn w:val="HeaderandFooter"/>
   </w:style>
   <w:style w:type="paragraph" w:customStyle="1" w:styleId="FrameContents">
     <w:name w:val="Frame Contents"/>
-    <w:basedOn w:val="Normale"/>
+    <w:basedOn w:val="Normal"/>
     <w:qFormat/>
   </w:style>
-  <w:style w:type="paragraph" w:styleId="Pidipagina">
+  <w:style w:type="paragraph" w:styleId="Footer">
     <w:name w:val="footer"/>
     <w:basedOn w:val="HeaderandFooter"/>
   </w:style>
   <w:style w:type="paragraph" w:customStyle="1" w:styleId="TableContents">
     <w:name w:val="Table Contents"/>
-    <w:basedOn w:val="Normale"/>
+    <w:basedOn w:val="Normal"/>
     <w:qFormat/>
     <w:pPr>
       <w:suppressLineNumbers/>
@@ -11631,8 +11932,8 @@
       <w:bCs/>
     </w:rPr>
   </w:style>
-  <w:style w:type="table" w:customStyle="1" w:styleId="TableNormal">
-    <w:name w:val="Table Normal"/>
+  <w:style w:type="table" w:customStyle="1" w:styleId="TableNormal1">
+    <w:name w:val="Table Normal1"/>
     <w:uiPriority w:val="2"/>
     <w:semiHidden/>
     <w:unhideWhenUsed/>
@@ -11645,6 +11946,84 @@
         <w:right w:w="0" w:type="dxa"/>
       </w:tblCellMar>
     </w:tblPr>
+  </w:style>
+  <w:style w:type="paragraph" w:styleId="NormalWeb">
+    <w:name w:val="Normal (Web)"/>
+    <w:rsid w:val="00AC66F2"/>
+    <w:pPr>
+      <w:suppressAutoHyphens w:val="0"/>
+      <w:spacing w:beforeAutospacing="1" w:afterAutospacing="1"/>
+    </w:pPr>
+    <w:rPr>
+      <w:rFonts w:ascii="Times New Roman" w:eastAsia="SimSun" w:hAnsi="Times New Roman" w:cs="Times New Roman"/>
+      <w:sz w:val="24"/>
+      <w:szCs w:val="24"/>
+      <w:lang w:eastAsia="zh-CN"/>
+    </w:rPr>
+  </w:style>
+  <w:style w:type="character" w:styleId="Strong">
+    <w:name w:val="Strong"/>
+    <w:basedOn w:val="DefaultParagraphFont"/>
+    <w:qFormat/>
+    <w:rsid w:val="00AC66F2"/>
+    <w:rPr>
+      <w:b/>
+      <w:bCs/>
+    </w:rPr>
+  </w:style>
+  <w:style w:type="table" w:styleId="GridTable1Light">
+    <w:name w:val="Grid Table 1 Light"/>
+    <w:basedOn w:val="TableNormal"/>
+    <w:uiPriority w:val="46"/>
+    <w:rsid w:val="00AC66F2"/>
+    <w:tblPr>
+      <w:tblStyleRowBandSize w:val="1"/>
+      <w:tblStyleColBandSize w:val="1"/>
+      <w:tblBorders>
+        <w:top w:val="single" w:sz="4" w:space="0" w:color="999999" w:themeColor="text1" w:themeTint="66"/>
+        <w:left w:val="single" w:sz="4" w:space="0" w:color="999999" w:themeColor="text1" w:themeTint="66"/>
+        <w:bottom w:val="single" w:sz="4" w:space="0" w:color="999999" w:themeColor="text1" w:themeTint="66"/>
+        <w:right w:val="single" w:sz="4" w:space="0" w:color="999999" w:themeColor="text1" w:themeTint="66"/>
+        <w:insideH w:val="single" w:sz="4" w:space="0" w:color="999999" w:themeColor="text1" w:themeTint="66"/>
+        <w:insideV w:val="single" w:sz="4" w:space="0" w:color="999999" w:themeColor="text1" w:themeTint="66"/>
+      </w:tblBorders>
+    </w:tblPr>
+    <w:tblStylePr w:type="firstRow">
+      <w:rPr>
+        <w:b/>
+        <w:bCs/>
+      </w:rPr>
+      <w:tblPr/>
+      <w:tcPr>
+        <w:tcBorders>
+          <w:bottom w:val="single" w:sz="12" w:space="0" w:color="666666" w:themeColor="text1" w:themeTint="99"/>
+        </w:tcBorders>
+      </w:tcPr>
+    </w:tblStylePr>
+    <w:tblStylePr w:type="lastRow">
+      <w:rPr>
+        <w:b/>
+        <w:bCs/>
+      </w:rPr>
+      <w:tblPr/>
+      <w:tcPr>
+        <w:tcBorders>
+          <w:top w:val="double" w:sz="2" w:space="0" w:color="666666" w:themeColor="text1" w:themeTint="99"/>
+        </w:tcBorders>
+      </w:tcPr>
+    </w:tblStylePr>
+    <w:tblStylePr w:type="firstCol">
+      <w:rPr>
+        <w:b/>
+        <w:bCs/>
+      </w:rPr>
+    </w:tblStylePr>
+    <w:tblStylePr w:type="lastCol">
+      <w:rPr>
+        <w:b/>
+        <w:bCs/>
+      </w:rPr>
+    </w:tblStylePr>
   </w:style>
 </w:styles>
 </file>

</xml_diff>